<commit_message>
docs: test-run fixes (DECISIONS #42), test plan re-test notes and TC-08.8; log Carl and Pauline handoffs
</commit_message>
<xml_diff>
--- a/docs/RoadWatch-Test-Plan.docx
+++ b/docs/RoadWatch-Test-Plan.docx
@@ -85,7 +85,7 @@
           <w:sz w:val="22"/>
           <w:szCs w:val="22"/>
         </w:rPr>
-        <w:t xml:space="preserve"> (Pass / Fail / Blocked) while testing. Log every Fail as a GitHub issue (label </w:t>
+        <w:t xml:space="preserve"> (Pass / Fail / Blocked) while testing. First run Oct 23: fixes in issues #39 to #44 (APK v1.0.1); re-test those rows after the fix is deployed. Log every Fail as a GitHub issue (label </w:t>
       </w:r>
       <w:r>
         <w:rPr>
@@ -2026,7 +2026,7 @@
                 <w:sz w:val="20"/>
                 <w:szCs w:val="20"/>
               </w:rPr>
-              <w:t xml:space="preserve">Dashboard opens; after Log out, </w:t>
+              <w:t xml:space="preserve">Dashboard opens; Log out lands on the Administrator sign-in page; opening </w:t>
             </w:r>
             <w:r>
               <w:rPr>
@@ -2042,7 +2042,7 @@
                 <w:sz w:val="20"/>
                 <w:szCs w:val="20"/>
               </w:rPr>
-              <w:t xml:space="preserve"> redirects to sign-in</w:t>
+              <w:t xml:space="preserve"> again also goes to sign-in</w:t>
             </w:r>
           </w:p>
         </w:tc>
@@ -2192,7 +2192,25 @@
                 <w:sz w:val="20"/>
                 <w:szCs w:val="20"/>
               </w:rPr>
-              <w:t xml:space="preserve">Refused with the "This account uses the mobile app" state and a Download the app link (WRONG_PLATFORM, #36)</w:t>
+              <w:t xml:space="preserve">Refused with the "This account uses the mobile app" message and a </w:t>
+            </w:r>
+            <w:r>
+              <w:rPr>
+                <w:rFonts w:ascii="Calibri" w:cs="Calibri" w:eastAsia="Calibri" w:hAnsi="Calibri"/>
+                <w:b/>
+                <w:bCs/>
+                <w:sz w:val="20"/>
+                <w:szCs w:val="20"/>
+              </w:rPr>
+              <w:t xml:space="preserve">Get the Android app</w:t>
+            </w:r>
+            <w:r>
+              <w:rPr>
+                <w:rFonts w:ascii="Calibri" w:cs="Calibri" w:eastAsia="Calibri" w:hAnsi="Calibri"/>
+                <w:sz w:val="20"/>
+                <w:szCs w:val="20"/>
+              </w:rPr>
+              <w:t xml:space="preserve"> button (WRONG_PLATFORM, #36)</w:t>
             </w:r>
           </w:p>
         </w:tc>
@@ -6568,7 +6586,25 @@
                 <w:sz w:val="20"/>
                 <w:szCs w:val="20"/>
               </w:rPr>
-              <w:t xml:space="preserve">Try to assign an officer before verifying (another report)</w:t>
+              <w:t xml:space="preserve">On a report that is </w:t>
+            </w:r>
+            <w:r>
+              <w:rPr>
+                <w:rFonts w:ascii="Calibri" w:cs="Calibri" w:eastAsia="Calibri" w:hAnsi="Calibri"/>
+                <w:b/>
+                <w:bCs/>
+                <w:sz w:val="20"/>
+                <w:szCs w:val="20"/>
+              </w:rPr>
+              <w:t xml:space="preserve">not yet Verified</w:t>
+            </w:r>
+            <w:r>
+              <w:rPr>
+                <w:rFonts w:ascii="Calibri" w:cs="Calibri" w:eastAsia="Calibri" w:hAnsi="Calibri"/>
+                <w:sz w:val="20"/>
+                <w:szCs w:val="20"/>
+              </w:rPr>
+              <w:t xml:space="preserve">, try to assign an officer (screenshot the refusal, not a later successful assignment)</w:t>
             </w:r>
           </w:p>
         </w:tc>
@@ -7277,6 +7313,156 @@
           </w:tcPr>
           <w:p>
             <w:pPr>
+              <w:keepNext/>
+              <w:spacing w:after="0" w:before="0"/>
+            </w:pPr>
+            <w:r>
+              <w:rPr>
+                <w:rFonts w:ascii="Calibri" w:cs="Calibri" w:eastAsia="Calibri" w:hAnsi="Calibri"/>
+                <w:sz w:val="20"/>
+                <w:szCs w:val="20"/>
+              </w:rPr>
+              <w:t xml:space="preserve">TC-08.7</w:t>
+            </w:r>
+          </w:p>
+        </w:tc>
+        <w:tc>
+          <w:tcPr>
+            <w:tcW w:type="dxa" w:w="5500"/>
+            <w:tcBorders>
+              <w:top w:val="single" w:color="B8C2D0" w:sz="4"/>
+              <w:left w:val="single" w:color="B8C2D0" w:sz="4"/>
+              <w:bottom w:val="single" w:color="B8C2D0" w:sz="4"/>
+              <w:right w:val="single" w:color="B8C2D0" w:sz="4"/>
+            </w:tcBorders>
+            <w:tcMar>
+              <w:top w:type="dxa" w:w="60"/>
+              <w:left w:type="dxa" w:w="100"/>
+              <w:bottom w:type="dxa" w:w="60"/>
+              <w:right w:type="dxa" w:w="100"/>
+            </w:tcMar>
+            <w:vAlign w:val="top"/>
+          </w:tcPr>
+          <w:p>
+            <w:pPr>
+              <w:keepNext/>
+              <w:spacing w:after="0" w:before="0"/>
+            </w:pPr>
+            <w:r>
+              <w:rPr>
+                <w:rFonts w:ascii="Calibri" w:cs="Calibri" w:eastAsia="Calibri" w:hAnsi="Calibri"/>
+                <w:sz w:val="20"/>
+                <w:szCs w:val="20"/>
+              </w:rPr>
+              <w:t xml:space="preserve">O1: Open in Maps; Call on the reporter card</w:t>
+            </w:r>
+          </w:p>
+        </w:tc>
+        <w:tc>
+          <w:tcPr>
+            <w:tcW w:type="dxa" w:w="5500"/>
+            <w:tcBorders>
+              <w:top w:val="single" w:color="B8C2D0" w:sz="4"/>
+              <w:left w:val="single" w:color="B8C2D0" w:sz="4"/>
+              <w:bottom w:val="single" w:color="B8C2D0" w:sz="4"/>
+              <w:right w:val="single" w:color="B8C2D0" w:sz="4"/>
+            </w:tcBorders>
+            <w:tcMar>
+              <w:top w:type="dxa" w:w="60"/>
+              <w:left w:type="dxa" w:w="100"/>
+              <w:bottom w:type="dxa" w:w="60"/>
+              <w:right w:type="dxa" w:w="100"/>
+            </w:tcMar>
+            <w:vAlign w:val="top"/>
+          </w:tcPr>
+          <w:p>
+            <w:pPr>
+              <w:keepNext/>
+              <w:spacing w:after="0" w:before="0"/>
+            </w:pPr>
+            <w:r>
+              <w:rPr>
+                <w:rFonts w:ascii="Calibri" w:cs="Calibri" w:eastAsia="Calibri" w:hAnsi="Calibri"/>
+                <w:sz w:val="20"/>
+                <w:szCs w:val="20"/>
+              </w:rPr>
+              <w:t xml:space="preserve">Maps app opens at the pin; dialer opens with R1's number</w:t>
+            </w:r>
+          </w:p>
+        </w:tc>
+        <w:tc>
+          <w:tcPr>
+            <w:tcW w:type="dxa" w:w="4900"/>
+            <w:tcBorders>
+              <w:top w:val="single" w:color="B8C2D0" w:sz="4"/>
+              <w:left w:val="single" w:color="B8C2D0" w:sz="4"/>
+              <w:bottom w:val="single" w:color="B8C2D0" w:sz="4"/>
+              <w:right w:val="single" w:color="B8C2D0" w:sz="4"/>
+            </w:tcBorders>
+            <w:tcMar>
+              <w:top w:type="dxa" w:w="60"/>
+              <w:left w:type="dxa" w:w="100"/>
+              <w:bottom w:type="dxa" w:w="60"/>
+              <w:right w:type="dxa" w:w="100"/>
+            </w:tcMar>
+            <w:vAlign w:val="top"/>
+          </w:tcPr>
+          <w:p>
+            <w:pPr>
+              <w:keepNext/>
+              <w:spacing w:after="0" w:before="0"/>
+            </w:pPr>
+          </w:p>
+        </w:tc>
+        <w:tc>
+          <w:tcPr>
+            <w:tcW w:type="dxa" w:w="1520"/>
+            <w:tcBorders>
+              <w:top w:val="single" w:color="B8C2D0" w:sz="4"/>
+              <w:left w:val="single" w:color="B8C2D0" w:sz="4"/>
+              <w:bottom w:val="single" w:color="B8C2D0" w:sz="4"/>
+              <w:right w:val="single" w:color="B8C2D0" w:sz="4"/>
+            </w:tcBorders>
+            <w:tcMar>
+              <w:top w:type="dxa" w:w="60"/>
+              <w:left w:type="dxa" w:w="100"/>
+              <w:bottom w:type="dxa" w:w="60"/>
+              <w:right w:type="dxa" w:w="100"/>
+            </w:tcMar>
+            <w:vAlign w:val="top"/>
+          </w:tcPr>
+          <w:p>
+            <w:pPr>
+              <w:keepNext/>
+              <w:spacing w:after="0" w:before="0"/>
+            </w:pPr>
+          </w:p>
+        </w:tc>
+      </w:tr>
+      <w:tr>
+        <w:trPr>
+          <w:cantSplit/>
+          <w:trHeight w:val="650" w:hRule="atLeast"/>
+        </w:trPr>
+        <w:tc>
+          <w:tcPr>
+            <w:tcW w:type="dxa" w:w="1300"/>
+            <w:tcBorders>
+              <w:top w:val="single" w:color="B8C2D0" w:sz="4"/>
+              <w:left w:val="single" w:color="B8C2D0" w:sz="4"/>
+              <w:bottom w:val="single" w:color="B8C2D0" w:sz="4"/>
+              <w:right w:val="single" w:color="B8C2D0" w:sz="4"/>
+            </w:tcBorders>
+            <w:tcMar>
+              <w:top w:type="dxa" w:w="60"/>
+              <w:left w:type="dxa" w:w="100"/>
+              <w:bottom w:type="dxa" w:w="60"/>
+              <w:right w:type="dxa" w:w="100"/>
+            </w:tcMar>
+            <w:vAlign w:val="top"/>
+          </w:tcPr>
+          <w:p>
+            <w:pPr>
               <w:keepNext w:val="false"/>
               <w:spacing w:after="0" w:before="0"/>
             </w:pPr>
@@ -7286,7 +7472,7 @@
                 <w:sz w:val="20"/>
                 <w:szCs w:val="20"/>
               </w:rPr>
-              <w:t xml:space="preserve">TC-08.7</w:t>
+              <w:t xml:space="preserve">TC-08.8</w:t>
             </w:r>
           </w:p>
         </w:tc>
@@ -7318,7 +7504,7 @@
                 <w:sz w:val="20"/>
                 <w:szCs w:val="20"/>
               </w:rPr>
-              <w:t xml:space="preserve">O1: Open in Maps; Call on the reporter card</w:t>
+              <w:t xml:space="preserve">Admin rejects a report assigned to O1; O1 opens it on the app</w:t>
             </w:r>
           </w:p>
         </w:tc>
@@ -7350,7 +7536,7 @@
                 <w:sz w:val="20"/>
                 <w:szCs w:val="20"/>
               </w:rPr>
-              <w:t xml:space="preserve">Maps app opens at the pin; dialer opens with R1's number</w:t>
+              <w:t xml:space="preserve">Not listed under "All open"; no Update status button, a note says the administrator rejected it (issue #44)</w:t>
             </w:r>
           </w:p>
         </w:tc>
@@ -8886,7 +9072,55 @@
                 <w:sz w:val="20"/>
                 <w:szCs w:val="20"/>
               </w:rPr>
-              <w:t xml:space="preserve">Reports: search by Report ID, then by a word in the location</w:t>
+              <w:t xml:space="preserve">Reports: search by Report ID as shown (</w:t>
+            </w:r>
+            <w:r>
+              <w:rPr>
+                <w:rFonts w:ascii="Consolas" w:cs="Consolas" w:eastAsia="Consolas" w:hAnsi="Consolas"/>
+                <w:sz w:val="18"/>
+                <w:szCs w:val="18"/>
+              </w:rPr>
+              <w:t xml:space="preserve">RW-000004</w:t>
+            </w:r>
+            <w:r>
+              <w:rPr>
+                <w:rFonts w:ascii="Calibri" w:cs="Calibri" w:eastAsia="Calibri" w:hAnsi="Calibri"/>
+                <w:sz w:val="20"/>
+                <w:szCs w:val="20"/>
+              </w:rPr>
+              <w:t xml:space="preserve">, also </w:t>
+            </w:r>
+            <w:r>
+              <w:rPr>
+                <w:rFonts w:ascii="Consolas" w:cs="Consolas" w:eastAsia="Consolas" w:hAnsi="Consolas"/>
+                <w:sz w:val="18"/>
+                <w:szCs w:val="18"/>
+              </w:rPr>
+              <w:t xml:space="preserve">#4</w:t>
+            </w:r>
+            <w:r>
+              <w:rPr>
+                <w:rFonts w:ascii="Calibri" w:cs="Calibri" w:eastAsia="Calibri" w:hAnsi="Calibri"/>
+                <w:sz w:val="20"/>
+                <w:szCs w:val="20"/>
+              </w:rPr>
+              <w:t xml:space="preserve"> or </w:t>
+            </w:r>
+            <w:r>
+              <w:rPr>
+                <w:rFonts w:ascii="Consolas" w:cs="Consolas" w:eastAsia="Consolas" w:hAnsi="Consolas"/>
+                <w:sz w:val="18"/>
+                <w:szCs w:val="18"/>
+              </w:rPr>
+              <w:t xml:space="preserve">4</w:t>
+            </w:r>
+            <w:r>
+              <w:rPr>
+                <w:rFonts w:ascii="Calibri" w:cs="Calibri" w:eastAsia="Calibri" w:hAnsi="Calibri"/>
+                <w:sz w:val="20"/>
+                <w:szCs w:val="20"/>
+              </w:rPr>
+              <w:t xml:space="preserve">), then by a word in the location</w:t>
             </w:r>
           </w:p>
         </w:tc>

</xml_diff>

<commit_message>
docs: #37 #45 #46 coded (DECISIONS #43), new test cases, Word test plan; log Carl and Pauline handoffs
</commit_message>
<xml_diff>
--- a/docs/RoadWatch-Test-Plan.docx
+++ b/docs/RoadWatch-Test-Plan.docx
@@ -2453,7 +2453,7 @@
           </w:tcPr>
           <w:p>
             <w:pPr>
-              <w:keepNext w:val="false"/>
+              <w:keepNext/>
               <w:spacing w:after="0" w:before="0"/>
             </w:pPr>
             <w:r>
@@ -2485,7 +2485,7 @@
           </w:tcPr>
           <w:p>
             <w:pPr>
-              <w:keepNext w:val="false"/>
+              <w:keepNext/>
               <w:spacing w:after="0" w:before="0"/>
             </w:pPr>
             <w:r>
@@ -2517,7 +2517,7 @@
           </w:tcPr>
           <w:p>
             <w:pPr>
-              <w:keepNext w:val="false"/>
+              <w:keepNext/>
               <w:spacing w:after="0" w:before="0"/>
             </w:pPr>
             <w:r>
@@ -2545,6 +2545,508 @@
                 <w:szCs w:val="20"/>
               </w:rPr>
               <w:t xml:space="preserve"> (tabs: Assigned, Notifications, Settings)</w:t>
+            </w:r>
+          </w:p>
+        </w:tc>
+        <w:tc>
+          <w:tcPr>
+            <w:tcW w:type="dxa" w:w="4900"/>
+            <w:tcBorders>
+              <w:top w:val="single" w:color="B8C2D0" w:sz="4"/>
+              <w:left w:val="single" w:color="B8C2D0" w:sz="4"/>
+              <w:bottom w:val="single" w:color="B8C2D0" w:sz="4"/>
+              <w:right w:val="single" w:color="B8C2D0" w:sz="4"/>
+            </w:tcBorders>
+            <w:tcMar>
+              <w:top w:type="dxa" w:w="60"/>
+              <w:left w:type="dxa" w:w="100"/>
+              <w:bottom w:type="dxa" w:w="60"/>
+              <w:right w:type="dxa" w:w="100"/>
+            </w:tcMar>
+            <w:vAlign w:val="top"/>
+          </w:tcPr>
+          <w:p>
+            <w:pPr>
+              <w:keepNext/>
+              <w:spacing w:after="0" w:before="0"/>
+            </w:pPr>
+          </w:p>
+        </w:tc>
+        <w:tc>
+          <w:tcPr>
+            <w:tcW w:type="dxa" w:w="1520"/>
+            <w:tcBorders>
+              <w:top w:val="single" w:color="B8C2D0" w:sz="4"/>
+              <w:left w:val="single" w:color="B8C2D0" w:sz="4"/>
+              <w:bottom w:val="single" w:color="B8C2D0" w:sz="4"/>
+              <w:right w:val="single" w:color="B8C2D0" w:sz="4"/>
+            </w:tcBorders>
+            <w:tcMar>
+              <w:top w:type="dxa" w:w="60"/>
+              <w:left w:type="dxa" w:w="100"/>
+              <w:bottom w:type="dxa" w:w="60"/>
+              <w:right w:type="dxa" w:w="100"/>
+            </w:tcMar>
+            <w:vAlign w:val="top"/>
+          </w:tcPr>
+          <w:p>
+            <w:pPr>
+              <w:keepNext/>
+              <w:spacing w:after="0" w:before="0"/>
+            </w:pPr>
+          </w:p>
+        </w:tc>
+      </w:tr>
+      <w:tr>
+        <w:trPr>
+          <w:cantSplit/>
+          <w:trHeight w:val="650" w:hRule="atLeast"/>
+        </w:trPr>
+        <w:tc>
+          <w:tcPr>
+            <w:tcW w:type="dxa" w:w="1300"/>
+            <w:tcBorders>
+              <w:top w:val="single" w:color="B8C2D0" w:sz="4"/>
+              <w:left w:val="single" w:color="B8C2D0" w:sz="4"/>
+              <w:bottom w:val="single" w:color="B8C2D0" w:sz="4"/>
+              <w:right w:val="single" w:color="B8C2D0" w:sz="4"/>
+            </w:tcBorders>
+            <w:tcMar>
+              <w:top w:type="dxa" w:w="60"/>
+              <w:left w:type="dxa" w:w="100"/>
+              <w:bottom w:type="dxa" w:w="60"/>
+              <w:right w:type="dxa" w:w="100"/>
+            </w:tcMar>
+            <w:vAlign w:val="top"/>
+          </w:tcPr>
+          <w:p>
+            <w:pPr>
+              <w:keepNext/>
+              <w:spacing w:after="0" w:before="0"/>
+            </w:pPr>
+            <w:r>
+              <w:rPr>
+                <w:rFonts w:ascii="Calibri" w:cs="Calibri" w:eastAsia="Calibri" w:hAnsi="Calibri"/>
+                <w:sz w:val="20"/>
+                <w:szCs w:val="20"/>
+              </w:rPr>
+              <w:t xml:space="preserve">TC-02.7</w:t>
+            </w:r>
+          </w:p>
+        </w:tc>
+        <w:tc>
+          <w:tcPr>
+            <w:tcW w:type="dxa" w:w="5500"/>
+            <w:tcBorders>
+              <w:top w:val="single" w:color="B8C2D0" w:sz="4"/>
+              <w:left w:val="single" w:color="B8C2D0" w:sz="4"/>
+              <w:bottom w:val="single" w:color="B8C2D0" w:sz="4"/>
+              <w:right w:val="single" w:color="B8C2D0" w:sz="4"/>
+            </w:tcBorders>
+            <w:tcMar>
+              <w:top w:type="dxa" w:w="60"/>
+              <w:left w:type="dxa" w:w="100"/>
+              <w:bottom w:type="dxa" w:w="60"/>
+              <w:right w:type="dxa" w:w="100"/>
+            </w:tcMar>
+            <w:vAlign w:val="top"/>
+          </w:tcPr>
+          <w:p>
+            <w:pPr>
+              <w:keepNext/>
+              <w:spacing w:after="0" w:before="0"/>
+            </w:pPr>
+            <w:r>
+              <w:rPr>
+                <w:rFonts w:ascii="Calibri" w:cs="Calibri" w:eastAsia="Calibri" w:hAnsi="Calibri"/>
+                <w:sz w:val="20"/>
+                <w:szCs w:val="20"/>
+              </w:rPr>
+              <w:t xml:space="preserve">Mobile (R1, then O1): Log in &gt; </w:t>
+            </w:r>
+            <w:r>
+              <w:rPr>
+                <w:rFonts w:ascii="Calibri" w:cs="Calibri" w:eastAsia="Calibri" w:hAnsi="Calibri"/>
+                <w:b/>
+                <w:bCs/>
+                <w:sz w:val="20"/>
+                <w:szCs w:val="20"/>
+              </w:rPr>
+              <w:t xml:space="preserve">Forgot password?</w:t>
+            </w:r>
+            <w:r>
+              <w:rPr>
+                <w:rFonts w:ascii="Calibri" w:cs="Calibri" w:eastAsia="Calibri" w:hAnsi="Calibri"/>
+                <w:sz w:val="20"/>
+                <w:szCs w:val="20"/>
+              </w:rPr>
+              <w:t xml:space="preserve"> &gt; email &gt; Send code; type the 8-character code from the email and a new password (#37)</w:t>
+            </w:r>
+          </w:p>
+        </w:tc>
+        <w:tc>
+          <w:tcPr>
+            <w:tcW w:type="dxa" w:w="5500"/>
+            <w:tcBorders>
+              <w:top w:val="single" w:color="B8C2D0" w:sz="4"/>
+              <w:left w:val="single" w:color="B8C2D0" w:sz="4"/>
+              <w:bottom w:val="single" w:color="B8C2D0" w:sz="4"/>
+              <w:right w:val="single" w:color="B8C2D0" w:sz="4"/>
+            </w:tcBorders>
+            <w:tcMar>
+              <w:top w:type="dxa" w:w="60"/>
+              <w:left w:type="dxa" w:w="100"/>
+              <w:bottom w:type="dxa" w:w="60"/>
+              <w:right w:type="dxa" w:w="100"/>
+            </w:tcMar>
+            <w:vAlign w:val="top"/>
+          </w:tcPr>
+          <w:p>
+            <w:pPr>
+              <w:keepNext/>
+              <w:spacing w:after="0" w:before="0"/>
+            </w:pPr>
+            <w:r>
+              <w:rPr>
+                <w:rFonts w:ascii="Calibri" w:cs="Calibri" w:eastAsia="Calibri" w:hAnsi="Calibri"/>
+                <w:sz w:val="20"/>
+                <w:szCs w:val="20"/>
+              </w:rPr>
+              <w:t xml:space="preserve">"If ... has a RoadWatch account, we sent it a code"; a wrong code shows "This code is wrong or has expired. Send a new code." under Code; the right code returns to Log in with "Password changed"; the new password works, the old one does not</w:t>
+            </w:r>
+          </w:p>
+        </w:tc>
+        <w:tc>
+          <w:tcPr>
+            <w:tcW w:type="dxa" w:w="4900"/>
+            <w:tcBorders>
+              <w:top w:val="single" w:color="B8C2D0" w:sz="4"/>
+              <w:left w:val="single" w:color="B8C2D0" w:sz="4"/>
+              <w:bottom w:val="single" w:color="B8C2D0" w:sz="4"/>
+              <w:right w:val="single" w:color="B8C2D0" w:sz="4"/>
+            </w:tcBorders>
+            <w:tcMar>
+              <w:top w:type="dxa" w:w="60"/>
+              <w:left w:type="dxa" w:w="100"/>
+              <w:bottom w:type="dxa" w:w="60"/>
+              <w:right w:type="dxa" w:w="100"/>
+            </w:tcMar>
+            <w:vAlign w:val="top"/>
+          </w:tcPr>
+          <w:p>
+            <w:pPr>
+              <w:keepNext/>
+              <w:spacing w:after="0" w:before="0"/>
+            </w:pPr>
+          </w:p>
+        </w:tc>
+        <w:tc>
+          <w:tcPr>
+            <w:tcW w:type="dxa" w:w="1520"/>
+            <w:tcBorders>
+              <w:top w:val="single" w:color="B8C2D0" w:sz="4"/>
+              <w:left w:val="single" w:color="B8C2D0" w:sz="4"/>
+              <w:bottom w:val="single" w:color="B8C2D0" w:sz="4"/>
+              <w:right w:val="single" w:color="B8C2D0" w:sz="4"/>
+            </w:tcBorders>
+            <w:tcMar>
+              <w:top w:type="dxa" w:w="60"/>
+              <w:left w:type="dxa" w:w="100"/>
+              <w:bottom w:type="dxa" w:w="60"/>
+              <w:right w:type="dxa" w:w="100"/>
+            </w:tcMar>
+            <w:vAlign w:val="top"/>
+          </w:tcPr>
+          <w:p>
+            <w:pPr>
+              <w:keepNext/>
+              <w:spacing w:after="0" w:before="0"/>
+            </w:pPr>
+          </w:p>
+        </w:tc>
+      </w:tr>
+      <w:tr>
+        <w:trPr>
+          <w:cantSplit/>
+          <w:trHeight w:val="650" w:hRule="atLeast"/>
+        </w:trPr>
+        <w:tc>
+          <w:tcPr>
+            <w:tcW w:type="dxa" w:w="1300"/>
+            <w:tcBorders>
+              <w:top w:val="single" w:color="B8C2D0" w:sz="4"/>
+              <w:left w:val="single" w:color="B8C2D0" w:sz="4"/>
+              <w:bottom w:val="single" w:color="B8C2D0" w:sz="4"/>
+              <w:right w:val="single" w:color="B8C2D0" w:sz="4"/>
+            </w:tcBorders>
+            <w:tcMar>
+              <w:top w:type="dxa" w:w="60"/>
+              <w:left w:type="dxa" w:w="100"/>
+              <w:bottom w:type="dxa" w:w="60"/>
+              <w:right w:type="dxa" w:w="100"/>
+            </w:tcMar>
+            <w:vAlign w:val="top"/>
+          </w:tcPr>
+          <w:p>
+            <w:pPr>
+              <w:keepNext/>
+              <w:spacing w:after="0" w:before="0"/>
+            </w:pPr>
+            <w:r>
+              <w:rPr>
+                <w:rFonts w:ascii="Calibri" w:cs="Calibri" w:eastAsia="Calibri" w:hAnsi="Calibri"/>
+                <w:sz w:val="20"/>
+                <w:szCs w:val="20"/>
+              </w:rPr>
+              <w:t xml:space="preserve">TC-02.8</w:t>
+            </w:r>
+          </w:p>
+        </w:tc>
+        <w:tc>
+          <w:tcPr>
+            <w:tcW w:type="dxa" w:w="5500"/>
+            <w:tcBorders>
+              <w:top w:val="single" w:color="B8C2D0" w:sz="4"/>
+              <w:left w:val="single" w:color="B8C2D0" w:sz="4"/>
+              <w:bottom w:val="single" w:color="B8C2D0" w:sz="4"/>
+              <w:right w:val="single" w:color="B8C2D0" w:sz="4"/>
+            </w:tcBorders>
+            <w:tcMar>
+              <w:top w:type="dxa" w:w="60"/>
+              <w:left w:type="dxa" w:w="100"/>
+              <w:bottom w:type="dxa" w:w="60"/>
+              <w:right w:type="dxa" w:w="100"/>
+            </w:tcMar>
+            <w:vAlign w:val="top"/>
+          </w:tcPr>
+          <w:p>
+            <w:pPr>
+              <w:keepNext/>
+              <w:spacing w:after="0" w:before="0"/>
+            </w:pPr>
+            <w:r>
+              <w:rPr>
+                <w:rFonts w:ascii="Calibri" w:cs="Calibri" w:eastAsia="Calibri" w:hAnsi="Calibri"/>
+                <w:sz w:val="20"/>
+                <w:szCs w:val="20"/>
+              </w:rPr>
+              <w:t xml:space="preserve">Web (A1): </w:t>
+            </w:r>
+            <w:r>
+              <w:rPr>
+                <w:rFonts w:ascii="Consolas" w:cs="Consolas" w:eastAsia="Consolas" w:hAnsi="Consolas"/>
+                <w:sz w:val="18"/>
+                <w:szCs w:val="18"/>
+              </w:rPr>
+              <w:t xml:space="preserve">/staff/sign-in</w:t>
+            </w:r>
+            <w:r>
+              <w:rPr>
+                <w:rFonts w:ascii="Calibri" w:cs="Calibri" w:eastAsia="Calibri" w:hAnsi="Calibri"/>
+                <w:sz w:val="20"/>
+                <w:szCs w:val="20"/>
+              </w:rPr>
+              <w:t xml:space="preserve"> &gt; </w:t>
+            </w:r>
+            <w:r>
+              <w:rPr>
+                <w:rFonts w:ascii="Calibri" w:cs="Calibri" w:eastAsia="Calibri" w:hAnsi="Calibri"/>
+                <w:b/>
+                <w:bCs/>
+                <w:sz w:val="20"/>
+                <w:szCs w:val="20"/>
+              </w:rPr>
+              <w:t xml:space="preserve">Forgot password?</w:t>
+            </w:r>
+            <w:r>
+              <w:rPr>
+                <w:rFonts w:ascii="Calibri" w:cs="Calibri" w:eastAsia="Calibri" w:hAnsi="Calibri"/>
+                <w:sz w:val="20"/>
+                <w:szCs w:val="20"/>
+              </w:rPr>
+              <w:t xml:space="preserve">, same steps; then try the same code again, and a code older than 15 minutes (#37)</w:t>
+            </w:r>
+          </w:p>
+        </w:tc>
+        <w:tc>
+          <w:tcPr>
+            <w:tcW w:type="dxa" w:w="5500"/>
+            <w:tcBorders>
+              <w:top w:val="single" w:color="B8C2D0" w:sz="4"/>
+              <w:left w:val="single" w:color="B8C2D0" w:sz="4"/>
+              <w:bottom w:val="single" w:color="B8C2D0" w:sz="4"/>
+              <w:right w:val="single" w:color="B8C2D0" w:sz="4"/>
+            </w:tcBorders>
+            <w:tcMar>
+              <w:top w:type="dxa" w:w="60"/>
+              <w:left w:type="dxa" w:w="100"/>
+              <w:bottom w:type="dxa" w:w="60"/>
+              <w:right w:type="dxa" w:w="100"/>
+            </w:tcMar>
+            <w:vAlign w:val="top"/>
+          </w:tcPr>
+          <w:p>
+            <w:pPr>
+              <w:keepNext/>
+              <w:spacing w:after="0" w:before="0"/>
+            </w:pPr>
+            <w:r>
+              <w:rPr>
+                <w:rFonts w:ascii="Calibri" w:cs="Calibri" w:eastAsia="Calibri" w:hAnsi="Calibri"/>
+                <w:sz w:val="20"/>
+                <w:szCs w:val="20"/>
+              </w:rPr>
+              <w:t xml:space="preserve">Same as TC-02.7 on the web; a used or expired code is refused; an unknown email gets the same "we sent it a code" message (nothing reveals whether an account exists)</w:t>
+            </w:r>
+          </w:p>
+        </w:tc>
+        <w:tc>
+          <w:tcPr>
+            <w:tcW w:type="dxa" w:w="4900"/>
+            <w:tcBorders>
+              <w:top w:val="single" w:color="B8C2D0" w:sz="4"/>
+              <w:left w:val="single" w:color="B8C2D0" w:sz="4"/>
+              <w:bottom w:val="single" w:color="B8C2D0" w:sz="4"/>
+              <w:right w:val="single" w:color="B8C2D0" w:sz="4"/>
+            </w:tcBorders>
+            <w:tcMar>
+              <w:top w:type="dxa" w:w="60"/>
+              <w:left w:type="dxa" w:w="100"/>
+              <w:bottom w:type="dxa" w:w="60"/>
+              <w:right w:type="dxa" w:w="100"/>
+            </w:tcMar>
+            <w:vAlign w:val="top"/>
+          </w:tcPr>
+          <w:p>
+            <w:pPr>
+              <w:keepNext/>
+              <w:spacing w:after="0" w:before="0"/>
+            </w:pPr>
+          </w:p>
+        </w:tc>
+        <w:tc>
+          <w:tcPr>
+            <w:tcW w:type="dxa" w:w="1520"/>
+            <w:tcBorders>
+              <w:top w:val="single" w:color="B8C2D0" w:sz="4"/>
+              <w:left w:val="single" w:color="B8C2D0" w:sz="4"/>
+              <w:bottom w:val="single" w:color="B8C2D0" w:sz="4"/>
+              <w:right w:val="single" w:color="B8C2D0" w:sz="4"/>
+            </w:tcBorders>
+            <w:tcMar>
+              <w:top w:type="dxa" w:w="60"/>
+              <w:left w:type="dxa" w:w="100"/>
+              <w:bottom w:type="dxa" w:w="60"/>
+              <w:right w:type="dxa" w:w="100"/>
+            </w:tcMar>
+            <w:vAlign w:val="top"/>
+          </w:tcPr>
+          <w:p>
+            <w:pPr>
+              <w:keepNext/>
+              <w:spacing w:after="0" w:before="0"/>
+            </w:pPr>
+          </w:p>
+        </w:tc>
+      </w:tr>
+      <w:tr>
+        <w:trPr>
+          <w:cantSplit/>
+          <w:trHeight w:val="650" w:hRule="atLeast"/>
+        </w:trPr>
+        <w:tc>
+          <w:tcPr>
+            <w:tcW w:type="dxa" w:w="1300"/>
+            <w:tcBorders>
+              <w:top w:val="single" w:color="B8C2D0" w:sz="4"/>
+              <w:left w:val="single" w:color="B8C2D0" w:sz="4"/>
+              <w:bottom w:val="single" w:color="B8C2D0" w:sz="4"/>
+              <w:right w:val="single" w:color="B8C2D0" w:sz="4"/>
+            </w:tcBorders>
+            <w:tcMar>
+              <w:top w:type="dxa" w:w="60"/>
+              <w:left w:type="dxa" w:w="100"/>
+              <w:bottom w:type="dxa" w:w="60"/>
+              <w:right w:type="dxa" w:w="100"/>
+            </w:tcMar>
+            <w:vAlign w:val="top"/>
+          </w:tcPr>
+          <w:p>
+            <w:pPr>
+              <w:keepNext w:val="false"/>
+              <w:spacing w:after="0" w:before="0"/>
+            </w:pPr>
+            <w:r>
+              <w:rPr>
+                <w:rFonts w:ascii="Calibri" w:cs="Calibri" w:eastAsia="Calibri" w:hAnsi="Calibri"/>
+                <w:sz w:val="20"/>
+                <w:szCs w:val="20"/>
+              </w:rPr>
+              <w:t xml:space="preserve">TC-02.9</w:t>
+            </w:r>
+          </w:p>
+        </w:tc>
+        <w:tc>
+          <w:tcPr>
+            <w:tcW w:type="dxa" w:w="5500"/>
+            <w:tcBorders>
+              <w:top w:val="single" w:color="B8C2D0" w:sz="4"/>
+              <w:left w:val="single" w:color="B8C2D0" w:sz="4"/>
+              <w:bottom w:val="single" w:color="B8C2D0" w:sz="4"/>
+              <w:right w:val="single" w:color="B8C2D0" w:sz="4"/>
+            </w:tcBorders>
+            <w:tcMar>
+              <w:top w:type="dxa" w:w="60"/>
+              <w:left w:type="dxa" w:w="100"/>
+              <w:bottom w:type="dxa" w:w="60"/>
+              <w:right w:type="dxa" w:w="100"/>
+            </w:tcMar>
+            <w:vAlign w:val="top"/>
+          </w:tcPr>
+          <w:p>
+            <w:pPr>
+              <w:keepNext w:val="false"/>
+              <w:spacing w:after="0" w:before="0"/>
+            </w:pPr>
+            <w:r>
+              <w:rPr>
+                <w:rFonts w:ascii="Calibri" w:cs="Calibri" w:eastAsia="Calibri" w:hAnsi="Calibri"/>
+                <w:sz w:val="20"/>
+                <w:szCs w:val="20"/>
+              </w:rPr>
+              <w:t xml:space="preserve">Every password field (mobile Log in, Register, Change password, Forgot password; web sign-in, Change password, Create officer, Reset password): press the eye (#45)</w:t>
+            </w:r>
+          </w:p>
+        </w:tc>
+        <w:tc>
+          <w:tcPr>
+            <w:tcW w:type="dxa" w:w="5500"/>
+            <w:tcBorders>
+              <w:top w:val="single" w:color="B8C2D0" w:sz="4"/>
+              <w:left w:val="single" w:color="B8C2D0" w:sz="4"/>
+              <w:bottom w:val="single" w:color="B8C2D0" w:sz="4"/>
+              <w:right w:val="single" w:color="B8C2D0" w:sz="4"/>
+            </w:tcBorders>
+            <w:tcMar>
+              <w:top w:type="dxa" w:w="60"/>
+              <w:left w:type="dxa" w:w="100"/>
+              <w:bottom w:type="dxa" w:w="60"/>
+              <w:right w:type="dxa" w:w="100"/>
+            </w:tcMar>
+            <w:vAlign w:val="top"/>
+          </w:tcPr>
+          <w:p>
+            <w:pPr>
+              <w:keepNext w:val="false"/>
+              <w:spacing w:after="0" w:before="0"/>
+            </w:pPr>
+            <w:r>
+              <w:rPr>
+                <w:rFonts w:ascii="Calibri" w:cs="Calibri" w:eastAsia="Calibri" w:hAnsi="Calibri"/>
+                <w:sz w:val="20"/>
+                <w:szCs w:val="20"/>
+              </w:rPr>
+              <w:t xml:space="preserve">The password shows and the icon becomes the crossed eye; it stays shown until pressed again; screen readers hear "Show password" / "Hide password"</w:t>
             </w:r>
           </w:p>
         </w:tc>
@@ -3821,6 +4323,156 @@
           </w:tcPr>
           <w:p>
             <w:pPr>
+              <w:keepNext/>
+              <w:spacing w:after="0" w:before="0"/>
+            </w:pPr>
+            <w:r>
+              <w:rPr>
+                <w:rFonts w:ascii="Calibri" w:cs="Calibri" w:eastAsia="Calibri" w:hAnsi="Calibri"/>
+                <w:sz w:val="20"/>
+                <w:szCs w:val="20"/>
+              </w:rPr>
+              <w:t xml:space="preserve">TC-04.3</w:t>
+            </w:r>
+          </w:p>
+        </w:tc>
+        <w:tc>
+          <w:tcPr>
+            <w:tcW w:type="dxa" w:w="5500"/>
+            <w:tcBorders>
+              <w:top w:val="single" w:color="B8C2D0" w:sz="4"/>
+              <w:left w:val="single" w:color="B8C2D0" w:sz="4"/>
+              <w:bottom w:val="single" w:color="B8C2D0" w:sz="4"/>
+              <w:right w:val="single" w:color="B8C2D0" w:sz="4"/>
+            </w:tcBorders>
+            <w:tcMar>
+              <w:top w:type="dxa" w:w="60"/>
+              <w:left w:type="dxa" w:w="100"/>
+              <w:bottom w:type="dxa" w:w="60"/>
+              <w:right w:type="dxa" w:w="100"/>
+            </w:tcMar>
+            <w:vAlign w:val="top"/>
+          </w:tcPr>
+          <w:p>
+            <w:pPr>
+              <w:keepNext/>
+              <w:spacing w:after="0" w:before="0"/>
+            </w:pPr>
+            <w:r>
+              <w:rPr>
+                <w:rFonts w:ascii="Calibri" w:cs="Calibri" w:eastAsia="Calibri" w:hAnsi="Calibri"/>
+                <w:sz w:val="20"/>
+                <w:szCs w:val="20"/>
+              </w:rPr>
+              <w:t xml:space="preserve">Remove the pin and type only a location</w:t>
+            </w:r>
+          </w:p>
+        </w:tc>
+        <w:tc>
+          <w:tcPr>
+            <w:tcW w:type="dxa" w:w="5500"/>
+            <w:tcBorders>
+              <w:top w:val="single" w:color="B8C2D0" w:sz="4"/>
+              <w:left w:val="single" w:color="B8C2D0" w:sz="4"/>
+              <w:bottom w:val="single" w:color="B8C2D0" w:sz="4"/>
+              <w:right w:val="single" w:color="B8C2D0" w:sz="4"/>
+            </w:tcBorders>
+            <w:tcMar>
+              <w:top w:type="dxa" w:w="60"/>
+              <w:left w:type="dxa" w:w="100"/>
+              <w:bottom w:type="dxa" w:w="60"/>
+              <w:right w:type="dxa" w:w="100"/>
+            </w:tcMar>
+            <w:vAlign w:val="top"/>
+          </w:tcPr>
+          <w:p>
+            <w:pPr>
+              <w:keepNext/>
+              <w:spacing w:after="0" w:before="0"/>
+            </w:pPr>
+            <w:r>
+              <w:rPr>
+                <w:rFonts w:ascii="Calibri" w:cs="Calibri" w:eastAsia="Calibri" w:hAnsi="Calibri"/>
+                <w:sz w:val="20"/>
+                <w:szCs w:val="20"/>
+              </w:rPr>
+              <w:t xml:space="preserve">Report submits without coordinates (location text is required, pin is optional)</w:t>
+            </w:r>
+          </w:p>
+        </w:tc>
+        <w:tc>
+          <w:tcPr>
+            <w:tcW w:type="dxa" w:w="4900"/>
+            <w:tcBorders>
+              <w:top w:val="single" w:color="B8C2D0" w:sz="4"/>
+              <w:left w:val="single" w:color="B8C2D0" w:sz="4"/>
+              <w:bottom w:val="single" w:color="B8C2D0" w:sz="4"/>
+              <w:right w:val="single" w:color="B8C2D0" w:sz="4"/>
+            </w:tcBorders>
+            <w:tcMar>
+              <w:top w:type="dxa" w:w="60"/>
+              <w:left w:type="dxa" w:w="100"/>
+              <w:bottom w:type="dxa" w:w="60"/>
+              <w:right w:type="dxa" w:w="100"/>
+            </w:tcMar>
+            <w:vAlign w:val="top"/>
+          </w:tcPr>
+          <w:p>
+            <w:pPr>
+              <w:keepNext/>
+              <w:spacing w:after="0" w:before="0"/>
+            </w:pPr>
+          </w:p>
+        </w:tc>
+        <w:tc>
+          <w:tcPr>
+            <w:tcW w:type="dxa" w:w="1520"/>
+            <w:tcBorders>
+              <w:top w:val="single" w:color="B8C2D0" w:sz="4"/>
+              <w:left w:val="single" w:color="B8C2D0" w:sz="4"/>
+              <w:bottom w:val="single" w:color="B8C2D0" w:sz="4"/>
+              <w:right w:val="single" w:color="B8C2D0" w:sz="4"/>
+            </w:tcBorders>
+            <w:tcMar>
+              <w:top w:type="dxa" w:w="60"/>
+              <w:left w:type="dxa" w:w="100"/>
+              <w:bottom w:type="dxa" w:w="60"/>
+              <w:right w:type="dxa" w:w="100"/>
+            </w:tcMar>
+            <w:vAlign w:val="top"/>
+          </w:tcPr>
+          <w:p>
+            <w:pPr>
+              <w:keepNext/>
+              <w:spacing w:after="0" w:before="0"/>
+            </w:pPr>
+          </w:p>
+        </w:tc>
+      </w:tr>
+      <w:tr>
+        <w:trPr>
+          <w:cantSplit/>
+          <w:trHeight w:val="650" w:hRule="atLeast"/>
+        </w:trPr>
+        <w:tc>
+          <w:tcPr>
+            <w:tcW w:type="dxa" w:w="1300"/>
+            <w:tcBorders>
+              <w:top w:val="single" w:color="B8C2D0" w:sz="4"/>
+              <w:left w:val="single" w:color="B8C2D0" w:sz="4"/>
+              <w:bottom w:val="single" w:color="B8C2D0" w:sz="4"/>
+              <w:right w:val="single" w:color="B8C2D0" w:sz="4"/>
+            </w:tcBorders>
+            <w:tcMar>
+              <w:top w:type="dxa" w:w="60"/>
+              <w:left w:type="dxa" w:w="100"/>
+              <w:bottom w:type="dxa" w:w="60"/>
+              <w:right w:type="dxa" w:w="100"/>
+            </w:tcMar>
+            <w:vAlign w:val="top"/>
+          </w:tcPr>
+          <w:p>
+            <w:pPr>
               <w:keepNext w:val="false"/>
               <w:spacing w:after="0" w:before="0"/>
             </w:pPr>
@@ -3830,7 +4482,7 @@
                 <w:sz w:val="20"/>
                 <w:szCs w:val="20"/>
               </w:rPr>
-              <w:t xml:space="preserve">TC-04.3</w:t>
+              <w:t xml:space="preserve">TC-04.4</w:t>
             </w:r>
           </w:p>
         </w:tc>
@@ -3862,7 +4514,25 @@
                 <w:sz w:val="20"/>
                 <w:szCs w:val="20"/>
               </w:rPr>
-              <w:t xml:space="preserve">Remove the pin and type only a location</w:t>
+              <w:t xml:space="preserve">Step 2: press </w:t>
+            </w:r>
+            <w:r>
+              <w:rPr>
+                <w:rFonts w:ascii="Calibri" w:cs="Calibri" w:eastAsia="Calibri" w:hAnsi="Calibri"/>
+                <w:b/>
+                <w:bCs/>
+                <w:sz w:val="20"/>
+                <w:szCs w:val="20"/>
+              </w:rPr>
+              <w:t xml:space="preserve">Expand map</w:t>
+            </w:r>
+            <w:r>
+              <w:rPr>
+                <w:rFonts w:ascii="Calibri" w:cs="Calibri" w:eastAsia="Calibri" w:hAnsi="Calibri"/>
+                <w:sz w:val="20"/>
+                <w:szCs w:val="20"/>
+              </w:rPr>
+              <w:t xml:space="preserve"> (bottom-left), drag the map under the pin, Use this location; repeat with Cancel (#46)</w:t>
             </w:r>
           </w:p>
         </w:tc>
@@ -3894,7 +4564,7 @@
                 <w:sz w:val="20"/>
                 <w:szCs w:val="20"/>
               </w:rPr>
-              <w:t xml:space="preserve">Report submits without coordinates (location text is required, pin is optional)</w:t>
+              <w:t xml:space="preserve">Full-screen "Move the pin" view; Use this location moves the pin and refills the address; Cancel keeps the old pin</w:t>
             </w:r>
           </w:p>
         </w:tc>
@@ -5999,7 +6669,7 @@
           </w:tcPr>
           <w:p>
             <w:pPr>
-              <w:keepNext w:val="false"/>
+              <w:keepNext/>
               <w:spacing w:after="0" w:before="0"/>
             </w:pPr>
             <w:r>
@@ -6031,7 +6701,7 @@
           </w:tcPr>
           <w:p>
             <w:pPr>
-              <w:keepNext w:val="false"/>
+              <w:keepNext/>
               <w:spacing w:after="0" w:before="0"/>
             </w:pPr>
             <w:r>
@@ -6071,6 +6741,428 @@
           </w:tcPr>
           <w:p>
             <w:pPr>
+              <w:keepNext/>
+              <w:spacing w:after="0" w:before="0"/>
+            </w:pPr>
+            <w:r>
+              <w:rPr>
+                <w:rFonts w:ascii="Calibri" w:cs="Calibri" w:eastAsia="Calibri" w:hAnsi="Calibri"/>
+                <w:sz w:val="20"/>
+                <w:szCs w:val="20"/>
+              </w:rPr>
+              <w:t xml:space="preserve">"Report not found" state, no crash</w:t>
+            </w:r>
+          </w:p>
+        </w:tc>
+        <w:tc>
+          <w:tcPr>
+            <w:tcW w:type="dxa" w:w="4900"/>
+            <w:tcBorders>
+              <w:top w:val="single" w:color="B8C2D0" w:sz="4"/>
+              <w:left w:val="single" w:color="B8C2D0" w:sz="4"/>
+              <w:bottom w:val="single" w:color="B8C2D0" w:sz="4"/>
+              <w:right w:val="single" w:color="B8C2D0" w:sz="4"/>
+            </w:tcBorders>
+            <w:tcMar>
+              <w:top w:type="dxa" w:w="60"/>
+              <w:left w:type="dxa" w:w="100"/>
+              <w:bottom w:type="dxa" w:w="60"/>
+              <w:right w:type="dxa" w:w="100"/>
+            </w:tcMar>
+            <w:vAlign w:val="top"/>
+          </w:tcPr>
+          <w:p>
+            <w:pPr>
+              <w:keepNext/>
+              <w:spacing w:after="0" w:before="0"/>
+            </w:pPr>
+          </w:p>
+        </w:tc>
+        <w:tc>
+          <w:tcPr>
+            <w:tcW w:type="dxa" w:w="1520"/>
+            <w:tcBorders>
+              <w:top w:val="single" w:color="B8C2D0" w:sz="4"/>
+              <w:left w:val="single" w:color="B8C2D0" w:sz="4"/>
+              <w:bottom w:val="single" w:color="B8C2D0" w:sz="4"/>
+              <w:right w:val="single" w:color="B8C2D0" w:sz="4"/>
+            </w:tcBorders>
+            <w:tcMar>
+              <w:top w:type="dxa" w:w="60"/>
+              <w:left w:type="dxa" w:w="100"/>
+              <w:bottom w:type="dxa" w:w="60"/>
+              <w:right w:type="dxa" w:w="100"/>
+            </w:tcMar>
+            <w:vAlign w:val="top"/>
+          </w:tcPr>
+          <w:p>
+            <w:pPr>
+              <w:keepNext/>
+              <w:spacing w:after="0" w:before="0"/>
+            </w:pPr>
+          </w:p>
+        </w:tc>
+      </w:tr>
+      <w:tr>
+        <w:trPr>
+          <w:cantSplit/>
+          <w:trHeight w:val="650" w:hRule="atLeast"/>
+        </w:trPr>
+        <w:tc>
+          <w:tcPr>
+            <w:tcW w:type="dxa" w:w="1300"/>
+            <w:tcBorders>
+              <w:top w:val="single" w:color="B8C2D0" w:sz="4"/>
+              <w:left w:val="single" w:color="B8C2D0" w:sz="4"/>
+              <w:bottom w:val="single" w:color="B8C2D0" w:sz="4"/>
+              <w:right w:val="single" w:color="B8C2D0" w:sz="4"/>
+            </w:tcBorders>
+            <w:tcMar>
+              <w:top w:type="dxa" w:w="60"/>
+              <w:left w:type="dxa" w:w="100"/>
+              <w:bottom w:type="dxa" w:w="60"/>
+              <w:right w:type="dxa" w:w="100"/>
+            </w:tcMar>
+            <w:vAlign w:val="top"/>
+          </w:tcPr>
+          <w:p>
+            <w:pPr>
+              <w:keepNext/>
+              <w:spacing w:after="0" w:before="0"/>
+            </w:pPr>
+            <w:r>
+              <w:rPr>
+                <w:rFonts w:ascii="Calibri" w:cs="Calibri" w:eastAsia="Calibri" w:hAnsi="Calibri"/>
+                <w:sz w:val="20"/>
+                <w:szCs w:val="20"/>
+              </w:rPr>
+              <w:t xml:space="preserve">TC-07.4</w:t>
+            </w:r>
+          </w:p>
+        </w:tc>
+        <w:tc>
+          <w:tcPr>
+            <w:tcW w:type="dxa" w:w="5500"/>
+            <w:tcBorders>
+              <w:top w:val="single" w:color="B8C2D0" w:sz="4"/>
+              <w:left w:val="single" w:color="B8C2D0" w:sz="4"/>
+              <w:bottom w:val="single" w:color="B8C2D0" w:sz="4"/>
+              <w:right w:val="single" w:color="B8C2D0" w:sz="4"/>
+            </w:tcBorders>
+            <w:tcMar>
+              <w:top w:type="dxa" w:w="60"/>
+              <w:left w:type="dxa" w:w="100"/>
+              <w:bottom w:type="dxa" w:w="60"/>
+              <w:right w:type="dxa" w:w="100"/>
+            </w:tcMar>
+            <w:vAlign w:val="top"/>
+          </w:tcPr>
+          <w:p>
+            <w:pPr>
+              <w:keepNext/>
+              <w:spacing w:after="0" w:before="0"/>
+            </w:pPr>
+            <w:r>
+              <w:rPr>
+                <w:rFonts w:ascii="Calibri" w:cs="Calibri" w:eastAsia="Calibri" w:hAnsi="Calibri"/>
+                <w:sz w:val="20"/>
+                <w:szCs w:val="20"/>
+              </w:rPr>
+              <w:t xml:space="preserve">W4: press the main photo; use the arrows, the arrow keys, + and −, then Esc. Press </w:t>
+            </w:r>
+            <w:r>
+              <w:rPr>
+                <w:rFonts w:ascii="Calibri" w:cs="Calibri" w:eastAsia="Calibri" w:hAnsi="Calibri"/>
+                <w:b/>
+                <w:bCs/>
+                <w:sz w:val="20"/>
+                <w:szCs w:val="20"/>
+              </w:rPr>
+              <w:t xml:space="preserve">Expand map</w:t>
+            </w:r>
+            <w:r>
+              <w:rPr>
+                <w:rFonts w:ascii="Calibri" w:cs="Calibri" w:eastAsia="Calibri" w:hAnsi="Calibri"/>
+                <w:sz w:val="20"/>
+                <w:szCs w:val="20"/>
+              </w:rPr>
+              <w:t xml:space="preserve"> (#46)</w:t>
+            </w:r>
+          </w:p>
+        </w:tc>
+        <w:tc>
+          <w:tcPr>
+            <w:tcW w:type="dxa" w:w="5500"/>
+            <w:tcBorders>
+              <w:top w:val="single" w:color="B8C2D0" w:sz="4"/>
+              <w:left w:val="single" w:color="B8C2D0" w:sz="4"/>
+              <w:bottom w:val="single" w:color="B8C2D0" w:sz="4"/>
+              <w:right w:val="single" w:color="B8C2D0" w:sz="4"/>
+            </w:tcBorders>
+            <w:tcMar>
+              <w:top w:type="dxa" w:w="60"/>
+              <w:left w:type="dxa" w:w="100"/>
+              <w:bottom w:type="dxa" w:w="60"/>
+              <w:right w:type="dxa" w:w="100"/>
+            </w:tcMar>
+            <w:vAlign w:val="top"/>
+          </w:tcPr>
+          <w:p>
+            <w:pPr>
+              <w:keepNext/>
+              <w:spacing w:after="0" w:before="0"/>
+            </w:pPr>
+            <w:r>
+              <w:rPr>
+                <w:rFonts w:ascii="Calibri" w:cs="Calibri" w:eastAsia="Calibri" w:hAnsi="Calibri"/>
+                <w:sz w:val="20"/>
+                <w:szCs w:val="20"/>
+              </w:rPr>
+              <w:t xml:space="preserve">Full-screen photo viewer "Photo 2 of 3", uncropped, zoom works, no download button, Esc closes and focus returns; full-screen map with Close</w:t>
+            </w:r>
+          </w:p>
+        </w:tc>
+        <w:tc>
+          <w:tcPr>
+            <w:tcW w:type="dxa" w:w="4900"/>
+            <w:tcBorders>
+              <w:top w:val="single" w:color="B8C2D0" w:sz="4"/>
+              <w:left w:val="single" w:color="B8C2D0" w:sz="4"/>
+              <w:bottom w:val="single" w:color="B8C2D0" w:sz="4"/>
+              <w:right w:val="single" w:color="B8C2D0" w:sz="4"/>
+            </w:tcBorders>
+            <w:tcMar>
+              <w:top w:type="dxa" w:w="60"/>
+              <w:left w:type="dxa" w:w="100"/>
+              <w:bottom w:type="dxa" w:w="60"/>
+              <w:right w:type="dxa" w:w="100"/>
+            </w:tcMar>
+            <w:vAlign w:val="top"/>
+          </w:tcPr>
+          <w:p>
+            <w:pPr>
+              <w:keepNext/>
+              <w:spacing w:after="0" w:before="0"/>
+            </w:pPr>
+          </w:p>
+        </w:tc>
+        <w:tc>
+          <w:tcPr>
+            <w:tcW w:type="dxa" w:w="1520"/>
+            <w:tcBorders>
+              <w:top w:val="single" w:color="B8C2D0" w:sz="4"/>
+              <w:left w:val="single" w:color="B8C2D0" w:sz="4"/>
+              <w:bottom w:val="single" w:color="B8C2D0" w:sz="4"/>
+              <w:right w:val="single" w:color="B8C2D0" w:sz="4"/>
+            </w:tcBorders>
+            <w:tcMar>
+              <w:top w:type="dxa" w:w="60"/>
+              <w:left w:type="dxa" w:w="100"/>
+              <w:bottom w:type="dxa" w:w="60"/>
+              <w:right w:type="dxa" w:w="100"/>
+            </w:tcMar>
+            <w:vAlign w:val="top"/>
+          </w:tcPr>
+          <w:p>
+            <w:pPr>
+              <w:keepNext/>
+              <w:spacing w:after="0" w:before="0"/>
+            </w:pPr>
+          </w:p>
+        </w:tc>
+      </w:tr>
+      <w:tr>
+        <w:trPr>
+          <w:cantSplit/>
+          <w:trHeight w:val="650" w:hRule="atLeast"/>
+        </w:trPr>
+        <w:tc>
+          <w:tcPr>
+            <w:tcW w:type="dxa" w:w="1300"/>
+            <w:tcBorders>
+              <w:top w:val="single" w:color="B8C2D0" w:sz="4"/>
+              <w:left w:val="single" w:color="B8C2D0" w:sz="4"/>
+              <w:bottom w:val="single" w:color="B8C2D0" w:sz="4"/>
+              <w:right w:val="single" w:color="B8C2D0" w:sz="4"/>
+            </w:tcBorders>
+            <w:tcMar>
+              <w:top w:type="dxa" w:w="60"/>
+              <w:left w:type="dxa" w:w="100"/>
+              <w:bottom w:type="dxa" w:w="60"/>
+              <w:right w:type="dxa" w:w="100"/>
+            </w:tcMar>
+            <w:vAlign w:val="top"/>
+          </w:tcPr>
+          <w:p>
+            <w:pPr>
+              <w:keepNext/>
+              <w:spacing w:after="0" w:before="0"/>
+            </w:pPr>
+            <w:r>
+              <w:rPr>
+                <w:rFonts w:ascii="Calibri" w:cs="Calibri" w:eastAsia="Calibri" w:hAnsi="Calibri"/>
+                <w:sz w:val="20"/>
+                <w:szCs w:val="20"/>
+              </w:rPr>
+              <w:t xml:space="preserve">TC-07.5</w:t>
+            </w:r>
+          </w:p>
+        </w:tc>
+        <w:tc>
+          <w:tcPr>
+            <w:tcW w:type="dxa" w:w="5500"/>
+            <w:tcBorders>
+              <w:top w:val="single" w:color="B8C2D0" w:sz="4"/>
+              <w:left w:val="single" w:color="B8C2D0" w:sz="4"/>
+              <w:bottom w:val="single" w:color="B8C2D0" w:sz="4"/>
+              <w:right w:val="single" w:color="B8C2D0" w:sz="4"/>
+            </w:tcBorders>
+            <w:tcMar>
+              <w:top w:type="dxa" w:w="60"/>
+              <w:left w:type="dxa" w:w="100"/>
+              <w:bottom w:type="dxa" w:w="60"/>
+              <w:right w:type="dxa" w:w="100"/>
+            </w:tcMar>
+            <w:vAlign w:val="top"/>
+          </w:tcPr>
+          <w:p>
+            <w:pPr>
+              <w:keepNext/>
+              <w:spacing w:after="0" w:before="0"/>
+            </w:pPr>
+            <w:r>
+              <w:rPr>
+                <w:rFonts w:ascii="Calibri" w:cs="Calibri" w:eastAsia="Calibri" w:hAnsi="Calibri"/>
+                <w:sz w:val="20"/>
+                <w:szCs w:val="20"/>
+              </w:rPr>
+              <w:t xml:space="preserve">Mobile tracking (R1) and officer details (O1): tap a photo, swipe; press Expand map (#46)</w:t>
+            </w:r>
+          </w:p>
+        </w:tc>
+        <w:tc>
+          <w:tcPr>
+            <w:tcW w:type="dxa" w:w="5500"/>
+            <w:tcBorders>
+              <w:top w:val="single" w:color="B8C2D0" w:sz="4"/>
+              <w:left w:val="single" w:color="B8C2D0" w:sz="4"/>
+              <w:bottom w:val="single" w:color="B8C2D0" w:sz="4"/>
+              <w:right w:val="single" w:color="B8C2D0" w:sz="4"/>
+            </w:tcBorders>
+            <w:tcMar>
+              <w:top w:type="dxa" w:w="60"/>
+              <w:left w:type="dxa" w:w="100"/>
+              <w:bottom w:type="dxa" w:w="60"/>
+              <w:right w:type="dxa" w:w="100"/>
+            </w:tcMar>
+            <w:vAlign w:val="top"/>
+          </w:tcPr>
+          <w:p>
+            <w:pPr>
+              <w:keepNext/>
+              <w:spacing w:after="0" w:before="0"/>
+            </w:pPr>
+            <w:r>
+              <w:rPr>
+                <w:rFonts w:ascii="Calibri" w:cs="Calibri" w:eastAsia="Calibri" w:hAnsi="Calibri"/>
+                <w:sz w:val="20"/>
+                <w:szCs w:val="20"/>
+              </w:rPr>
+              <w:t xml:space="preserve">Photo viewer with swipe and pinch/double-tap zoom; full-screen map with the address (officer view keeps </w:t>
+            </w:r>
+            <w:r>
+              <w:rPr>
+                <w:rFonts w:ascii="Calibri" w:cs="Calibri" w:eastAsia="Calibri" w:hAnsi="Calibri"/>
+                <w:b/>
+                <w:bCs/>
+                <w:sz w:val="20"/>
+                <w:szCs w:val="20"/>
+              </w:rPr>
+              <w:t xml:space="preserve">Open in Maps</w:t>
+            </w:r>
+            <w:r>
+              <w:rPr>
+                <w:rFonts w:ascii="Calibri" w:cs="Calibri" w:eastAsia="Calibri" w:hAnsi="Calibri"/>
+                <w:sz w:val="20"/>
+                <w:szCs w:val="20"/>
+              </w:rPr>
+              <w:t xml:space="preserve">)</w:t>
+            </w:r>
+          </w:p>
+        </w:tc>
+        <w:tc>
+          <w:tcPr>
+            <w:tcW w:type="dxa" w:w="4900"/>
+            <w:tcBorders>
+              <w:top w:val="single" w:color="B8C2D0" w:sz="4"/>
+              <w:left w:val="single" w:color="B8C2D0" w:sz="4"/>
+              <w:bottom w:val="single" w:color="B8C2D0" w:sz="4"/>
+              <w:right w:val="single" w:color="B8C2D0" w:sz="4"/>
+            </w:tcBorders>
+            <w:tcMar>
+              <w:top w:type="dxa" w:w="60"/>
+              <w:left w:type="dxa" w:w="100"/>
+              <w:bottom w:type="dxa" w:w="60"/>
+              <w:right w:type="dxa" w:w="100"/>
+            </w:tcMar>
+            <w:vAlign w:val="top"/>
+          </w:tcPr>
+          <w:p>
+            <w:pPr>
+              <w:keepNext/>
+              <w:spacing w:after="0" w:before="0"/>
+            </w:pPr>
+          </w:p>
+        </w:tc>
+        <w:tc>
+          <w:tcPr>
+            <w:tcW w:type="dxa" w:w="1520"/>
+            <w:tcBorders>
+              <w:top w:val="single" w:color="B8C2D0" w:sz="4"/>
+              <w:left w:val="single" w:color="B8C2D0" w:sz="4"/>
+              <w:bottom w:val="single" w:color="B8C2D0" w:sz="4"/>
+              <w:right w:val="single" w:color="B8C2D0" w:sz="4"/>
+            </w:tcBorders>
+            <w:tcMar>
+              <w:top w:type="dxa" w:w="60"/>
+              <w:left w:type="dxa" w:w="100"/>
+              <w:bottom w:type="dxa" w:w="60"/>
+              <w:right w:type="dxa" w:w="100"/>
+            </w:tcMar>
+            <w:vAlign w:val="top"/>
+          </w:tcPr>
+          <w:p>
+            <w:pPr>
+              <w:keepNext/>
+              <w:spacing w:after="0" w:before="0"/>
+            </w:pPr>
+          </w:p>
+        </w:tc>
+      </w:tr>
+      <w:tr>
+        <w:trPr>
+          <w:cantSplit/>
+          <w:trHeight w:val="650" w:hRule="atLeast"/>
+        </w:trPr>
+        <w:tc>
+          <w:tcPr>
+            <w:tcW w:type="dxa" w:w="1300"/>
+            <w:tcBorders>
+              <w:top w:val="single" w:color="B8C2D0" w:sz="4"/>
+              <w:left w:val="single" w:color="B8C2D0" w:sz="4"/>
+              <w:bottom w:val="single" w:color="B8C2D0" w:sz="4"/>
+              <w:right w:val="single" w:color="B8C2D0" w:sz="4"/>
+            </w:tcBorders>
+            <w:tcMar>
+              <w:top w:type="dxa" w:w="60"/>
+              <w:left w:type="dxa" w:w="100"/>
+              <w:bottom w:type="dxa" w:w="60"/>
+              <w:right w:type="dxa" w:w="100"/>
+            </w:tcMar>
+            <w:vAlign w:val="top"/>
+          </w:tcPr>
+          <w:p>
+            <w:pPr>
               <w:keepNext w:val="false"/>
               <w:spacing w:after="0" w:before="0"/>
             </w:pPr>
@@ -6080,7 +7172,71 @@
                 <w:sz w:val="20"/>
                 <w:szCs w:val="20"/>
               </w:rPr>
-              <w:t xml:space="preserve">"Report not found" state, no crash</w:t>
+              <w:t xml:space="preserve">TC-07.6</w:t>
+            </w:r>
+          </w:p>
+        </w:tc>
+        <w:tc>
+          <w:tcPr>
+            <w:tcW w:type="dxa" w:w="5500"/>
+            <w:tcBorders>
+              <w:top w:val="single" w:color="B8C2D0" w:sz="4"/>
+              <w:left w:val="single" w:color="B8C2D0" w:sz="4"/>
+              <w:bottom w:val="single" w:color="B8C2D0" w:sz="4"/>
+              <w:right w:val="single" w:color="B8C2D0" w:sz="4"/>
+            </w:tcBorders>
+            <w:tcMar>
+              <w:top w:type="dxa" w:w="60"/>
+              <w:left w:type="dxa" w:w="100"/>
+              <w:bottom w:type="dxa" w:w="60"/>
+              <w:right w:type="dxa" w:w="100"/>
+            </w:tcMar>
+            <w:vAlign w:val="top"/>
+          </w:tcPr>
+          <w:p>
+            <w:pPr>
+              <w:keepNext w:val="false"/>
+              <w:spacing w:after="0" w:before="0"/>
+            </w:pPr>
+            <w:r>
+              <w:rPr>
+                <w:rFonts w:ascii="Calibri" w:cs="Calibri" w:eastAsia="Calibri" w:hAnsi="Calibri"/>
+                <w:sz w:val="20"/>
+                <w:szCs w:val="20"/>
+              </w:rPr>
+              <w:t xml:space="preserve">Landing "Public road updates" and W2 "Accident hotspots": press Expand map (#46)</w:t>
+            </w:r>
+          </w:p>
+        </w:tc>
+        <w:tc>
+          <w:tcPr>
+            <w:tcW w:type="dxa" w:w="5500"/>
+            <w:tcBorders>
+              <w:top w:val="single" w:color="B8C2D0" w:sz="4"/>
+              <w:left w:val="single" w:color="B8C2D0" w:sz="4"/>
+              <w:bottom w:val="single" w:color="B8C2D0" w:sz="4"/>
+              <w:right w:val="single" w:color="B8C2D0" w:sz="4"/>
+            </w:tcBorders>
+            <w:tcMar>
+              <w:top w:type="dxa" w:w="60"/>
+              <w:left w:type="dxa" w:w="100"/>
+              <w:bottom w:type="dxa" w:w="60"/>
+              <w:right w:type="dxa" w:w="100"/>
+            </w:tcMar>
+            <w:vAlign w:val="top"/>
+          </w:tcPr>
+          <w:p>
+            <w:pPr>
+              <w:keepNext w:val="false"/>
+              <w:spacing w:after="0" w:before="0"/>
+            </w:pPr>
+            <w:r>
+              <w:rPr>
+                <w:rFonts w:ascii="Calibri" w:cs="Calibri" w:eastAsia="Calibri" w:hAnsi="Calibri"/>
+                <w:sz w:val="20"/>
+                <w:szCs w:val="20"/>
+              </w:rPr>
+              <w:t xml:space="preserve">Full-screen map with the list beside it (text alternative); Close or Esc returns</w:t>
             </w:r>
           </w:p>
         </w:tc>
@@ -10735,6 +11891,156 @@
           </w:tcPr>
           <w:p>
             <w:pPr>
+              <w:keepNext/>
+              <w:spacing w:after="0" w:before="0"/>
+            </w:pPr>
+            <w:r>
+              <w:rPr>
+                <w:rFonts w:ascii="Calibri" w:cs="Calibri" w:eastAsia="Calibri" w:hAnsi="Calibri"/>
+                <w:sz w:val="20"/>
+                <w:szCs w:val="20"/>
+              </w:rPr>
+              <w:t xml:space="preserve">TC-13.5</w:t>
+            </w:r>
+          </w:p>
+        </w:tc>
+        <w:tc>
+          <w:tcPr>
+            <w:tcW w:type="dxa" w:w="5500"/>
+            <w:tcBorders>
+              <w:top w:val="single" w:color="B8C2D0" w:sz="4"/>
+              <w:left w:val="single" w:color="B8C2D0" w:sz="4"/>
+              <w:bottom w:val="single" w:color="B8C2D0" w:sz="4"/>
+              <w:right w:val="single" w:color="B8C2D0" w:sz="4"/>
+            </w:tcBorders>
+            <w:tcMar>
+              <w:top w:type="dxa" w:w="60"/>
+              <w:left w:type="dxa" w:w="100"/>
+              <w:bottom w:type="dxa" w:w="60"/>
+              <w:right w:type="dxa" w:w="100"/>
+            </w:tcMar>
+            <w:vAlign w:val="top"/>
+          </w:tcPr>
+          <w:p>
+            <w:pPr>
+              <w:keepNext/>
+              <w:spacing w:after="0" w:before="0"/>
+            </w:pPr>
+            <w:r>
+              <w:rPr>
+                <w:rFonts w:ascii="Calibri" w:cs="Calibri" w:eastAsia="Calibri" w:hAnsi="Calibri"/>
+                <w:sz w:val="20"/>
+                <w:szCs w:val="20"/>
+              </w:rPr>
+              <w:t xml:space="preserve">A1 tries to deactivate or change the role of A1's own account</w:t>
+            </w:r>
+          </w:p>
+        </w:tc>
+        <w:tc>
+          <w:tcPr>
+            <w:tcW w:type="dxa" w:w="5500"/>
+            <w:tcBorders>
+              <w:top w:val="single" w:color="B8C2D0" w:sz="4"/>
+              <w:left w:val="single" w:color="B8C2D0" w:sz="4"/>
+              <w:bottom w:val="single" w:color="B8C2D0" w:sz="4"/>
+              <w:right w:val="single" w:color="B8C2D0" w:sz="4"/>
+            </w:tcBorders>
+            <w:tcMar>
+              <w:top w:type="dxa" w:w="60"/>
+              <w:left w:type="dxa" w:w="100"/>
+              <w:bottom w:type="dxa" w:w="60"/>
+              <w:right w:type="dxa" w:w="100"/>
+            </w:tcMar>
+            <w:vAlign w:val="top"/>
+          </w:tcPr>
+          <w:p>
+            <w:pPr>
+              <w:keepNext/>
+              <w:spacing w:after="0" w:before="0"/>
+            </w:pPr>
+            <w:r>
+              <w:rPr>
+                <w:rFonts w:ascii="Calibri" w:cs="Calibri" w:eastAsia="Calibri" w:hAnsi="Calibri"/>
+                <w:sz w:val="20"/>
+                <w:szCs w:val="20"/>
+              </w:rPr>
+              <w:t xml:space="preserve">Not offered in the UI ("You can't deactivate your own account"); the API refuses it too</w:t>
+            </w:r>
+          </w:p>
+        </w:tc>
+        <w:tc>
+          <w:tcPr>
+            <w:tcW w:type="dxa" w:w="4900"/>
+            <w:tcBorders>
+              <w:top w:val="single" w:color="B8C2D0" w:sz="4"/>
+              <w:left w:val="single" w:color="B8C2D0" w:sz="4"/>
+              <w:bottom w:val="single" w:color="B8C2D0" w:sz="4"/>
+              <w:right w:val="single" w:color="B8C2D0" w:sz="4"/>
+            </w:tcBorders>
+            <w:tcMar>
+              <w:top w:type="dxa" w:w="60"/>
+              <w:left w:type="dxa" w:w="100"/>
+              <w:bottom w:type="dxa" w:w="60"/>
+              <w:right w:type="dxa" w:w="100"/>
+            </w:tcMar>
+            <w:vAlign w:val="top"/>
+          </w:tcPr>
+          <w:p>
+            <w:pPr>
+              <w:keepNext/>
+              <w:spacing w:after="0" w:before="0"/>
+            </w:pPr>
+          </w:p>
+        </w:tc>
+        <w:tc>
+          <w:tcPr>
+            <w:tcW w:type="dxa" w:w="1520"/>
+            <w:tcBorders>
+              <w:top w:val="single" w:color="B8C2D0" w:sz="4"/>
+              <w:left w:val="single" w:color="B8C2D0" w:sz="4"/>
+              <w:bottom w:val="single" w:color="B8C2D0" w:sz="4"/>
+              <w:right w:val="single" w:color="B8C2D0" w:sz="4"/>
+            </w:tcBorders>
+            <w:tcMar>
+              <w:top w:type="dxa" w:w="60"/>
+              <w:left w:type="dxa" w:w="100"/>
+              <w:bottom w:type="dxa" w:w="60"/>
+              <w:right w:type="dxa" w:w="100"/>
+            </w:tcMar>
+            <w:vAlign w:val="top"/>
+          </w:tcPr>
+          <w:p>
+            <w:pPr>
+              <w:keepNext/>
+              <w:spacing w:after="0" w:before="0"/>
+            </w:pPr>
+          </w:p>
+        </w:tc>
+      </w:tr>
+      <w:tr>
+        <w:trPr>
+          <w:cantSplit/>
+          <w:trHeight w:val="650" w:hRule="atLeast"/>
+        </w:trPr>
+        <w:tc>
+          <w:tcPr>
+            <w:tcW w:type="dxa" w:w="1300"/>
+            <w:tcBorders>
+              <w:top w:val="single" w:color="B8C2D0" w:sz="4"/>
+              <w:left w:val="single" w:color="B8C2D0" w:sz="4"/>
+              <w:bottom w:val="single" w:color="B8C2D0" w:sz="4"/>
+              <w:right w:val="single" w:color="B8C2D0" w:sz="4"/>
+            </w:tcBorders>
+            <w:tcMar>
+              <w:top w:type="dxa" w:w="60"/>
+              <w:left w:type="dxa" w:w="100"/>
+              <w:bottom w:type="dxa" w:w="60"/>
+              <w:right w:type="dxa" w:w="100"/>
+            </w:tcMar>
+            <w:vAlign w:val="top"/>
+          </w:tcPr>
+          <w:p>
+            <w:pPr>
               <w:keepNext w:val="false"/>
               <w:spacing w:after="0" w:before="0"/>
             </w:pPr>
@@ -10744,7 +12050,7 @@
                 <w:sz w:val="20"/>
                 <w:szCs w:val="20"/>
               </w:rPr>
-              <w:t xml:space="preserve">TC-13.5</w:t>
+              <w:t xml:space="preserve">TC-13.6</w:t>
             </w:r>
           </w:p>
         </w:tc>
@@ -10776,7 +12082,25 @@
                 <w:sz w:val="20"/>
                 <w:szCs w:val="20"/>
               </w:rPr>
-              <w:t xml:space="preserve">A1 tries to deactivate or change the role of A1's own account</w:t>
+              <w:t xml:space="preserve">A1: Users &gt; </w:t>
+            </w:r>
+            <w:r>
+              <w:rPr>
+                <w:rFonts w:ascii="Calibri" w:cs="Calibri" w:eastAsia="Calibri" w:hAnsi="Calibri"/>
+                <w:b/>
+                <w:bCs/>
+                <w:sz w:val="20"/>
+                <w:szCs w:val="20"/>
+              </w:rPr>
+              <w:t xml:space="preserve">Reset password</w:t>
+            </w:r>
+            <w:r>
+              <w:rPr>
+                <w:rFonts w:ascii="Calibri" w:cs="Calibri" w:eastAsia="Calibri" w:hAnsi="Calibri"/>
+                <w:sz w:val="20"/>
+                <w:szCs w:val="20"/>
+              </w:rPr>
+              <w:t xml:space="preserve"> on R2 (temporary password + confirm), then log in as R2 with it (#37)</w:t>
             </w:r>
           </w:p>
         </w:tc>
@@ -10808,7 +12132,7 @@
                 <w:sz w:val="20"/>
                 <w:szCs w:val="20"/>
               </w:rPr>
-              <w:t xml:space="preserve">Not offered in the UI ("You can't deactivate your own account"); the API refuses it too</w:t>
+              <w:t xml:space="preserve">"Password reset" toast; R2 gets an email that the password was reset (without the password); R2 logs in with the temporary password; not offered on A1's own row or other administrators</w:t>
             </w:r>
           </w:p>
         </w:tc>

</xml_diff>

<commit_message>
docs: DECISIONS #47 (officer bell), CLAUDE.md without course details and refreshed status, architecture diagram redrawn for the real stack, Word test plan regenerated, Figma index and re-exported screens
</commit_message>
<xml_diff>
--- a/docs/RoadWatch-Test-Plan.docx
+++ b/docs/RoadWatch-Test-Plan.docx
@@ -1006,7 +1006,25 @@
                 <w:sz w:val="20"/>
                 <w:szCs w:val="20"/>
               </w:rPr>
-              <w:t xml:space="preserve">On the app: Create account, enter full name, a new email, password of 8+ characters, optional mobile number; submit</w:t>
+              <w:t xml:space="preserve">On the app: Create account, enter full name, a new email, a </w:t>
+            </w:r>
+            <w:r>
+              <w:rPr>
+                <w:rFonts w:ascii="Calibri" w:cs="Calibri" w:eastAsia="Calibri" w:hAnsi="Calibri"/>
+                <w:b/>
+                <w:bCs/>
+                <w:sz w:val="20"/>
+                <w:szCs w:val="20"/>
+              </w:rPr>
+              <w:t xml:space="preserve">Strong</w:t>
+            </w:r>
+            <w:r>
+              <w:rPr>
+                <w:rFonts w:ascii="Calibri" w:cs="Calibri" w:eastAsia="Calibri" w:hAnsi="Calibri"/>
+                <w:sz w:val="20"/>
+                <w:szCs w:val="20"/>
+              </w:rPr>
+              <w:t xml:space="preserve"> password (8+ with uppercase, lowercase, a number and a symbol), optional mobile number; submit</w:t>
             </w:r>
           </w:p>
         </w:tc>
@@ -1283,6 +1301,174 @@
           </w:tcPr>
           <w:p>
             <w:pPr>
+              <w:keepNext/>
+              <w:spacing w:after="0" w:before="0"/>
+            </w:pPr>
+            <w:r>
+              <w:rPr>
+                <w:rFonts w:ascii="Calibri" w:cs="Calibri" w:eastAsia="Calibri" w:hAnsi="Calibri"/>
+                <w:sz w:val="20"/>
+                <w:szCs w:val="20"/>
+              </w:rPr>
+              <w:t xml:space="preserve">TC-01.3</w:t>
+            </w:r>
+          </w:p>
+        </w:tc>
+        <w:tc>
+          <w:tcPr>
+            <w:tcW w:type="dxa" w:w="5500"/>
+            <w:tcBorders>
+              <w:top w:val="single" w:color="B8C2D0" w:sz="4"/>
+              <w:left w:val="single" w:color="B8C2D0" w:sz="4"/>
+              <w:bottom w:val="single" w:color="B8C2D0" w:sz="4"/>
+              <w:right w:val="single" w:color="B8C2D0" w:sz="4"/>
+            </w:tcBorders>
+            <w:tcMar>
+              <w:top w:type="dxa" w:w="60"/>
+              <w:left w:type="dxa" w:w="100"/>
+              <w:bottom w:type="dxa" w:w="60"/>
+              <w:right w:type="dxa" w:w="100"/>
+            </w:tcMar>
+            <w:vAlign w:val="top"/>
+          </w:tcPr>
+          <w:p>
+            <w:pPr>
+              <w:keepNext/>
+              <w:spacing w:after="0" w:before="0"/>
+            </w:pPr>
+            <w:r>
+              <w:rPr>
+                <w:rFonts w:ascii="Calibri" w:cs="Calibri" w:eastAsia="Calibri" w:hAnsi="Calibri"/>
+                <w:sz w:val="20"/>
+                <w:szCs w:val="20"/>
+              </w:rPr>
+              <w:t xml:space="preserve">Register with a 6-character password, then with an empty full name</w:t>
+            </w:r>
+          </w:p>
+        </w:tc>
+        <w:tc>
+          <w:tcPr>
+            <w:tcW w:type="dxa" w:w="5500"/>
+            <w:tcBorders>
+              <w:top w:val="single" w:color="B8C2D0" w:sz="4"/>
+              <w:left w:val="single" w:color="B8C2D0" w:sz="4"/>
+              <w:bottom w:val="single" w:color="B8C2D0" w:sz="4"/>
+              <w:right w:val="single" w:color="B8C2D0" w:sz="4"/>
+            </w:tcBorders>
+            <w:tcMar>
+              <w:top w:type="dxa" w:w="60"/>
+              <w:left w:type="dxa" w:w="100"/>
+              <w:bottom w:type="dxa" w:w="60"/>
+              <w:right w:type="dxa" w:w="100"/>
+            </w:tcMar>
+            <w:vAlign w:val="top"/>
+          </w:tcPr>
+          <w:p>
+            <w:pPr>
+              <w:keepNext/>
+              <w:spacing w:after="0" w:before="0"/>
+            </w:pPr>
+            <w:r>
+              <w:rPr>
+                <w:rFonts w:ascii="Calibri" w:cs="Calibri" w:eastAsia="Calibri" w:hAnsi="Calibri"/>
+                <w:sz w:val="20"/>
+                <w:szCs w:val="20"/>
+              </w:rPr>
+              <w:t xml:space="preserve">Field errors ("Make the password Strong to save it." with the meter at </w:t>
+            </w:r>
+            <w:r>
+              <w:rPr>
+                <w:rFonts w:ascii="Calibri" w:cs="Calibri" w:eastAsia="Calibri" w:hAnsi="Calibri"/>
+                <w:b/>
+                <w:bCs/>
+                <w:sz w:val="20"/>
+                <w:szCs w:val="20"/>
+              </w:rPr>
+              <w:t xml:space="preserve">Weak</w:t>
+            </w:r>
+            <w:r>
+              <w:rPr>
+                <w:rFonts w:ascii="Calibri" w:cs="Calibri" w:eastAsia="Calibri" w:hAnsi="Calibri"/>
+                <w:sz w:val="20"/>
+                <w:szCs w:val="20"/>
+              </w:rPr>
+              <w:t xml:space="preserve">, "Use at least 8 characters (6 so far)."; name required); nothing is sent until fixed</w:t>
+            </w:r>
+          </w:p>
+        </w:tc>
+        <w:tc>
+          <w:tcPr>
+            <w:tcW w:type="dxa" w:w="4900"/>
+            <w:tcBorders>
+              <w:top w:val="single" w:color="B8C2D0" w:sz="4"/>
+              <w:left w:val="single" w:color="B8C2D0" w:sz="4"/>
+              <w:bottom w:val="single" w:color="B8C2D0" w:sz="4"/>
+              <w:right w:val="single" w:color="B8C2D0" w:sz="4"/>
+            </w:tcBorders>
+            <w:tcMar>
+              <w:top w:type="dxa" w:w="60"/>
+              <w:left w:type="dxa" w:w="100"/>
+              <w:bottom w:type="dxa" w:w="60"/>
+              <w:right w:type="dxa" w:w="100"/>
+            </w:tcMar>
+            <w:vAlign w:val="top"/>
+          </w:tcPr>
+          <w:p>
+            <w:pPr>
+              <w:keepNext/>
+              <w:spacing w:after="0" w:before="0"/>
+            </w:pPr>
+          </w:p>
+        </w:tc>
+        <w:tc>
+          <w:tcPr>
+            <w:tcW w:type="dxa" w:w="1520"/>
+            <w:tcBorders>
+              <w:top w:val="single" w:color="B8C2D0" w:sz="4"/>
+              <w:left w:val="single" w:color="B8C2D0" w:sz="4"/>
+              <w:bottom w:val="single" w:color="B8C2D0" w:sz="4"/>
+              <w:right w:val="single" w:color="B8C2D0" w:sz="4"/>
+            </w:tcBorders>
+            <w:tcMar>
+              <w:top w:type="dxa" w:w="60"/>
+              <w:left w:type="dxa" w:w="100"/>
+              <w:bottom w:type="dxa" w:w="60"/>
+              <w:right w:type="dxa" w:w="100"/>
+            </w:tcMar>
+            <w:vAlign w:val="top"/>
+          </w:tcPr>
+          <w:p>
+            <w:pPr>
+              <w:keepNext/>
+              <w:spacing w:after="0" w:before="0"/>
+            </w:pPr>
+          </w:p>
+        </w:tc>
+      </w:tr>
+      <w:tr>
+        <w:trPr>
+          <w:cantSplit/>
+          <w:trHeight w:val="650" w:hRule="atLeast"/>
+        </w:trPr>
+        <w:tc>
+          <w:tcPr>
+            <w:tcW w:type="dxa" w:w="1300"/>
+            <w:tcBorders>
+              <w:top w:val="single" w:color="B8C2D0" w:sz="4"/>
+              <w:left w:val="single" w:color="B8C2D0" w:sz="4"/>
+              <w:bottom w:val="single" w:color="B8C2D0" w:sz="4"/>
+              <w:right w:val="single" w:color="B8C2D0" w:sz="4"/>
+            </w:tcBorders>
+            <w:tcMar>
+              <w:top w:type="dxa" w:w="60"/>
+              <w:left w:type="dxa" w:w="100"/>
+              <w:bottom w:type="dxa" w:w="60"/>
+              <w:right w:type="dxa" w:w="100"/>
+            </w:tcMar>
+            <w:vAlign w:val="top"/>
+          </w:tcPr>
+          <w:p>
+            <w:pPr>
               <w:keepNext w:val="false"/>
               <w:spacing w:after="0" w:before="0"/>
             </w:pPr>
@@ -1292,7 +1478,7 @@
                 <w:sz w:val="20"/>
                 <w:szCs w:val="20"/>
               </w:rPr>
-              <w:t xml:space="preserve">TC-01.3</w:t>
+              <w:t xml:space="preserve">TC-01.4</w:t>
             </w:r>
           </w:p>
         </w:tc>
@@ -1324,7 +1510,103 @@
                 <w:sz w:val="20"/>
                 <w:szCs w:val="20"/>
               </w:rPr>
-              <w:t xml:space="preserve">Register with a 6-character password, then with an empty full name</w:t>
+              <w:t xml:space="preserve">Type into the Register password, one step at a time: </w:t>
+            </w:r>
+            <w:r>
+              <w:rPr>
+                <w:rFonts w:ascii="Consolas" w:cs="Consolas" w:eastAsia="Consolas" w:hAnsi="Consolas"/>
+                <w:sz w:val="18"/>
+                <w:szCs w:val="18"/>
+              </w:rPr>
+              <w:t xml:space="preserve">Abc12!</w:t>
+            </w:r>
+            <w:r>
+              <w:rPr>
+                <w:rFonts w:ascii="Calibri" w:cs="Calibri" w:eastAsia="Calibri" w:hAnsi="Calibri"/>
+                <w:sz w:val="20"/>
+                <w:szCs w:val="20"/>
+              </w:rPr>
+              <w:t xml:space="preserve">, </w:t>
+            </w:r>
+            <w:r>
+              <w:rPr>
+                <w:rFonts w:ascii="Consolas" w:cs="Consolas" w:eastAsia="Consolas" w:hAnsi="Consolas"/>
+                <w:sz w:val="18"/>
+                <w:szCs w:val="18"/>
+              </w:rPr>
+              <w:t xml:space="preserve">Sunflower</w:t>
+            </w:r>
+            <w:r>
+              <w:rPr>
+                <w:rFonts w:ascii="Calibri" w:cs="Calibri" w:eastAsia="Calibri" w:hAnsi="Calibri"/>
+                <w:sz w:val="20"/>
+                <w:szCs w:val="20"/>
+              </w:rPr>
+              <w:t xml:space="preserve">, </w:t>
+            </w:r>
+            <w:r>
+              <w:rPr>
+                <w:rFonts w:ascii="Consolas" w:cs="Consolas" w:eastAsia="Consolas" w:hAnsi="Consolas"/>
+                <w:sz w:val="18"/>
+                <w:szCs w:val="18"/>
+              </w:rPr>
+              <w:t xml:space="preserve">Sunflower7</w:t>
+            </w:r>
+            <w:r>
+              <w:rPr>
+                <w:rFonts w:ascii="Calibri" w:cs="Calibri" w:eastAsia="Calibri" w:hAnsi="Calibri"/>
+                <w:sz w:val="20"/>
+                <w:szCs w:val="20"/>
+              </w:rPr>
+              <w:t xml:space="preserve">, </w:t>
+            </w:r>
+            <w:r>
+              <w:rPr>
+                <w:rFonts w:ascii="Consolas" w:cs="Consolas" w:eastAsia="Consolas" w:hAnsi="Consolas"/>
+                <w:sz w:val="18"/>
+                <w:szCs w:val="18"/>
+              </w:rPr>
+              <w:t xml:space="preserve">Sunflower7!</w:t>
+            </w:r>
+            <w:r>
+              <w:rPr>
+                <w:rFonts w:ascii="Calibri" w:cs="Calibri" w:eastAsia="Calibri" w:hAnsi="Calibri"/>
+                <w:sz w:val="20"/>
+                <w:szCs w:val="20"/>
+              </w:rPr>
+              <w:t xml:space="preserve">; then a password with your own name (e.g. </w:t>
+            </w:r>
+            <w:r>
+              <w:rPr>
+                <w:rFonts w:ascii="Consolas" w:cs="Consolas" w:eastAsia="Consolas" w:hAnsi="Consolas"/>
+                <w:sz w:val="18"/>
+                <w:szCs w:val="18"/>
+              </w:rPr>
+              <w:t xml:space="preserve">Juan#2026x</w:t>
+            </w:r>
+            <w:r>
+              <w:rPr>
+                <w:rFonts w:ascii="Calibri" w:cs="Calibri" w:eastAsia="Calibri" w:hAnsi="Calibri"/>
+                <w:sz w:val="20"/>
+                <w:szCs w:val="20"/>
+              </w:rPr>
+              <w:t xml:space="preserve"> for Juan Dela Cruz) and </w:t>
+            </w:r>
+            <w:r>
+              <w:rPr>
+                <w:rFonts w:ascii="Consolas" w:cs="Consolas" w:eastAsia="Consolas" w:hAnsi="Consolas"/>
+                <w:sz w:val="18"/>
+                <w:szCs w:val="18"/>
+              </w:rPr>
+              <w:t xml:space="preserve">Password1!</w:t>
+            </w:r>
+            <w:r>
+              <w:rPr>
+                <w:rFonts w:ascii="Calibri" w:cs="Calibri" w:eastAsia="Calibri" w:hAnsi="Calibri"/>
+                <w:sz w:val="20"/>
+                <w:szCs w:val="20"/>
+              </w:rPr>
+              <w:t xml:space="preserve"> (#44)</w:t>
             </w:r>
           </w:p>
         </w:tc>
@@ -1356,7 +1638,97 @@
                 <w:sz w:val="20"/>
                 <w:szCs w:val="20"/>
               </w:rPr>
-              <w:t xml:space="preserve">Field errors ("at least 8 characters", name required); nothing is sent until fixed</w:t>
+              <w:t xml:space="preserve">The meter shows 1 red segment </w:t>
+            </w:r>
+            <w:r>
+              <w:rPr>
+                <w:rFonts w:ascii="Calibri" w:cs="Calibri" w:eastAsia="Calibri" w:hAnsi="Calibri"/>
+                <w:b/>
+                <w:bCs/>
+                <w:sz w:val="20"/>
+                <w:szCs w:val="20"/>
+              </w:rPr>
+              <w:t xml:space="preserve">Weak</w:t>
+            </w:r>
+            <w:r>
+              <w:rPr>
+                <w:rFonts w:ascii="Calibri" w:cs="Calibri" w:eastAsia="Calibri" w:hAnsi="Calibri"/>
+                <w:sz w:val="20"/>
+                <w:szCs w:val="20"/>
+              </w:rPr>
+              <w:t xml:space="preserve">, 2 amber </w:t>
+            </w:r>
+            <w:r>
+              <w:rPr>
+                <w:rFonts w:ascii="Calibri" w:cs="Calibri" w:eastAsia="Calibri" w:hAnsi="Calibri"/>
+                <w:b/>
+                <w:bCs/>
+                <w:sz w:val="20"/>
+                <w:szCs w:val="20"/>
+              </w:rPr>
+              <w:t xml:space="preserve">Fair</w:t>
+            </w:r>
+            <w:r>
+              <w:rPr>
+                <w:rFonts w:ascii="Calibri" w:cs="Calibri" w:eastAsia="Calibri" w:hAnsi="Calibri"/>
+                <w:sz w:val="20"/>
+                <w:szCs w:val="20"/>
+              </w:rPr>
+              <w:t xml:space="preserve"> ("Add a number and a symbol"), 3 blue </w:t>
+            </w:r>
+            <w:r>
+              <w:rPr>
+                <w:rFonts w:ascii="Calibri" w:cs="Calibri" w:eastAsia="Calibri" w:hAnsi="Calibri"/>
+                <w:b/>
+                <w:bCs/>
+                <w:sz w:val="20"/>
+                <w:szCs w:val="20"/>
+              </w:rPr>
+              <w:t xml:space="preserve">Good</w:t>
+            </w:r>
+            <w:r>
+              <w:rPr>
+                <w:rFonts w:ascii="Calibri" w:cs="Calibri" w:eastAsia="Calibri" w:hAnsi="Calibri"/>
+                <w:sz w:val="20"/>
+                <w:szCs w:val="20"/>
+              </w:rPr>
+              <w:t xml:space="preserve"> ("Add a symbol, or use 12+ characters"), 4 green </w:t>
+            </w:r>
+            <w:r>
+              <w:rPr>
+                <w:rFonts w:ascii="Calibri" w:cs="Calibri" w:eastAsia="Calibri" w:hAnsi="Calibri"/>
+                <w:b/>
+                <w:bCs/>
+                <w:sz w:val="20"/>
+                <w:szCs w:val="20"/>
+              </w:rPr>
+              <w:t xml:space="preserve">Strong</w:t>
+            </w:r>
+            <w:r>
+              <w:rPr>
+                <w:rFonts w:ascii="Calibri" w:cs="Calibri" w:eastAsia="Calibri" w:hAnsi="Calibri"/>
+                <w:sz w:val="20"/>
+                <w:szCs w:val="20"/>
+              </w:rPr>
+              <w:t xml:space="preserve">; the name and the common password both show </w:t>
+            </w:r>
+            <w:r>
+              <w:rPr>
+                <w:rFonts w:ascii="Calibri" w:cs="Calibri" w:eastAsia="Calibri" w:hAnsi="Calibri"/>
+                <w:b/>
+                <w:bCs/>
+                <w:sz w:val="20"/>
+                <w:szCs w:val="20"/>
+              </w:rPr>
+              <w:t xml:space="preserve">Weak</w:t>
+            </w:r>
+            <w:r>
+              <w:rPr>
+                <w:rFonts w:ascii="Calibri" w:cs="Calibri" w:eastAsia="Calibri" w:hAnsi="Calibri"/>
+                <w:sz w:val="20"/>
+                <w:szCs w:val="20"/>
+              </w:rPr>
+              <w:t xml:space="preserve"> with a tip; only Strong can be saved; the level word is always shown next to the bar</w:t>
             </w:r>
           </w:p>
         </w:tc>
@@ -1994,7 +2366,7 @@
                 <w:sz w:val="20"/>
                 <w:szCs w:val="20"/>
               </w:rPr>
-              <w:t xml:space="preserve">Web: sign in as A1 at </w:t>
+              <w:t xml:space="preserve">Web: </w:t>
             </w:r>
             <w:r>
               <w:rPr>
@@ -2010,7 +2382,25 @@
                 <w:sz w:val="20"/>
                 <w:szCs w:val="20"/>
               </w:rPr>
-              <w:t xml:space="preserve">, then Log out (confirm dialog)</w:t>
+              <w:t xml:space="preserve"> &gt; </w:t>
+            </w:r>
+            <w:r>
+              <w:rPr>
+                <w:rFonts w:ascii="Calibri" w:cs="Calibri" w:eastAsia="Calibri" w:hAnsi="Calibri"/>
+                <w:b/>
+                <w:bCs/>
+                <w:sz w:val="20"/>
+                <w:szCs w:val="20"/>
+              </w:rPr>
+              <w:t xml:space="preserve">Administrator</w:t>
+            </w:r>
+            <w:r>
+              <w:rPr>
+                <w:rFonts w:ascii="Calibri" w:cs="Calibri" w:eastAsia="Calibri" w:hAnsi="Calibri"/>
+                <w:sz w:val="20"/>
+                <w:szCs w:val="20"/>
+              </w:rPr>
+              <w:t xml:space="preserve">, sign in as A1, then Log out (confirm dialog)</w:t>
             </w:r>
           </w:p>
         </w:tc>
@@ -2042,7 +2432,7 @@
                 <w:sz w:val="20"/>
                 <w:szCs w:val="20"/>
               </w:rPr>
-              <w:t xml:space="preserve">Dashboard opens; Log out lands on the Administrator sign-in page; opening </w:t>
+              <w:t xml:space="preserve">Dashboard opens; Log out lands on the Administrator sign-in form; opening </w:t>
             </w:r>
             <w:r>
               <w:rPr>
@@ -2058,7 +2448,7 @@
                 <w:sz w:val="20"/>
                 <w:szCs w:val="20"/>
               </w:rPr>
-              <w:t xml:space="preserve"> again also goes to sign-in</w:t>
+              <w:t xml:space="preserve"> again also goes to that form</w:t>
             </w:r>
           </w:p>
         </w:tc>
@@ -2176,7 +2566,7 @@
                 <w:sz w:val="20"/>
                 <w:szCs w:val="20"/>
               </w:rPr>
-              <w:t xml:space="preserve">Web: sign in as R1 (a reporter)</w:t>
+              <w:t xml:space="preserve">Web: sign in as R1 (a reporter) on either staff form</w:t>
             </w:r>
           </w:p>
         </w:tc>
@@ -2208,7 +2598,7 @@
                 <w:sz w:val="20"/>
                 <w:szCs w:val="20"/>
               </w:rPr>
-              <w:t xml:space="preserve">Refused with the "This account uses the mobile app" message and a </w:t>
+              <w:t xml:space="preserve">Refused with "This account uses the mobile app": "Reporter accounts sign in on the RoadWatch Android app." and a </w:t>
             </w:r>
             <w:r>
               <w:rPr>
@@ -2973,6 +3363,524 @@
           </w:tcPr>
           <w:p>
             <w:pPr>
+              <w:keepNext/>
+              <w:spacing w:after="0" w:before="0"/>
+            </w:pPr>
+            <w:r>
+              <w:rPr>
+                <w:rFonts w:ascii="Calibri" w:cs="Calibri" w:eastAsia="Calibri" w:hAnsi="Calibri"/>
+                <w:sz w:val="20"/>
+                <w:szCs w:val="20"/>
+              </w:rPr>
+              <w:t xml:space="preserve">TC-02.9</w:t>
+            </w:r>
+          </w:p>
+        </w:tc>
+        <w:tc>
+          <w:tcPr>
+            <w:tcW w:type="dxa" w:w="5500"/>
+            <w:tcBorders>
+              <w:top w:val="single" w:color="B8C2D0" w:sz="4"/>
+              <w:left w:val="single" w:color="B8C2D0" w:sz="4"/>
+              <w:bottom w:val="single" w:color="B8C2D0" w:sz="4"/>
+              <w:right w:val="single" w:color="B8C2D0" w:sz="4"/>
+            </w:tcBorders>
+            <w:tcMar>
+              <w:top w:type="dxa" w:w="60"/>
+              <w:left w:type="dxa" w:w="100"/>
+              <w:bottom w:type="dxa" w:w="60"/>
+              <w:right w:type="dxa" w:w="100"/>
+            </w:tcMar>
+            <w:vAlign w:val="top"/>
+          </w:tcPr>
+          <w:p>
+            <w:pPr>
+              <w:keepNext/>
+              <w:spacing w:after="0" w:before="0"/>
+            </w:pPr>
+            <w:r>
+              <w:rPr>
+                <w:rFonts w:ascii="Calibri" w:cs="Calibri" w:eastAsia="Calibri" w:hAnsi="Calibri"/>
+                <w:sz w:val="20"/>
+                <w:szCs w:val="20"/>
+              </w:rPr>
+              <w:t xml:space="preserve">Every password field (mobile Log in, Register, Change password, Forgot password; web sign-in, Change password, Create officer, Reset password): press the eye (#45)</w:t>
+            </w:r>
+          </w:p>
+        </w:tc>
+        <w:tc>
+          <w:tcPr>
+            <w:tcW w:type="dxa" w:w="5500"/>
+            <w:tcBorders>
+              <w:top w:val="single" w:color="B8C2D0" w:sz="4"/>
+              <w:left w:val="single" w:color="B8C2D0" w:sz="4"/>
+              <w:bottom w:val="single" w:color="B8C2D0" w:sz="4"/>
+              <w:right w:val="single" w:color="B8C2D0" w:sz="4"/>
+            </w:tcBorders>
+            <w:tcMar>
+              <w:top w:type="dxa" w:w="60"/>
+              <w:left w:type="dxa" w:w="100"/>
+              <w:bottom w:type="dxa" w:w="60"/>
+              <w:right w:type="dxa" w:w="100"/>
+            </w:tcMar>
+            <w:vAlign w:val="top"/>
+          </w:tcPr>
+          <w:p>
+            <w:pPr>
+              <w:keepNext/>
+              <w:spacing w:after="0" w:before="0"/>
+            </w:pPr>
+            <w:r>
+              <w:rPr>
+                <w:rFonts w:ascii="Calibri" w:cs="Calibri" w:eastAsia="Calibri" w:hAnsi="Calibri"/>
+                <w:sz w:val="20"/>
+                <w:szCs w:val="20"/>
+              </w:rPr>
+              <w:t xml:space="preserve">The password shows and the icon becomes the crossed eye; it stays shown until pressed again; screen readers hear "Show password" / "Hide password"</w:t>
+            </w:r>
+          </w:p>
+        </w:tc>
+        <w:tc>
+          <w:tcPr>
+            <w:tcW w:type="dxa" w:w="4900"/>
+            <w:tcBorders>
+              <w:top w:val="single" w:color="B8C2D0" w:sz="4"/>
+              <w:left w:val="single" w:color="B8C2D0" w:sz="4"/>
+              <w:bottom w:val="single" w:color="B8C2D0" w:sz="4"/>
+              <w:right w:val="single" w:color="B8C2D0" w:sz="4"/>
+            </w:tcBorders>
+            <w:tcMar>
+              <w:top w:type="dxa" w:w="60"/>
+              <w:left w:type="dxa" w:w="100"/>
+              <w:bottom w:type="dxa" w:w="60"/>
+              <w:right w:type="dxa" w:w="100"/>
+            </w:tcMar>
+            <w:vAlign w:val="top"/>
+          </w:tcPr>
+          <w:p>
+            <w:pPr>
+              <w:keepNext/>
+              <w:spacing w:after="0" w:before="0"/>
+            </w:pPr>
+          </w:p>
+        </w:tc>
+        <w:tc>
+          <w:tcPr>
+            <w:tcW w:type="dxa" w:w="1520"/>
+            <w:tcBorders>
+              <w:top w:val="single" w:color="B8C2D0" w:sz="4"/>
+              <w:left w:val="single" w:color="B8C2D0" w:sz="4"/>
+              <w:bottom w:val="single" w:color="B8C2D0" w:sz="4"/>
+              <w:right w:val="single" w:color="B8C2D0" w:sz="4"/>
+            </w:tcBorders>
+            <w:tcMar>
+              <w:top w:type="dxa" w:w="60"/>
+              <w:left w:type="dxa" w:w="100"/>
+              <w:bottom w:type="dxa" w:w="60"/>
+              <w:right w:type="dxa" w:w="100"/>
+            </w:tcMar>
+            <w:vAlign w:val="top"/>
+          </w:tcPr>
+          <w:p>
+            <w:pPr>
+              <w:keepNext/>
+              <w:spacing w:after="0" w:before="0"/>
+            </w:pPr>
+          </w:p>
+        </w:tc>
+      </w:tr>
+      <w:tr>
+        <w:trPr>
+          <w:cantSplit/>
+          <w:trHeight w:val="650" w:hRule="atLeast"/>
+        </w:trPr>
+        <w:tc>
+          <w:tcPr>
+            <w:tcW w:type="dxa" w:w="1300"/>
+            <w:tcBorders>
+              <w:top w:val="single" w:color="B8C2D0" w:sz="4"/>
+              <w:left w:val="single" w:color="B8C2D0" w:sz="4"/>
+              <w:bottom w:val="single" w:color="B8C2D0" w:sz="4"/>
+              <w:right w:val="single" w:color="B8C2D0" w:sz="4"/>
+            </w:tcBorders>
+            <w:tcMar>
+              <w:top w:type="dxa" w:w="60"/>
+              <w:left w:type="dxa" w:w="100"/>
+              <w:bottom w:type="dxa" w:w="60"/>
+              <w:right w:type="dxa" w:w="100"/>
+            </w:tcMar>
+            <w:vAlign w:val="top"/>
+          </w:tcPr>
+          <w:p>
+            <w:pPr>
+              <w:keepNext/>
+              <w:spacing w:after="0" w:before="0"/>
+            </w:pPr>
+            <w:r>
+              <w:rPr>
+                <w:rFonts w:ascii="Calibri" w:cs="Calibri" w:eastAsia="Calibri" w:hAnsi="Calibri"/>
+                <w:sz w:val="20"/>
+                <w:szCs w:val="20"/>
+              </w:rPr>
+              <w:t xml:space="preserve">TC-02.10</w:t>
+            </w:r>
+          </w:p>
+        </w:tc>
+        <w:tc>
+          <w:tcPr>
+            <w:tcW w:type="dxa" w:w="5500"/>
+            <w:tcBorders>
+              <w:top w:val="single" w:color="B8C2D0" w:sz="4"/>
+              <w:left w:val="single" w:color="B8C2D0" w:sz="4"/>
+              <w:bottom w:val="single" w:color="B8C2D0" w:sz="4"/>
+              <w:right w:val="single" w:color="B8C2D0" w:sz="4"/>
+            </w:tcBorders>
+            <w:tcMar>
+              <w:top w:type="dxa" w:w="60"/>
+              <w:left w:type="dxa" w:w="100"/>
+              <w:bottom w:type="dxa" w:w="60"/>
+              <w:right w:type="dxa" w:w="100"/>
+            </w:tcMar>
+            <w:vAlign w:val="top"/>
+          </w:tcPr>
+          <w:p>
+            <w:pPr>
+              <w:keepNext/>
+              <w:spacing w:after="0" w:before="0"/>
+            </w:pPr>
+            <w:r>
+              <w:rPr>
+                <w:rFonts w:ascii="Calibri" w:cs="Calibri" w:eastAsia="Calibri" w:hAnsi="Calibri"/>
+                <w:sz w:val="20"/>
+                <w:szCs w:val="20"/>
+              </w:rPr>
+              <w:t xml:space="preserve">Mobile Change password, web Change password and both Forgot password screens: enter a </w:t>
+            </w:r>
+            <w:r>
+              <w:rPr>
+                <w:rFonts w:ascii="Calibri" w:cs="Calibri" w:eastAsia="Calibri" w:hAnsi="Calibri"/>
+                <w:b/>
+                <w:bCs/>
+                <w:sz w:val="20"/>
+                <w:szCs w:val="20"/>
+              </w:rPr>
+              <w:t xml:space="preserve">Good</w:t>
+            </w:r>
+            <w:r>
+              <w:rPr>
+                <w:rFonts w:ascii="Calibri" w:cs="Calibri" w:eastAsia="Calibri" w:hAnsi="Calibri"/>
+                <w:sz w:val="20"/>
+                <w:szCs w:val="20"/>
+              </w:rPr>
+              <w:t xml:space="preserve"> new password (e.g. </w:t>
+            </w:r>
+            <w:r>
+              <w:rPr>
+                <w:rFonts w:ascii="Consolas" w:cs="Consolas" w:eastAsia="Consolas" w:hAnsi="Consolas"/>
+                <w:sz w:val="18"/>
+                <w:szCs w:val="18"/>
+              </w:rPr>
+              <w:t xml:space="preserve">Sunflower7</w:t>
+            </w:r>
+            <w:r>
+              <w:rPr>
+                <w:rFonts w:ascii="Calibri" w:cs="Calibri" w:eastAsia="Calibri" w:hAnsi="Calibri"/>
+                <w:sz w:val="20"/>
+                <w:szCs w:val="20"/>
+              </w:rPr>
+              <w:t xml:space="preserve">) and save (#44)</w:t>
+            </w:r>
+          </w:p>
+        </w:tc>
+        <w:tc>
+          <w:tcPr>
+            <w:tcW w:type="dxa" w:w="5500"/>
+            <w:tcBorders>
+              <w:top w:val="single" w:color="B8C2D0" w:sz="4"/>
+              <w:left w:val="single" w:color="B8C2D0" w:sz="4"/>
+              <w:bottom w:val="single" w:color="B8C2D0" w:sz="4"/>
+              <w:right w:val="single" w:color="B8C2D0" w:sz="4"/>
+            </w:tcBorders>
+            <w:tcMar>
+              <w:top w:type="dxa" w:w="60"/>
+              <w:left w:type="dxa" w:w="100"/>
+              <w:bottom w:type="dxa" w:w="60"/>
+              <w:right w:type="dxa" w:w="100"/>
+            </w:tcMar>
+            <w:vAlign w:val="top"/>
+          </w:tcPr>
+          <w:p>
+            <w:pPr>
+              <w:keepNext/>
+              <w:spacing w:after="0" w:before="0"/>
+            </w:pPr>
+            <w:r>
+              <w:rPr>
+                <w:rFonts w:ascii="Calibri" w:cs="Calibri" w:eastAsia="Calibri" w:hAnsi="Calibri"/>
+                <w:sz w:val="20"/>
+                <w:szCs w:val="20"/>
+              </w:rPr>
+              <w:t xml:space="preserve">Not saved: "Make the password Strong to save it." under New password, meter at Good with its tip; a Strong password saves</w:t>
+            </w:r>
+          </w:p>
+        </w:tc>
+        <w:tc>
+          <w:tcPr>
+            <w:tcW w:type="dxa" w:w="4900"/>
+            <w:tcBorders>
+              <w:top w:val="single" w:color="B8C2D0" w:sz="4"/>
+              <w:left w:val="single" w:color="B8C2D0" w:sz="4"/>
+              <w:bottom w:val="single" w:color="B8C2D0" w:sz="4"/>
+              <w:right w:val="single" w:color="B8C2D0" w:sz="4"/>
+            </w:tcBorders>
+            <w:tcMar>
+              <w:top w:type="dxa" w:w="60"/>
+              <w:left w:type="dxa" w:w="100"/>
+              <w:bottom w:type="dxa" w:w="60"/>
+              <w:right w:type="dxa" w:w="100"/>
+            </w:tcMar>
+            <w:vAlign w:val="top"/>
+          </w:tcPr>
+          <w:p>
+            <w:pPr>
+              <w:keepNext/>
+              <w:spacing w:after="0" w:before="0"/>
+            </w:pPr>
+          </w:p>
+        </w:tc>
+        <w:tc>
+          <w:tcPr>
+            <w:tcW w:type="dxa" w:w="1520"/>
+            <w:tcBorders>
+              <w:top w:val="single" w:color="B8C2D0" w:sz="4"/>
+              <w:left w:val="single" w:color="B8C2D0" w:sz="4"/>
+              <w:bottom w:val="single" w:color="B8C2D0" w:sz="4"/>
+              <w:right w:val="single" w:color="B8C2D0" w:sz="4"/>
+            </w:tcBorders>
+            <w:tcMar>
+              <w:top w:type="dxa" w:w="60"/>
+              <w:left w:type="dxa" w:w="100"/>
+              <w:bottom w:type="dxa" w:w="60"/>
+              <w:right w:type="dxa" w:w="100"/>
+            </w:tcMar>
+            <w:vAlign w:val="top"/>
+          </w:tcPr>
+          <w:p>
+            <w:pPr>
+              <w:keepNext/>
+              <w:spacing w:after="0" w:before="0"/>
+            </w:pPr>
+          </w:p>
+        </w:tc>
+      </w:tr>
+      <w:tr>
+        <w:trPr>
+          <w:cantSplit/>
+          <w:trHeight w:val="650" w:hRule="atLeast"/>
+        </w:trPr>
+        <w:tc>
+          <w:tcPr>
+            <w:tcW w:type="dxa" w:w="1300"/>
+            <w:tcBorders>
+              <w:top w:val="single" w:color="B8C2D0" w:sz="4"/>
+              <w:left w:val="single" w:color="B8C2D0" w:sz="4"/>
+              <w:bottom w:val="single" w:color="B8C2D0" w:sz="4"/>
+              <w:right w:val="single" w:color="B8C2D0" w:sz="4"/>
+            </w:tcBorders>
+            <w:tcMar>
+              <w:top w:type="dxa" w:w="60"/>
+              <w:left w:type="dxa" w:w="100"/>
+              <w:bottom w:type="dxa" w:w="60"/>
+              <w:right w:type="dxa" w:w="100"/>
+            </w:tcMar>
+            <w:vAlign w:val="top"/>
+          </w:tcPr>
+          <w:p>
+            <w:pPr>
+              <w:keepNext/>
+              <w:spacing w:after="0" w:before="0"/>
+            </w:pPr>
+            <w:r>
+              <w:rPr>
+                <w:rFonts w:ascii="Calibri" w:cs="Calibri" w:eastAsia="Calibri" w:hAnsi="Calibri"/>
+                <w:sz w:val="20"/>
+                <w:szCs w:val="20"/>
+              </w:rPr>
+              <w:t xml:space="preserve">TC-02.11</w:t>
+            </w:r>
+          </w:p>
+        </w:tc>
+        <w:tc>
+          <w:tcPr>
+            <w:tcW w:type="dxa" w:w="5500"/>
+            <w:tcBorders>
+              <w:top w:val="single" w:color="B8C2D0" w:sz="4"/>
+              <w:left w:val="single" w:color="B8C2D0" w:sz="4"/>
+              <w:bottom w:val="single" w:color="B8C2D0" w:sz="4"/>
+              <w:right w:val="single" w:color="B8C2D0" w:sz="4"/>
+            </w:tcBorders>
+            <w:tcMar>
+              <w:top w:type="dxa" w:w="60"/>
+              <w:left w:type="dxa" w:w="100"/>
+              <w:bottom w:type="dxa" w:w="60"/>
+              <w:right w:type="dxa" w:w="100"/>
+            </w:tcMar>
+            <w:vAlign w:val="top"/>
+          </w:tcPr>
+          <w:p>
+            <w:pPr>
+              <w:keepNext/>
+              <w:spacing w:after="0" w:before="0"/>
+            </w:pPr>
+            <w:r>
+              <w:rPr>
+                <w:rFonts w:ascii="Calibri" w:cs="Calibri" w:eastAsia="Calibri" w:hAnsi="Calibri"/>
+                <w:sz w:val="20"/>
+                <w:szCs w:val="20"/>
+              </w:rPr>
+              <w:t xml:space="preserve">Web: open </w:t>
+            </w:r>
+            <w:r>
+              <w:rPr>
+                <w:rFonts w:ascii="Consolas" w:cs="Consolas" w:eastAsia="Consolas" w:hAnsi="Consolas"/>
+                <w:sz w:val="18"/>
+                <w:szCs w:val="18"/>
+              </w:rPr>
+              <w:t xml:space="preserve">/staff/sign-in</w:t>
+            </w:r>
+            <w:r>
+              <w:rPr>
+                <w:rFonts w:ascii="Calibri" w:cs="Calibri" w:eastAsia="Calibri" w:hAnsi="Calibri"/>
+                <w:sz w:val="20"/>
+                <w:szCs w:val="20"/>
+              </w:rPr>
+              <w:t xml:space="preserve">; pick </w:t>
+            </w:r>
+            <w:r>
+              <w:rPr>
+                <w:rFonts w:ascii="Calibri" w:cs="Calibri" w:eastAsia="Calibri" w:hAnsi="Calibri"/>
+                <w:b/>
+                <w:bCs/>
+                <w:sz w:val="20"/>
+                <w:szCs w:val="20"/>
+              </w:rPr>
+              <w:t xml:space="preserve">Administrator</w:t>
+            </w:r>
+            <w:r>
+              <w:rPr>
+                <w:rFonts w:ascii="Calibri" w:cs="Calibri" w:eastAsia="Calibri" w:hAnsi="Calibri"/>
+                <w:sz w:val="20"/>
+                <w:szCs w:val="20"/>
+              </w:rPr>
+              <w:t xml:space="preserve"> and sign in with O1's email and password (#52)</w:t>
+            </w:r>
+          </w:p>
+        </w:tc>
+        <w:tc>
+          <w:tcPr>
+            <w:tcW w:type="dxa" w:w="5500"/>
+            <w:tcBorders>
+              <w:top w:val="single" w:color="B8C2D0" w:sz="4"/>
+              <w:left w:val="single" w:color="B8C2D0" w:sz="4"/>
+              <w:bottom w:val="single" w:color="B8C2D0" w:sz="4"/>
+              <w:right w:val="single" w:color="B8C2D0" w:sz="4"/>
+            </w:tcBorders>
+            <w:tcMar>
+              <w:top w:type="dxa" w:w="60"/>
+              <w:left w:type="dxa" w:w="100"/>
+              <w:bottom w:type="dxa" w:w="60"/>
+              <w:right w:type="dxa" w:w="100"/>
+            </w:tcMar>
+            <w:vAlign w:val="top"/>
+          </w:tcPr>
+          <w:p>
+            <w:pPr>
+              <w:keepNext/>
+              <w:spacing w:after="0" w:before="0"/>
+            </w:pPr>
+            <w:r>
+              <w:rPr>
+                <w:rFonts w:ascii="Calibri" w:cs="Calibri" w:eastAsia="Calibri" w:hAnsi="Calibri"/>
+                <w:sz w:val="20"/>
+                <w:szCs w:val="20"/>
+              </w:rPr>
+              <w:t xml:space="preserve">The role chooser shows two cards (Administrator, Traffic Officer) and "Reporters use the RoadWatch Android app."; on the Administrator form O1 stays signed out with "This is a Traffic Officer account" ("Go back with "Choose a different role" and pick Traffic Officer.")</w:t>
+            </w:r>
+          </w:p>
+        </w:tc>
+        <w:tc>
+          <w:tcPr>
+            <w:tcW w:type="dxa" w:w="4900"/>
+            <w:tcBorders>
+              <w:top w:val="single" w:color="B8C2D0" w:sz="4"/>
+              <w:left w:val="single" w:color="B8C2D0" w:sz="4"/>
+              <w:bottom w:val="single" w:color="B8C2D0" w:sz="4"/>
+              <w:right w:val="single" w:color="B8C2D0" w:sz="4"/>
+            </w:tcBorders>
+            <w:tcMar>
+              <w:top w:type="dxa" w:w="60"/>
+              <w:left w:type="dxa" w:w="100"/>
+              <w:bottom w:type="dxa" w:w="60"/>
+              <w:right w:type="dxa" w:w="100"/>
+            </w:tcMar>
+            <w:vAlign w:val="top"/>
+          </w:tcPr>
+          <w:p>
+            <w:pPr>
+              <w:keepNext/>
+              <w:spacing w:after="0" w:before="0"/>
+            </w:pPr>
+          </w:p>
+        </w:tc>
+        <w:tc>
+          <w:tcPr>
+            <w:tcW w:type="dxa" w:w="1520"/>
+            <w:tcBorders>
+              <w:top w:val="single" w:color="B8C2D0" w:sz="4"/>
+              <w:left w:val="single" w:color="B8C2D0" w:sz="4"/>
+              <w:bottom w:val="single" w:color="B8C2D0" w:sz="4"/>
+              <w:right w:val="single" w:color="B8C2D0" w:sz="4"/>
+            </w:tcBorders>
+            <w:tcMar>
+              <w:top w:type="dxa" w:w="60"/>
+              <w:left w:type="dxa" w:w="100"/>
+              <w:bottom w:type="dxa" w:w="60"/>
+              <w:right w:type="dxa" w:w="100"/>
+            </w:tcMar>
+            <w:vAlign w:val="top"/>
+          </w:tcPr>
+          <w:p>
+            <w:pPr>
+              <w:keepNext/>
+              <w:spacing w:after="0" w:before="0"/>
+            </w:pPr>
+          </w:p>
+        </w:tc>
+      </w:tr>
+      <w:tr>
+        <w:trPr>
+          <w:cantSplit/>
+          <w:trHeight w:val="650" w:hRule="atLeast"/>
+        </w:trPr>
+        <w:tc>
+          <w:tcPr>
+            <w:tcW w:type="dxa" w:w="1300"/>
+            <w:tcBorders>
+              <w:top w:val="single" w:color="B8C2D0" w:sz="4"/>
+              <w:left w:val="single" w:color="B8C2D0" w:sz="4"/>
+              <w:bottom w:val="single" w:color="B8C2D0" w:sz="4"/>
+              <w:right w:val="single" w:color="B8C2D0" w:sz="4"/>
+            </w:tcBorders>
+            <w:tcMar>
+              <w:top w:type="dxa" w:w="60"/>
+              <w:left w:type="dxa" w:w="100"/>
+              <w:bottom w:type="dxa" w:w="60"/>
+              <w:right w:type="dxa" w:w="100"/>
+            </w:tcMar>
+            <w:vAlign w:val="top"/>
+          </w:tcPr>
+          <w:p>
+            <w:pPr>
               <w:keepNext w:val="false"/>
               <w:spacing w:after="0" w:before="0"/>
             </w:pPr>
@@ -2982,7 +3890,7 @@
                 <w:sz w:val="20"/>
                 <w:szCs w:val="20"/>
               </w:rPr>
-              <w:t xml:space="preserve">TC-02.9</w:t>
+              <w:t xml:space="preserve">TC-02.12</w:t>
             </w:r>
           </w:p>
         </w:tc>
@@ -3014,7 +3922,43 @@
                 <w:sz w:val="20"/>
                 <w:szCs w:val="20"/>
               </w:rPr>
-              <w:t xml:space="preserve">Every password field (mobile Log in, Register, Change password, Forgot password; web sign-in, Change password, Create officer, Reset password): press the eye (#45)</w:t>
+              <w:t xml:space="preserve">Web: </w:t>
+            </w:r>
+            <w:r>
+              <w:rPr>
+                <w:rFonts w:ascii="Calibri" w:cs="Calibri" w:eastAsia="Calibri" w:hAnsi="Calibri"/>
+                <w:b/>
+                <w:bCs/>
+                <w:sz w:val="20"/>
+                <w:szCs w:val="20"/>
+              </w:rPr>
+              <w:t xml:space="preserve">Choose a different role</w:t>
+            </w:r>
+            <w:r>
+              <w:rPr>
+                <w:rFonts w:ascii="Calibri" w:cs="Calibri" w:eastAsia="Calibri" w:hAnsi="Calibri"/>
+                <w:sz w:val="20"/>
+                <w:szCs w:val="20"/>
+              </w:rPr>
+              <w:t xml:space="preserve"> &gt; </w:t>
+            </w:r>
+            <w:r>
+              <w:rPr>
+                <w:rFonts w:ascii="Calibri" w:cs="Calibri" w:eastAsia="Calibri" w:hAnsi="Calibri"/>
+                <w:b/>
+                <w:bCs/>
+                <w:sz w:val="20"/>
+                <w:szCs w:val="20"/>
+              </w:rPr>
+              <w:t xml:space="preserve">Traffic Officer</w:t>
+            </w:r>
+            <w:r>
+              <w:rPr>
+                <w:rFonts w:ascii="Calibri" w:cs="Calibri" w:eastAsia="Calibri" w:hAnsi="Calibri"/>
+                <w:sz w:val="20"/>
+                <w:szCs w:val="20"/>
+              </w:rPr>
+              <w:t xml:space="preserve">, sign in as O1, then Log out (#52)</w:t>
             </w:r>
           </w:p>
         </w:tc>
@@ -3046,7 +3990,23 @@
                 <w:sz w:val="20"/>
                 <w:szCs w:val="20"/>
               </w:rPr>
-              <w:t xml:space="preserve">The password shows and the icon becomes the crossed eye; it stays shown until pressed again; screen readers hear "Show password" / "Hide password"</w:t>
+              <w:t xml:space="preserve">"Assigned to me" opens with the Traffic Officer console sidebar (Assigned to me, Demo video); opening </w:t>
+            </w:r>
+            <w:r>
+              <w:rPr>
+                <w:rFonts w:ascii="Consolas" w:cs="Consolas" w:eastAsia="Consolas" w:hAnsi="Consolas"/>
+                <w:sz w:val="18"/>
+                <w:szCs w:val="18"/>
+              </w:rPr>
+              <w:t xml:space="preserve">/admin</w:t>
+            </w:r>
+            <w:r>
+              <w:rPr>
+                <w:rFonts w:ascii="Calibri" w:cs="Calibri" w:eastAsia="Calibri" w:hAnsi="Calibri"/>
+                <w:sz w:val="20"/>
+                <w:szCs w:val="20"/>
+              </w:rPr>
+              <w:t xml:space="preserve"> goes back to Assigned to me; Log out lands on the Traffic Officer form; "Forgot password?" from this form returns to it</w:t>
             </w:r>
           </w:p>
         </w:tc>
@@ -8635,6 +9595,156 @@
           </w:tcPr>
           <w:p>
             <w:pPr>
+              <w:keepNext/>
+              <w:spacing w:after="0" w:before="0"/>
+            </w:pPr>
+            <w:r>
+              <w:rPr>
+                <w:rFonts w:ascii="Calibri" w:cs="Calibri" w:eastAsia="Calibri" w:hAnsi="Calibri"/>
+                <w:sz w:val="20"/>
+                <w:szCs w:val="20"/>
+              </w:rPr>
+              <w:t xml:space="preserve">TC-08.8</w:t>
+            </w:r>
+          </w:p>
+        </w:tc>
+        <w:tc>
+          <w:tcPr>
+            <w:tcW w:type="dxa" w:w="5500"/>
+            <w:tcBorders>
+              <w:top w:val="single" w:color="B8C2D0" w:sz="4"/>
+              <w:left w:val="single" w:color="B8C2D0" w:sz="4"/>
+              <w:bottom w:val="single" w:color="B8C2D0" w:sz="4"/>
+              <w:right w:val="single" w:color="B8C2D0" w:sz="4"/>
+            </w:tcBorders>
+            <w:tcMar>
+              <w:top w:type="dxa" w:w="60"/>
+              <w:left w:type="dxa" w:w="100"/>
+              <w:bottom w:type="dxa" w:w="60"/>
+              <w:right w:type="dxa" w:w="100"/>
+            </w:tcMar>
+            <w:vAlign w:val="top"/>
+          </w:tcPr>
+          <w:p>
+            <w:pPr>
+              <w:keepNext/>
+              <w:spacing w:after="0" w:before="0"/>
+            </w:pPr>
+            <w:r>
+              <w:rPr>
+                <w:rFonts w:ascii="Calibri" w:cs="Calibri" w:eastAsia="Calibri" w:hAnsi="Calibri"/>
+                <w:sz w:val="20"/>
+                <w:szCs w:val="20"/>
+              </w:rPr>
+              <w:t xml:space="preserve">Admin rejects a report assigned to O1; O1 opens it on the app</w:t>
+            </w:r>
+          </w:p>
+        </w:tc>
+        <w:tc>
+          <w:tcPr>
+            <w:tcW w:type="dxa" w:w="5500"/>
+            <w:tcBorders>
+              <w:top w:val="single" w:color="B8C2D0" w:sz="4"/>
+              <w:left w:val="single" w:color="B8C2D0" w:sz="4"/>
+              <w:bottom w:val="single" w:color="B8C2D0" w:sz="4"/>
+              <w:right w:val="single" w:color="B8C2D0" w:sz="4"/>
+            </w:tcBorders>
+            <w:tcMar>
+              <w:top w:type="dxa" w:w="60"/>
+              <w:left w:type="dxa" w:w="100"/>
+              <w:bottom w:type="dxa" w:w="60"/>
+              <w:right w:type="dxa" w:w="100"/>
+            </w:tcMar>
+            <w:vAlign w:val="top"/>
+          </w:tcPr>
+          <w:p>
+            <w:pPr>
+              <w:keepNext/>
+              <w:spacing w:after="0" w:before="0"/>
+            </w:pPr>
+            <w:r>
+              <w:rPr>
+                <w:rFonts w:ascii="Calibri" w:cs="Calibri" w:eastAsia="Calibri" w:hAnsi="Calibri"/>
+                <w:sz w:val="20"/>
+                <w:szCs w:val="20"/>
+              </w:rPr>
+              <w:t xml:space="preserve">Not listed under "All open"; no Update status button, a note says the administrator rejected it (issue #44)</w:t>
+            </w:r>
+          </w:p>
+        </w:tc>
+        <w:tc>
+          <w:tcPr>
+            <w:tcW w:type="dxa" w:w="4900"/>
+            <w:tcBorders>
+              <w:top w:val="single" w:color="B8C2D0" w:sz="4"/>
+              <w:left w:val="single" w:color="B8C2D0" w:sz="4"/>
+              <w:bottom w:val="single" w:color="B8C2D0" w:sz="4"/>
+              <w:right w:val="single" w:color="B8C2D0" w:sz="4"/>
+            </w:tcBorders>
+            <w:tcMar>
+              <w:top w:type="dxa" w:w="60"/>
+              <w:left w:type="dxa" w:w="100"/>
+              <w:bottom w:type="dxa" w:w="60"/>
+              <w:right w:type="dxa" w:w="100"/>
+            </w:tcMar>
+            <w:vAlign w:val="top"/>
+          </w:tcPr>
+          <w:p>
+            <w:pPr>
+              <w:keepNext/>
+              <w:spacing w:after="0" w:before="0"/>
+            </w:pPr>
+          </w:p>
+        </w:tc>
+        <w:tc>
+          <w:tcPr>
+            <w:tcW w:type="dxa" w:w="1520"/>
+            <w:tcBorders>
+              <w:top w:val="single" w:color="B8C2D0" w:sz="4"/>
+              <w:left w:val="single" w:color="B8C2D0" w:sz="4"/>
+              <w:bottom w:val="single" w:color="B8C2D0" w:sz="4"/>
+              <w:right w:val="single" w:color="B8C2D0" w:sz="4"/>
+            </w:tcBorders>
+            <w:tcMar>
+              <w:top w:type="dxa" w:w="60"/>
+              <w:left w:type="dxa" w:w="100"/>
+              <w:bottom w:type="dxa" w:w="60"/>
+              <w:right w:type="dxa" w:w="100"/>
+            </w:tcMar>
+            <w:vAlign w:val="top"/>
+          </w:tcPr>
+          <w:p>
+            <w:pPr>
+              <w:keepNext/>
+              <w:spacing w:after="0" w:before="0"/>
+            </w:pPr>
+          </w:p>
+        </w:tc>
+      </w:tr>
+      <w:tr>
+        <w:trPr>
+          <w:cantSplit/>
+          <w:trHeight w:val="650" w:hRule="atLeast"/>
+        </w:trPr>
+        <w:tc>
+          <w:tcPr>
+            <w:tcW w:type="dxa" w:w="1300"/>
+            <w:tcBorders>
+              <w:top w:val="single" w:color="B8C2D0" w:sz="4"/>
+              <w:left w:val="single" w:color="B8C2D0" w:sz="4"/>
+              <w:bottom w:val="single" w:color="B8C2D0" w:sz="4"/>
+              <w:right w:val="single" w:color="B8C2D0" w:sz="4"/>
+            </w:tcBorders>
+            <w:tcMar>
+              <w:top w:type="dxa" w:w="60"/>
+              <w:left w:type="dxa" w:w="100"/>
+              <w:bottom w:type="dxa" w:w="60"/>
+              <w:right w:type="dxa" w:w="100"/>
+            </w:tcMar>
+            <w:vAlign w:val="top"/>
+          </w:tcPr>
+          <w:p>
+            <w:pPr>
               <w:keepNext w:val="false"/>
               <w:spacing w:after="0" w:before="0"/>
             </w:pPr>
@@ -8644,7 +9754,7 @@
                 <w:sz w:val="20"/>
                 <w:szCs w:val="20"/>
               </w:rPr>
-              <w:t xml:space="preserve">TC-08.8</w:t>
+              <w:t xml:space="preserve">TC-08.9</w:t>
             </w:r>
           </w:p>
         </w:tc>
@@ -8676,7 +9786,7 @@
                 <w:sz w:val="20"/>
                 <w:szCs w:val="20"/>
               </w:rPr>
-              <w:t xml:space="preserve">Admin rejects a report assigned to O1; O1 opens it on the app</w:t>
+              <w:t xml:space="preserve">Web (O1, #52): open an assigned report from Assigned to me; Update investigation &gt; In Progress with remarks &gt; Save update</w:t>
             </w:r>
           </w:p>
         </w:tc>
@@ -8708,7 +9818,7 @@
                 <w:sz w:val="20"/>
                 <w:szCs w:val="20"/>
               </w:rPr>
-              <w:t xml:space="preserve">Not listed under "All open"; no Update status button, a note says the administrator rejected it (issue #44)</w:t>
+              <w:t xml:space="preserve">"Update saved: Status is now In Progress. The reporter and the admin were notified."; the history shows "O1 (Officer)"; only In Progress, Additional Information Required and Resolved/Closed can be chosen; a Rejected report is read-only</w:t>
             </w:r>
           </w:p>
         </w:tc>
@@ -9313,6 +10423,156 @@
           </w:tcPr>
           <w:p>
             <w:pPr>
+              <w:keepNext/>
+              <w:spacing w:after="0" w:before="0"/>
+            </w:pPr>
+            <w:r>
+              <w:rPr>
+                <w:rFonts w:ascii="Calibri" w:cs="Calibri" w:eastAsia="Calibri" w:hAnsi="Calibri"/>
+                <w:sz w:val="20"/>
+                <w:szCs w:val="20"/>
+              </w:rPr>
+              <w:t xml:space="preserve">TC-09.3</w:t>
+            </w:r>
+          </w:p>
+        </w:tc>
+        <w:tc>
+          <w:tcPr>
+            <w:tcW w:type="dxa" w:w="5500"/>
+            <w:tcBorders>
+              <w:top w:val="single" w:color="B8C2D0" w:sz="4"/>
+              <w:left w:val="single" w:color="B8C2D0" w:sz="4"/>
+              <w:bottom w:val="single" w:color="B8C2D0" w:sz="4"/>
+              <w:right w:val="single" w:color="B8C2D0" w:sz="4"/>
+            </w:tcBorders>
+            <w:tcMar>
+              <w:top w:type="dxa" w:w="60"/>
+              <w:left w:type="dxa" w:w="100"/>
+              <w:bottom w:type="dxa" w:w="60"/>
+              <w:right w:type="dxa" w:w="100"/>
+            </w:tcMar>
+            <w:vAlign w:val="top"/>
+          </w:tcPr>
+          <w:p>
+            <w:pPr>
+              <w:keepNext/>
+              <w:spacing w:after="0" w:before="0"/>
+            </w:pPr>
+            <w:r>
+              <w:rPr>
+                <w:rFonts w:ascii="Calibri" w:cs="Calibri" w:eastAsia="Calibri" w:hAnsi="Calibri"/>
+                <w:sz w:val="20"/>
+                <w:szCs w:val="20"/>
+              </w:rPr>
+              <w:t xml:space="preserve">R1: Notifications &gt; Mark all as read; open one</w:t>
+            </w:r>
+          </w:p>
+        </w:tc>
+        <w:tc>
+          <w:tcPr>
+            <w:tcW w:type="dxa" w:w="5500"/>
+            <w:tcBorders>
+              <w:top w:val="single" w:color="B8C2D0" w:sz="4"/>
+              <w:left w:val="single" w:color="B8C2D0" w:sz="4"/>
+              <w:bottom w:val="single" w:color="B8C2D0" w:sz="4"/>
+              <w:right w:val="single" w:color="B8C2D0" w:sz="4"/>
+            </w:tcBorders>
+            <w:tcMar>
+              <w:top w:type="dxa" w:w="60"/>
+              <w:left w:type="dxa" w:w="100"/>
+              <w:bottom w:type="dxa" w:w="60"/>
+              <w:right w:type="dxa" w:w="100"/>
+            </w:tcMar>
+            <w:vAlign w:val="top"/>
+          </w:tcPr>
+          <w:p>
+            <w:pPr>
+              <w:keepNext/>
+              <w:spacing w:after="0" w:before="0"/>
+            </w:pPr>
+            <w:r>
+              <w:rPr>
+                <w:rFonts w:ascii="Calibri" w:cs="Calibri" w:eastAsia="Calibri" w:hAnsi="Calibri"/>
+                <w:sz w:val="20"/>
+                <w:szCs w:val="20"/>
+              </w:rPr>
+              <w:t xml:space="preserve">Unread badge clears; tapping opens the report</w:t>
+            </w:r>
+          </w:p>
+        </w:tc>
+        <w:tc>
+          <w:tcPr>
+            <w:tcW w:type="dxa" w:w="4900"/>
+            <w:tcBorders>
+              <w:top w:val="single" w:color="B8C2D0" w:sz="4"/>
+              <w:left w:val="single" w:color="B8C2D0" w:sz="4"/>
+              <w:bottom w:val="single" w:color="B8C2D0" w:sz="4"/>
+              <w:right w:val="single" w:color="B8C2D0" w:sz="4"/>
+            </w:tcBorders>
+            <w:tcMar>
+              <w:top w:type="dxa" w:w="60"/>
+              <w:left w:type="dxa" w:w="100"/>
+              <w:bottom w:type="dxa" w:w="60"/>
+              <w:right w:type="dxa" w:w="100"/>
+            </w:tcMar>
+            <w:vAlign w:val="top"/>
+          </w:tcPr>
+          <w:p>
+            <w:pPr>
+              <w:keepNext/>
+              <w:spacing w:after="0" w:before="0"/>
+            </w:pPr>
+          </w:p>
+        </w:tc>
+        <w:tc>
+          <w:tcPr>
+            <w:tcW w:type="dxa" w:w="1520"/>
+            <w:tcBorders>
+              <w:top w:val="single" w:color="B8C2D0" w:sz="4"/>
+              <w:left w:val="single" w:color="B8C2D0" w:sz="4"/>
+              <w:bottom w:val="single" w:color="B8C2D0" w:sz="4"/>
+              <w:right w:val="single" w:color="B8C2D0" w:sz="4"/>
+            </w:tcBorders>
+            <w:tcMar>
+              <w:top w:type="dxa" w:w="60"/>
+              <w:left w:type="dxa" w:w="100"/>
+              <w:bottom w:type="dxa" w:w="60"/>
+              <w:right w:type="dxa" w:w="100"/>
+            </w:tcMar>
+            <w:vAlign w:val="top"/>
+          </w:tcPr>
+          <w:p>
+            <w:pPr>
+              <w:keepNext/>
+              <w:spacing w:after="0" w:before="0"/>
+            </w:pPr>
+          </w:p>
+        </w:tc>
+      </w:tr>
+      <w:tr>
+        <w:trPr>
+          <w:cantSplit/>
+          <w:trHeight w:val="650" w:hRule="atLeast"/>
+        </w:trPr>
+        <w:tc>
+          <w:tcPr>
+            <w:tcW w:type="dxa" w:w="1300"/>
+            <w:tcBorders>
+              <w:top w:val="single" w:color="B8C2D0" w:sz="4"/>
+              <w:left w:val="single" w:color="B8C2D0" w:sz="4"/>
+              <w:bottom w:val="single" w:color="B8C2D0" w:sz="4"/>
+              <w:right w:val="single" w:color="B8C2D0" w:sz="4"/>
+            </w:tcBorders>
+            <w:tcMar>
+              <w:top w:type="dxa" w:w="60"/>
+              <w:left w:type="dxa" w:w="100"/>
+              <w:bottom w:type="dxa" w:w="60"/>
+              <w:right w:type="dxa" w:w="100"/>
+            </w:tcMar>
+            <w:vAlign w:val="top"/>
+          </w:tcPr>
+          <w:p>
+            <w:pPr>
               <w:keepNext w:val="false"/>
               <w:spacing w:after="0" w:before="0"/>
             </w:pPr>
@@ -9322,7 +10582,7 @@
                 <w:sz w:val="20"/>
                 <w:szCs w:val="20"/>
               </w:rPr>
-              <w:t xml:space="preserve">TC-09.3</w:t>
+              <w:t xml:space="preserve">TC-09.4</w:t>
             </w:r>
           </w:p>
         </w:tc>
@@ -9354,7 +10614,25 @@
                 <w:sz w:val="20"/>
                 <w:szCs w:val="20"/>
               </w:rPr>
-              <w:t xml:space="preserve">R1: Notifications &gt; Mark all as read; open one</w:t>
+              <w:t xml:space="preserve">Web (O1, #47): after an admin assigns a report to O1, look at the bell in the top bar; open it; select the new alert; then open it again and press </w:t>
+            </w:r>
+            <w:r>
+              <w:rPr>
+                <w:rFonts w:ascii="Calibri" w:cs="Calibri" w:eastAsia="Calibri" w:hAnsi="Calibri"/>
+                <w:b/>
+                <w:bCs/>
+                <w:sz w:val="20"/>
+                <w:szCs w:val="20"/>
+              </w:rPr>
+              <w:t xml:space="preserve">Mark all as read</w:t>
+            </w:r>
+            <w:r>
+              <w:rPr>
+                <w:rFonts w:ascii="Calibri" w:cs="Calibri" w:eastAsia="Calibri" w:hAnsi="Calibri"/>
+                <w:sz w:val="20"/>
+                <w:szCs w:val="20"/>
+              </w:rPr>
+              <w:t xml:space="preserve">; sign in as A1</w:t>
             </w:r>
           </w:p>
         </w:tc>
@@ -9386,7 +10664,7 @@
                 <w:sz w:val="20"/>
                 <w:szCs w:val="20"/>
               </w:rPr>
-              <w:t xml:space="preserve">Unread badge clears; tapping opens the report</w:t>
+              <w:t xml:space="preserve">The bell shows the unread count ("Notifications (1 unread)" for screen readers); the panel lists "Report #N was assigned to you." with the unread dot; selecting it opens the report and lowers the count; Mark all as read clears it; Esc closes the panel and focus returns to the bell; A1's top bar has no bell</w:t>
             </w:r>
           </w:p>
         </w:tc>
@@ -12041,7 +13319,7 @@
           </w:tcPr>
           <w:p>
             <w:pPr>
-              <w:keepNext w:val="false"/>
+              <w:keepNext/>
               <w:spacing w:after="0" w:before="0"/>
             </w:pPr>
             <w:r>
@@ -12073,7 +13351,7 @@
           </w:tcPr>
           <w:p>
             <w:pPr>
-              <w:keepNext w:val="false"/>
+              <w:keepNext/>
               <w:spacing w:after="0" w:before="0"/>
             </w:pPr>
             <w:r>
@@ -12123,6 +13401,92 @@
           </w:tcPr>
           <w:p>
             <w:pPr>
+              <w:keepNext/>
+              <w:spacing w:after="0" w:before="0"/>
+            </w:pPr>
+            <w:r>
+              <w:rPr>
+                <w:rFonts w:ascii="Calibri" w:cs="Calibri" w:eastAsia="Calibri" w:hAnsi="Calibri"/>
+                <w:sz w:val="20"/>
+                <w:szCs w:val="20"/>
+              </w:rPr>
+              <w:t xml:space="preserve">"Password reset" toast; R2 gets an email that the password was reset (without the password); R2 logs in with the temporary password; not offered on A1's own row or other administrators</w:t>
+            </w:r>
+          </w:p>
+        </w:tc>
+        <w:tc>
+          <w:tcPr>
+            <w:tcW w:type="dxa" w:w="4900"/>
+            <w:tcBorders>
+              <w:top w:val="single" w:color="B8C2D0" w:sz="4"/>
+              <w:left w:val="single" w:color="B8C2D0" w:sz="4"/>
+              <w:bottom w:val="single" w:color="B8C2D0" w:sz="4"/>
+              <w:right w:val="single" w:color="B8C2D0" w:sz="4"/>
+            </w:tcBorders>
+            <w:tcMar>
+              <w:top w:type="dxa" w:w="60"/>
+              <w:left w:type="dxa" w:w="100"/>
+              <w:bottom w:type="dxa" w:w="60"/>
+              <w:right w:type="dxa" w:w="100"/>
+            </w:tcMar>
+            <w:vAlign w:val="top"/>
+          </w:tcPr>
+          <w:p>
+            <w:pPr>
+              <w:keepNext/>
+              <w:spacing w:after="0" w:before="0"/>
+            </w:pPr>
+          </w:p>
+        </w:tc>
+        <w:tc>
+          <w:tcPr>
+            <w:tcW w:type="dxa" w:w="1520"/>
+            <w:tcBorders>
+              <w:top w:val="single" w:color="B8C2D0" w:sz="4"/>
+              <w:left w:val="single" w:color="B8C2D0" w:sz="4"/>
+              <w:bottom w:val="single" w:color="B8C2D0" w:sz="4"/>
+              <w:right w:val="single" w:color="B8C2D0" w:sz="4"/>
+            </w:tcBorders>
+            <w:tcMar>
+              <w:top w:type="dxa" w:w="60"/>
+              <w:left w:type="dxa" w:w="100"/>
+              <w:bottom w:type="dxa" w:w="60"/>
+              <w:right w:type="dxa" w:w="100"/>
+            </w:tcMar>
+            <w:vAlign w:val="top"/>
+          </w:tcPr>
+          <w:p>
+            <w:pPr>
+              <w:keepNext/>
+              <w:spacing w:after="0" w:before="0"/>
+            </w:pPr>
+          </w:p>
+        </w:tc>
+      </w:tr>
+      <w:tr>
+        <w:trPr>
+          <w:cantSplit/>
+          <w:trHeight w:val="650" w:hRule="atLeast"/>
+        </w:trPr>
+        <w:tc>
+          <w:tcPr>
+            <w:tcW w:type="dxa" w:w="1300"/>
+            <w:tcBorders>
+              <w:top w:val="single" w:color="B8C2D0" w:sz="4"/>
+              <w:left w:val="single" w:color="B8C2D0" w:sz="4"/>
+              <w:bottom w:val="single" w:color="B8C2D0" w:sz="4"/>
+              <w:right w:val="single" w:color="B8C2D0" w:sz="4"/>
+            </w:tcBorders>
+            <w:tcMar>
+              <w:top w:type="dxa" w:w="60"/>
+              <w:left w:type="dxa" w:w="100"/>
+              <w:bottom w:type="dxa" w:w="60"/>
+              <w:right w:type="dxa" w:w="100"/>
+            </w:tcMar>
+            <w:vAlign w:val="top"/>
+          </w:tcPr>
+          <w:p>
+            <w:pPr>
               <w:keepNext w:val="false"/>
               <w:spacing w:after="0" w:before="0"/>
             </w:pPr>
@@ -12132,7 +13496,87 @@
                 <w:sz w:val="20"/>
                 <w:szCs w:val="20"/>
               </w:rPr>
-              <w:t xml:space="preserve">"Password reset" toast; R2 gets an email that the password was reset (without the password); R2 logs in with the temporary password; not offered on A1's own row or other administrators</w:t>
+              <w:t xml:space="preserve">TC-13.7</w:t>
+            </w:r>
+          </w:p>
+        </w:tc>
+        <w:tc>
+          <w:tcPr>
+            <w:tcW w:type="dxa" w:w="5500"/>
+            <w:tcBorders>
+              <w:top w:val="single" w:color="B8C2D0" w:sz="4"/>
+              <w:left w:val="single" w:color="B8C2D0" w:sz="4"/>
+              <w:bottom w:val="single" w:color="B8C2D0" w:sz="4"/>
+              <w:right w:val="single" w:color="B8C2D0" w:sz="4"/>
+            </w:tcBorders>
+            <w:tcMar>
+              <w:top w:type="dxa" w:w="60"/>
+              <w:left w:type="dxa" w:w="100"/>
+              <w:bottom w:type="dxa" w:w="60"/>
+              <w:right w:type="dxa" w:w="100"/>
+            </w:tcMar>
+            <w:vAlign w:val="top"/>
+          </w:tcPr>
+          <w:p>
+            <w:pPr>
+              <w:keepNext w:val="false"/>
+              <w:spacing w:after="0" w:before="0"/>
+            </w:pPr>
+            <w:r>
+              <w:rPr>
+                <w:rFonts w:ascii="Calibri" w:cs="Calibri" w:eastAsia="Calibri" w:hAnsi="Calibri"/>
+                <w:sz w:val="20"/>
+                <w:szCs w:val="20"/>
+              </w:rPr>
+              <w:t xml:space="preserve">A1: Create officer and Reset password with a temporary password that is not Strong (e.g. </w:t>
+            </w:r>
+            <w:r>
+              <w:rPr>
+                <w:rFonts w:ascii="Consolas" w:cs="Consolas" w:eastAsia="Consolas" w:hAnsi="Consolas"/>
+                <w:sz w:val="18"/>
+                <w:szCs w:val="18"/>
+              </w:rPr>
+              <w:t xml:space="preserve">Sunflower7</w:t>
+            </w:r>
+            <w:r>
+              <w:rPr>
+                <w:rFonts w:ascii="Calibri" w:cs="Calibri" w:eastAsia="Calibri" w:hAnsi="Calibri"/>
+                <w:sz w:val="20"/>
+                <w:szCs w:val="20"/>
+              </w:rPr>
+              <w:t xml:space="preserve">), and one that contains the person's name (#44)</w:t>
+            </w:r>
+          </w:p>
+        </w:tc>
+        <w:tc>
+          <w:tcPr>
+            <w:tcW w:type="dxa" w:w="5500"/>
+            <w:tcBorders>
+              <w:top w:val="single" w:color="B8C2D0" w:sz="4"/>
+              <w:left w:val="single" w:color="B8C2D0" w:sz="4"/>
+              <w:bottom w:val="single" w:color="B8C2D0" w:sz="4"/>
+              <w:right w:val="single" w:color="B8C2D0" w:sz="4"/>
+            </w:tcBorders>
+            <w:tcMar>
+              <w:top w:type="dxa" w:w="60"/>
+              <w:left w:type="dxa" w:w="100"/>
+              <w:bottom w:type="dxa" w:w="60"/>
+              <w:right w:type="dxa" w:w="100"/>
+            </w:tcMar>
+            <w:vAlign w:val="top"/>
+          </w:tcPr>
+          <w:p>
+            <w:pPr>
+              <w:keepNext w:val="false"/>
+              <w:spacing w:after="0" w:before="0"/>
+            </w:pPr>
+            <w:r>
+              <w:rPr>
+                <w:rFonts w:ascii="Calibri" w:cs="Calibri" w:eastAsia="Calibri" w:hAnsi="Calibri"/>
+                <w:sz w:val="20"/>
+                <w:szCs w:val="20"/>
+              </w:rPr>
+              <w:t xml:space="preserve">Refused with "Make the password Strong to save it."; the meter under the field shows the level and tip; a Strong temporary password works</w:t>
             </w:r>
           </w:p>
         </w:tc>
@@ -14109,7 +15553,7 @@
           </w:tcPr>
           <w:p>
             <w:pPr>
-              <w:keepNext w:val="false"/>
+              <w:keepNext/>
               <w:spacing w:after="0" w:before="0"/>
             </w:pPr>
             <w:r>
@@ -14141,7 +15585,7 @@
           </w:tcPr>
           <w:p>
             <w:pPr>
-              <w:keepNext w:val="false"/>
+              <w:keepNext/>
               <w:spacing w:after="0" w:before="0"/>
             </w:pPr>
             <w:r>
@@ -14181,6 +15625,290 @@
           </w:tcPr>
           <w:p>
             <w:pPr>
+              <w:keepNext/>
+              <w:spacing w:after="0" w:before="0"/>
+            </w:pPr>
+            <w:r>
+              <w:rPr>
+                <w:rFonts w:ascii="Calibri" w:cs="Calibri" w:eastAsia="Calibri" w:hAnsi="Calibri"/>
+                <w:sz w:val="20"/>
+                <w:szCs w:val="20"/>
+              </w:rPr>
+              <w:t xml:space="preserve">404 page with Go back home</w:t>
+            </w:r>
+          </w:p>
+        </w:tc>
+        <w:tc>
+          <w:tcPr>
+            <w:tcW w:type="dxa" w:w="4900"/>
+            <w:tcBorders>
+              <w:top w:val="single" w:color="B8C2D0" w:sz="4"/>
+              <w:left w:val="single" w:color="B8C2D0" w:sz="4"/>
+              <w:bottom w:val="single" w:color="B8C2D0" w:sz="4"/>
+              <w:right w:val="single" w:color="B8C2D0" w:sz="4"/>
+            </w:tcBorders>
+            <w:tcMar>
+              <w:top w:type="dxa" w:w="60"/>
+              <w:left w:type="dxa" w:w="100"/>
+              <w:bottom w:type="dxa" w:w="60"/>
+              <w:right w:type="dxa" w:w="100"/>
+            </w:tcMar>
+            <w:vAlign w:val="top"/>
+          </w:tcPr>
+          <w:p>
+            <w:pPr>
+              <w:keepNext/>
+              <w:spacing w:after="0" w:before="0"/>
+            </w:pPr>
+          </w:p>
+        </w:tc>
+        <w:tc>
+          <w:tcPr>
+            <w:tcW w:type="dxa" w:w="1520"/>
+            <w:tcBorders>
+              <w:top w:val="single" w:color="B8C2D0" w:sz="4"/>
+              <w:left w:val="single" w:color="B8C2D0" w:sz="4"/>
+              <w:bottom w:val="single" w:color="B8C2D0" w:sz="4"/>
+              <w:right w:val="single" w:color="B8C2D0" w:sz="4"/>
+            </w:tcBorders>
+            <w:tcMar>
+              <w:top w:type="dxa" w:w="60"/>
+              <w:left w:type="dxa" w:w="100"/>
+              <w:bottom w:type="dxa" w:w="60"/>
+              <w:right w:type="dxa" w:w="100"/>
+            </w:tcMar>
+            <w:vAlign w:val="top"/>
+          </w:tcPr>
+          <w:p>
+            <w:pPr>
+              <w:keepNext/>
+              <w:spacing w:after="0" w:before="0"/>
+            </w:pPr>
+          </w:p>
+        </w:tc>
+      </w:tr>
+      <w:tr>
+        <w:trPr>
+          <w:cantSplit/>
+          <w:trHeight w:val="650" w:hRule="atLeast"/>
+        </w:trPr>
+        <w:tc>
+          <w:tcPr>
+            <w:tcW w:type="dxa" w:w="1300"/>
+            <w:tcBorders>
+              <w:top w:val="single" w:color="B8C2D0" w:sz="4"/>
+              <w:left w:val="single" w:color="B8C2D0" w:sz="4"/>
+              <w:bottom w:val="single" w:color="B8C2D0" w:sz="4"/>
+              <w:right w:val="single" w:color="B8C2D0" w:sz="4"/>
+            </w:tcBorders>
+            <w:tcMar>
+              <w:top w:type="dxa" w:w="60"/>
+              <w:left w:type="dxa" w:w="100"/>
+              <w:bottom w:type="dxa" w:w="60"/>
+              <w:right w:type="dxa" w:w="100"/>
+            </w:tcMar>
+            <w:vAlign w:val="top"/>
+          </w:tcPr>
+          <w:p>
+            <w:pPr>
+              <w:keepNext/>
+              <w:spacing w:after="0" w:before="0"/>
+            </w:pPr>
+            <w:r>
+              <w:rPr>
+                <w:rFonts w:ascii="Calibri" w:cs="Calibri" w:eastAsia="Calibri" w:hAnsi="Calibri"/>
+                <w:sz w:val="20"/>
+                <w:szCs w:val="20"/>
+              </w:rPr>
+              <w:t xml:space="preserve">TC-P.5</w:t>
+            </w:r>
+          </w:p>
+        </w:tc>
+        <w:tc>
+          <w:tcPr>
+            <w:tcW w:type="dxa" w:w="5500"/>
+            <w:tcBorders>
+              <w:top w:val="single" w:color="B8C2D0" w:sz="4"/>
+              <w:left w:val="single" w:color="B8C2D0" w:sz="4"/>
+              <w:bottom w:val="single" w:color="B8C2D0" w:sz="4"/>
+              <w:right w:val="single" w:color="B8C2D0" w:sz="4"/>
+            </w:tcBorders>
+            <w:tcMar>
+              <w:top w:type="dxa" w:w="60"/>
+              <w:left w:type="dxa" w:w="100"/>
+              <w:bottom w:type="dxa" w:w="60"/>
+              <w:right w:type="dxa" w:w="100"/>
+            </w:tcMar>
+            <w:vAlign w:val="top"/>
+          </w:tcPr>
+          <w:p>
+            <w:pPr>
+              <w:keepNext/>
+              <w:spacing w:after="0" w:before="0"/>
+            </w:pPr>
+            <w:r>
+              <w:rPr>
+                <w:rFonts w:ascii="Calibri" w:cs="Calibri" w:eastAsia="Calibri" w:hAnsi="Calibri"/>
+                <w:sz w:val="20"/>
+                <w:szCs w:val="20"/>
+              </w:rPr>
+              <w:t xml:space="preserve">Web: landing footer and About block, </w:t>
+            </w:r>
+            <w:r>
+              <w:rPr>
+                <w:rFonts w:ascii="Consolas" w:cs="Consolas" w:eastAsia="Consolas" w:hAnsi="Consolas"/>
+                <w:sz w:val="18"/>
+                <w:szCs w:val="18"/>
+              </w:rPr>
+              <w:t xml:space="preserve">/about</w:t>
+            </w:r>
+            <w:r>
+              <w:rPr>
+                <w:rFonts w:ascii="Calibri" w:cs="Calibri" w:eastAsia="Calibri" w:hAnsi="Calibri"/>
+                <w:sz w:val="20"/>
+                <w:szCs w:val="20"/>
+              </w:rPr>
+              <w:t xml:space="preserve">, and the staff About (</w:t>
+            </w:r>
+            <w:r>
+              <w:rPr>
+                <w:rFonts w:ascii="Consolas" w:cs="Consolas" w:eastAsia="Consolas" w:hAnsi="Consolas"/>
+                <w:sz w:val="18"/>
+                <w:szCs w:val="18"/>
+              </w:rPr>
+              <w:t xml:space="preserve">/admin/about</w:t>
+            </w:r>
+            <w:r>
+              <w:rPr>
+                <w:rFonts w:ascii="Calibri" w:cs="Calibri" w:eastAsia="Calibri" w:hAnsi="Calibri"/>
+                <w:sz w:val="20"/>
+                <w:szCs w:val="20"/>
+              </w:rPr>
+              <w:t xml:space="preserve">, </w:t>
+            </w:r>
+            <w:r>
+              <w:rPr>
+                <w:rFonts w:ascii="Consolas" w:cs="Consolas" w:eastAsia="Consolas" w:hAnsi="Consolas"/>
+                <w:sz w:val="18"/>
+                <w:szCs w:val="18"/>
+              </w:rPr>
+              <w:t xml:space="preserve">/officer/about</w:t>
+            </w:r>
+            <w:r>
+              <w:rPr>
+                <w:rFonts w:ascii="Calibri" w:cs="Calibri" w:eastAsia="Calibri" w:hAnsi="Calibri"/>
+                <w:sz w:val="20"/>
+                <w:szCs w:val="20"/>
+              </w:rPr>
+              <w:t xml:space="preserve">), in Light and Dark (#48, #49)</w:t>
+            </w:r>
+          </w:p>
+        </w:tc>
+        <w:tc>
+          <w:tcPr>
+            <w:tcW w:type="dxa" w:w="5500"/>
+            <w:tcBorders>
+              <w:top w:val="single" w:color="B8C2D0" w:sz="4"/>
+              <w:left w:val="single" w:color="B8C2D0" w:sz="4"/>
+              <w:bottom w:val="single" w:color="B8C2D0" w:sz="4"/>
+              <w:right w:val="single" w:color="B8C2D0" w:sz="4"/>
+            </w:tcBorders>
+            <w:tcMar>
+              <w:top w:type="dxa" w:w="60"/>
+              <w:left w:type="dxa" w:w="100"/>
+              <w:bottom w:type="dxa" w:w="60"/>
+              <w:right w:type="dxa" w:w="100"/>
+            </w:tcMar>
+            <w:vAlign w:val="top"/>
+          </w:tcPr>
+          <w:p>
+            <w:pPr>
+              <w:keepNext/>
+              <w:spacing w:after="0" w:before="0"/>
+            </w:pPr>
+            <w:r>
+              <w:rPr>
+                <w:rFonts w:ascii="Calibri" w:cs="Calibri" w:eastAsia="Calibri" w:hAnsi="Calibri"/>
+                <w:sz w:val="20"/>
+                <w:szCs w:val="20"/>
+              </w:rPr>
+              <w:t xml:space="preserve">No school, course or section wording anywhere; team shown with photos and titles (Project Lead &amp; Mobile, Web &amp; QA, Backend &amp; Database, Documentation); "Built with" shows 29 logos in 6 groups, each with its name; one-color logos (Express, JWT, Vercel, Render, GitHub, PDFKit, Aiven text) stay visible in Dark</w:t>
+            </w:r>
+          </w:p>
+        </w:tc>
+        <w:tc>
+          <w:tcPr>
+            <w:tcW w:type="dxa" w:w="4900"/>
+            <w:tcBorders>
+              <w:top w:val="single" w:color="B8C2D0" w:sz="4"/>
+              <w:left w:val="single" w:color="B8C2D0" w:sz="4"/>
+              <w:bottom w:val="single" w:color="B8C2D0" w:sz="4"/>
+              <w:right w:val="single" w:color="B8C2D0" w:sz="4"/>
+            </w:tcBorders>
+            <w:tcMar>
+              <w:top w:type="dxa" w:w="60"/>
+              <w:left w:type="dxa" w:w="100"/>
+              <w:bottom w:type="dxa" w:w="60"/>
+              <w:right w:type="dxa" w:w="100"/>
+            </w:tcMar>
+            <w:vAlign w:val="top"/>
+          </w:tcPr>
+          <w:p>
+            <w:pPr>
+              <w:keepNext/>
+              <w:spacing w:after="0" w:before="0"/>
+            </w:pPr>
+          </w:p>
+        </w:tc>
+        <w:tc>
+          <w:tcPr>
+            <w:tcW w:type="dxa" w:w="1520"/>
+            <w:tcBorders>
+              <w:top w:val="single" w:color="B8C2D0" w:sz="4"/>
+              <w:left w:val="single" w:color="B8C2D0" w:sz="4"/>
+              <w:bottom w:val="single" w:color="B8C2D0" w:sz="4"/>
+              <w:right w:val="single" w:color="B8C2D0" w:sz="4"/>
+            </w:tcBorders>
+            <w:tcMar>
+              <w:top w:type="dxa" w:w="60"/>
+              <w:left w:type="dxa" w:w="100"/>
+              <w:bottom w:type="dxa" w:w="60"/>
+              <w:right w:type="dxa" w:w="100"/>
+            </w:tcMar>
+            <w:vAlign w:val="top"/>
+          </w:tcPr>
+          <w:p>
+            <w:pPr>
+              <w:keepNext/>
+              <w:spacing w:after="0" w:before="0"/>
+            </w:pPr>
+          </w:p>
+        </w:tc>
+      </w:tr>
+      <w:tr>
+        <w:trPr>
+          <w:cantSplit/>
+          <w:trHeight w:val="650" w:hRule="atLeast"/>
+        </w:trPr>
+        <w:tc>
+          <w:tcPr>
+            <w:tcW w:type="dxa" w:w="1300"/>
+            <w:tcBorders>
+              <w:top w:val="single" w:color="B8C2D0" w:sz="4"/>
+              <w:left w:val="single" w:color="B8C2D0" w:sz="4"/>
+              <w:bottom w:val="single" w:color="B8C2D0" w:sz="4"/>
+              <w:right w:val="single" w:color="B8C2D0" w:sz="4"/>
+            </w:tcBorders>
+            <w:tcMar>
+              <w:top w:type="dxa" w:w="60"/>
+              <w:left w:type="dxa" w:w="100"/>
+              <w:bottom w:type="dxa" w:w="60"/>
+              <w:right w:type="dxa" w:w="100"/>
+            </w:tcMar>
+            <w:vAlign w:val="top"/>
+          </w:tcPr>
+          <w:p>
+            <w:pPr>
               <w:keepNext w:val="false"/>
               <w:spacing w:after="0" w:before="0"/>
             </w:pPr>
@@ -14190,7 +15918,71 @@
                 <w:sz w:val="20"/>
                 <w:szCs w:val="20"/>
               </w:rPr>
-              <w:t xml:space="preserve">404 page with Go back home</w:t>
+              <w:t xml:space="preserve">TC-P.6</w:t>
+            </w:r>
+          </w:p>
+        </w:tc>
+        <w:tc>
+          <w:tcPr>
+            <w:tcW w:type="dxa" w:w="5500"/>
+            <w:tcBorders>
+              <w:top w:val="single" w:color="B8C2D0" w:sz="4"/>
+              <w:left w:val="single" w:color="B8C2D0" w:sz="4"/>
+              <w:bottom w:val="single" w:color="B8C2D0" w:sz="4"/>
+              <w:right w:val="single" w:color="B8C2D0" w:sz="4"/>
+            </w:tcBorders>
+            <w:tcMar>
+              <w:top w:type="dxa" w:w="60"/>
+              <w:left w:type="dxa" w:w="100"/>
+              <w:bottom w:type="dxa" w:w="60"/>
+              <w:right w:type="dxa" w:w="100"/>
+            </w:tcMar>
+            <w:vAlign w:val="top"/>
+          </w:tcPr>
+          <w:p>
+            <w:pPr>
+              <w:keepNext w:val="false"/>
+              <w:spacing w:after="0" w:before="0"/>
+            </w:pPr>
+            <w:r>
+              <w:rPr>
+                <w:rFonts w:ascii="Calibri" w:cs="Calibri" w:eastAsia="Calibri" w:hAnsi="Calibri"/>
+                <w:sz w:val="20"/>
+                <w:szCs w:val="20"/>
+              </w:rPr>
+              <w:t xml:space="preserve">Mobile: Settings (version row), Settings &gt; About RoadWatch, Settings &gt; Demo video, in Light and Dark (#48, #49)</w:t>
+            </w:r>
+          </w:p>
+        </w:tc>
+        <w:tc>
+          <w:tcPr>
+            <w:tcW w:type="dxa" w:w="5500"/>
+            <w:tcBorders>
+              <w:top w:val="single" w:color="B8C2D0" w:sz="4"/>
+              <w:left w:val="single" w:color="B8C2D0" w:sz="4"/>
+              <w:bottom w:val="single" w:color="B8C2D0" w:sz="4"/>
+              <w:right w:val="single" w:color="B8C2D0" w:sz="4"/>
+            </w:tcBorders>
+            <w:tcMar>
+              <w:top w:type="dxa" w:w="60"/>
+              <w:left w:type="dxa" w:w="100"/>
+              <w:bottom w:type="dxa" w:w="60"/>
+              <w:right w:type="dxa" w:w="100"/>
+            </w:tcMar>
+            <w:vAlign w:val="top"/>
+          </w:tcPr>
+          <w:p>
+            <w:pPr>
+              <w:keepNext w:val="false"/>
+              <w:spacing w:after="0" w:before="0"/>
+            </w:pPr>
+            <w:r>
+              <w:rPr>
+                <w:rFonts w:ascii="Calibri" w:cs="Calibri" w:eastAsia="Calibri" w:hAnsi="Calibri"/>
+                <w:sz w:val="20"/>
+                <w:szCs w:val="20"/>
+              </w:rPr>
+              <w:t xml:space="preserve">Version row says only "Version 1.0.3"; About has the 911 disclaimer and the Built with card (3 tiles per row); the demo caption is "RoadWatch product demo"</w:t>
             </w:r>
           </w:p>
         </w:tc>
@@ -17294,8 +19086,8 @@
       </w:pPr>
     </w:p>
     <w:sectPr>
-      <w:headerReference w:type="default" r:id="rId7"/>
-      <w:footerReference w:type="default" r:id="rId8"/>
+      <w:headerReference w:type="default" r:id="rId6"/>
+      <w:footerReference w:type="default" r:id="rId7"/>
       <w:pgSz w:w="20160" w:h="12240" w:orient="landscape"/>
       <w:pgMar w:top="720" w:right="720" w:bottom="720" w:left="720" w:header="360" w:footer="360" w:gutter="0"/>
       <w:pgNumType/>
@@ -17303,10 +19095,6 @@
     </w:sectPr>
   </w:body>
 </w:document>
-</file>
-
-<file path=word/comments.xml><?xml version="1.0" encoding="utf-8"?>
-<w:comments xmlns:cx="http://schemas.microsoft.com/office/drawing/2014/chartex" xmlns:cx1="http://schemas.microsoft.com/office/drawing/2015/9/8/chartex" xmlns:cx2="http://schemas.microsoft.com/office/drawing/2015/10/21/chartex" xmlns:cx3="http://schemas.microsoft.com/office/drawing/2016/5/9/chartex" xmlns:cx4="http://schemas.microsoft.com/office/drawing/2016/5/10/chartex" xmlns:cx5="http://schemas.microsoft.com/office/drawing/2016/5/11/chartex" xmlns:cx6="http://schemas.microsoft.com/office/drawing/2016/5/12/chartex" xmlns:cx7="http://schemas.microsoft.com/office/drawing/2016/5/13/chartex" xmlns:cx8="http://schemas.microsoft.com/office/drawing/2016/5/14/chartex" xmlns:mc="http://schemas.openxmlformats.org/markup-compatibility/2006" xmlns:aink="http://schemas.microsoft.com/office/drawing/2016/ink" xmlns:am3d="http://schemas.microsoft.com/office/drawing/2017/model3d" xmlns:o="urn:schemas-microsoft-com:office:office" xmlns:r="http://schemas.openxmlformats.org/officeDocument/2006/relationships" xmlns:m="http://schemas.openxmlformats.org/officeDocument/2006/math" xmlns:v="urn:schemas-microsoft-com:vml" xmlns:wp14="http://schemas.microsoft.com/office/word/2010/wordprocessingDrawing" xmlns:wp="http://schemas.openxmlformats.org/drawingml/2006/wordprocessingDrawing" xmlns:w10="urn:schemas-microsoft-com:office:word" xmlns:w="http://schemas.openxmlformats.org/wordprocessingml/2006/main" xmlns:w14="http://schemas.microsoft.com/office/word/2010/wordml" xmlns:w15="http://schemas.microsoft.com/office/word/2012/wordml" xmlns:w16cex="http://schemas.microsoft.com/office/word/2018/wordml/cex" xmlns:w16cid="http://schemas.microsoft.com/office/word/2016/wordml/cid" xmlns:w16="http://schemas.microsoft.com/office/word/2018/wordml" xmlns:w16sdtdh="http://schemas.microsoft.com/office/word/2020/wordml/sdtdatahash" xmlns:w16se="http://schemas.microsoft.com/office/word/2015/wordml/symex" xmlns:wpg="http://schemas.microsoft.com/office/word/2010/wordprocessingGroup" xmlns:wpi="http://schemas.microsoft.com/office/word/2010/wordprocessingInk" xmlns:wne="http://schemas.microsoft.com/office/word/2006/wordml" xmlns:wps="http://schemas.microsoft.com/office/word/2010/wordprocessingShape"/>
 </file>
 
 <file path=word/endnotes.xml><?xml version="1.0" encoding="utf-8"?>
@@ -17370,8 +19158,32 @@
         <w:szCs w:val="16"/>
       </w:rPr>
       <w:fldChar w:fldCharType="begin"/>
+    </w:r>
+    <w:r>
+      <w:rPr>
+        <w:rFonts w:ascii="Calibri" w:cs="Calibri" w:eastAsia="Calibri" w:hAnsi="Calibri"/>
+        <w:color w:val="5B6B80"/>
+        <w:sz w:val="16"/>
+        <w:szCs w:val="16"/>
+      </w:rPr>
       <w:instrText xml:space="preserve">PAGE</w:instrText>
+    </w:r>
+    <w:r>
+      <w:rPr>
+        <w:rFonts w:ascii="Calibri" w:cs="Calibri" w:eastAsia="Calibri" w:hAnsi="Calibri"/>
+        <w:color w:val="5B6B80"/>
+        <w:sz w:val="16"/>
+        <w:szCs w:val="16"/>
+      </w:rPr>
       <w:fldChar w:fldCharType="separate"/>
+    </w:r>
+    <w:r>
+      <w:rPr>
+        <w:rFonts w:ascii="Calibri" w:cs="Calibri" w:eastAsia="Calibri" w:hAnsi="Calibri"/>
+        <w:color w:val="5B6B80"/>
+        <w:sz w:val="16"/>
+        <w:szCs w:val="16"/>
+      </w:rPr>
       <w:fldChar w:fldCharType="end"/>
     </w:r>
     <w:r>
@@ -17391,8 +19203,32 @@
         <w:szCs w:val="16"/>
       </w:rPr>
       <w:fldChar w:fldCharType="begin"/>
+    </w:r>
+    <w:r>
+      <w:rPr>
+        <w:rFonts w:ascii="Calibri" w:cs="Calibri" w:eastAsia="Calibri" w:hAnsi="Calibri"/>
+        <w:color w:val="5B6B80"/>
+        <w:sz w:val="16"/>
+        <w:szCs w:val="16"/>
+      </w:rPr>
       <w:instrText xml:space="preserve">NUMPAGES</w:instrText>
+    </w:r>
+    <w:r>
+      <w:rPr>
+        <w:rFonts w:ascii="Calibri" w:cs="Calibri" w:eastAsia="Calibri" w:hAnsi="Calibri"/>
+        <w:color w:val="5B6B80"/>
+        <w:sz w:val="16"/>
+        <w:szCs w:val="16"/>
+      </w:rPr>
       <w:fldChar w:fldCharType="separate"/>
+    </w:r>
+    <w:r>
+      <w:rPr>
+        <w:rFonts w:ascii="Calibri" w:cs="Calibri" w:eastAsia="Calibri" w:hAnsi="Calibri"/>
+        <w:color w:val="5B6B80"/>
+        <w:sz w:val="16"/>
+        <w:szCs w:val="16"/>
+      </w:rPr>
       <w:fldChar w:fldCharType="end"/>
     </w:r>
   </w:p>
@@ -17459,7 +19295,7 @@
 <w:numbering xmlns:wpc="http://schemas.microsoft.com/office/word/2010/wordprocessingCanvas" xmlns:mc="http://schemas.openxmlformats.org/markup-compatibility/2006" xmlns:o="urn:schemas-microsoft-com:office:office" xmlns:r="http://schemas.openxmlformats.org/officeDocument/2006/relationships" xmlns:m="http://schemas.openxmlformats.org/officeDocument/2006/math" xmlns:v="urn:schemas-microsoft-com:vml" xmlns:wp14="http://schemas.microsoft.com/office/word/2010/wordprocessingDrawing" xmlns:wp="http://schemas.openxmlformats.org/drawingml/2006/wordprocessingDrawing" xmlns:w10="urn:schemas-microsoft-com:office:word" xmlns:w="http://schemas.openxmlformats.org/wordprocessingml/2006/main" xmlns:w14="http://schemas.microsoft.com/office/word/2010/wordml" xmlns:w15="http://schemas.microsoft.com/office/word/2012/wordml" xmlns:wpg="http://schemas.microsoft.com/office/word/2010/wordprocessingGroup" xmlns:wpi="http://schemas.microsoft.com/office/word/2010/wordprocessingInk" xmlns:wne="http://schemas.microsoft.com/office/word/2006/wordml" xmlns:wps="http://schemas.microsoft.com/office/word/2010/wordprocessingShape" mc:Ignorable="w14 w15 wp14">
   <w:abstractNum w:abstractNumId="1" w15:restartNumberingAfterBreak="0">
     <w:multiLevelType w:val="hybridMultilevel"/>
-    <w:lvl w:ilvl="0" w15:tentative="1">
+    <w:lvl w:ilvl="0" w:tentative="1">
       <w:start w:val="1"/>
       <w:numFmt w:val="bullet"/>
       <w:lvlText w:val="●"/>
@@ -17468,7 +19304,7 @@
         <w:ind w:left="720" w:hanging="360"/>
       </w:pPr>
     </w:lvl>
-    <w:lvl w:ilvl="1" w15:tentative="1">
+    <w:lvl w:ilvl="1" w:tentative="1">
       <w:start w:val="1"/>
       <w:numFmt w:val="bullet"/>
       <w:lvlText w:val="○"/>
@@ -17477,7 +19313,7 @@
         <w:ind w:left="1440" w:hanging="360"/>
       </w:pPr>
     </w:lvl>
-    <w:lvl w:ilvl="2" w15:tentative="1">
+    <w:lvl w:ilvl="2" w:tentative="1">
       <w:start w:val="1"/>
       <w:numFmt w:val="bullet"/>
       <w:lvlText w:val="■"/>
@@ -17486,7 +19322,7 @@
         <w:ind w:left="2160" w:hanging="360"/>
       </w:pPr>
     </w:lvl>
-    <w:lvl w:ilvl="3" w15:tentative="1">
+    <w:lvl w:ilvl="3" w:tentative="1">
       <w:start w:val="1"/>
       <w:numFmt w:val="bullet"/>
       <w:lvlText w:val="●"/>
@@ -17495,7 +19331,7 @@
         <w:ind w:left="2880" w:hanging="360"/>
       </w:pPr>
     </w:lvl>
-    <w:lvl w:ilvl="4" w15:tentative="1">
+    <w:lvl w:ilvl="4" w:tentative="1">
       <w:start w:val="1"/>
       <w:numFmt w:val="bullet"/>
       <w:lvlText w:val="○"/>
@@ -17504,7 +19340,7 @@
         <w:ind w:left="3600" w:hanging="360"/>
       </w:pPr>
     </w:lvl>
-    <w:lvl w:ilvl="5" w15:tentative="1">
+    <w:lvl w:ilvl="5" w:tentative="1">
       <w:start w:val="1"/>
       <w:numFmt w:val="bullet"/>
       <w:lvlText w:val="■"/>
@@ -17513,7 +19349,7 @@
         <w:ind w:left="4320" w:hanging="360"/>
       </w:pPr>
     </w:lvl>
-    <w:lvl w:ilvl="6" w15:tentative="1">
+    <w:lvl w:ilvl="6" w:tentative="1">
       <w:start w:val="1"/>
       <w:numFmt w:val="bullet"/>
       <w:lvlText w:val="●"/>
@@ -17522,7 +19358,7 @@
         <w:ind w:left="5040" w:hanging="360"/>
       </w:pPr>
     </w:lvl>
-    <w:lvl w:ilvl="7" w15:tentative="1">
+    <w:lvl w:ilvl="7" w:tentative="1">
       <w:start w:val="1"/>
       <w:numFmt w:val="bullet"/>
       <w:lvlText w:val="●"/>
@@ -17531,7 +19367,7 @@
         <w:ind w:left="5760" w:hanging="360"/>
       </w:pPr>
     </w:lvl>
-    <w:lvl w:ilvl="8" w15:tentative="1">
+    <w:lvl w:ilvl="8" w:tentative="1">
       <w:start w:val="1"/>
       <w:numFmt w:val="bullet"/>
       <w:lvlText w:val="●"/>
@@ -17563,37 +19399,24 @@
     </w:rPrDefault>
     <w:pPrDefault/>
   </w:docDefaults>
-  <w:style w:type="paragraph" w:styleId="Title">
-    <w:name w:val="Title"/>
-    <w:basedOn w:val="Normal"/>
-    <w:next w:val="Normal"/>
+  <w:style w:type="paragraph" w:styleId="Normal" w:default="1">
+    <w:name w:val="Normal"/>
     <w:qFormat/>
-    <w:rPr>
-      <w:sz w:val="56"/>
-      <w:szCs w:val="56"/>
-    </w:rPr>
   </w:style>
-  <w:style w:type="paragraph" w:styleId="Heading1">
-    <w:name w:val="Heading 1"/>
-    <w:basedOn w:val="Normal"/>
-    <w:next w:val="Normal"/>
-    <w:qFormat/>
-    <w:rPr>
-      <w:color w:val="2E74B5"/>
-      <w:sz w:val="32"/>
-      <w:szCs w:val="32"/>
-    </w:rPr>
-  </w:style>
-  <w:style w:type="paragraph" w:styleId="Heading2">
-    <w:name w:val="Heading 2"/>
-    <w:basedOn w:val="Normal"/>
-    <w:next w:val="Normal"/>
-    <w:qFormat/>
-    <w:rPr>
-      <w:color w:val="2E74B5"/>
-      <w:sz w:val="26"/>
-      <w:szCs w:val="26"/>
-    </w:rPr>
+  <w:style w:type="table" w:styleId="TableNormal" w:default="true">
+    <w:name w:val="Normal Table"/>
+    <w:uiPriority w:val="99"/>
+    <w:semiHidden/>
+    <w:unhideWhenUsed/>
+    <w:tblPr>
+      <w:tblInd w:type="dxa" w:w="0"/>
+      <w:tblCellMar>
+        <w:top w:type="dxa" w:w="0"/>
+        <w:left w:type="dxa" w:w="108"/>
+        <w:bottom w:type="dxa" w:w="0"/>
+        <w:right w:type="dxa" w:w="108"/>
+      </w:tblCellMar>
+    </w:tblPr>
   </w:style>
   <w:style w:type="paragraph" w:styleId="Heading3">
     <w:name w:val="Heading 3"/>
@@ -17649,6 +19472,139 @@
     <w:name w:val="List Paragraph"/>
     <w:basedOn w:val="Normal"/>
     <w:qFormat/>
+  </w:style>
+  <w:style w:type="paragraph" w:styleId="Caption">
+    <w:name w:val="caption"/>
+    <w:basedOn w:val="Normal"/>
+    <w:next w:val="Normal"/>
+    <w:uiPriority w:val="35"/>
+    <w:semiHidden/>
+    <w:unhideWhenUsed/>
+    <w:qFormat/>
+    <w:pPr>
+      <w:spacing w:after="200"/>
+    </w:pPr>
+    <w:rPr>
+      <w:i/>
+      <w:iCs/>
+      <w:color w:val="44546A" w:themeColor="dark2"/>
+      <w:sz w:val="18"/>
+      <w:szCs w:val="18"/>
+    </w:rPr>
+  </w:style>
+  <w:style w:type="paragraph" w:styleId="Bibliography">
+    <w:name w:val="Bibliography"/>
+    <w:basedOn w:val="Normal"/>
+    <w:next w:val="Normal"/>
+    <w:uiPriority w:val="37"/>
+    <w:unhideWhenUsed/>
+  </w:style>
+  <w:style w:type="paragraph" w:styleId="TOC1">
+    <w:name w:val="toc 1"/>
+    <w:basedOn w:val="Normal"/>
+    <w:next w:val="Normal"/>
+    <w:uiPriority w:val="39"/>
+    <w:semiHidden/>
+    <w:unhideWhenUsed/>
+    <w:pPr>
+      <w:spacing w:after="100"/>
+    </w:pPr>
+  </w:style>
+  <w:style w:type="paragraph" w:styleId="TOC2">
+    <w:name w:val="toc 2"/>
+    <w:basedOn w:val="Normal"/>
+    <w:next w:val="Normal"/>
+    <w:uiPriority w:val="39"/>
+    <w:semiHidden/>
+    <w:unhideWhenUsed/>
+    <w:pPr>
+      <w:spacing w:after="100"/>
+      <w:ind w:left="220"/>
+    </w:pPr>
+  </w:style>
+  <w:style w:type="paragraph" w:styleId="TOC3">
+    <w:name w:val="toc 3"/>
+    <w:basedOn w:val="Normal"/>
+    <w:next w:val="Normal"/>
+    <w:uiPriority w:val="39"/>
+    <w:semiHidden/>
+    <w:unhideWhenUsed/>
+    <w:pPr>
+      <w:spacing w:after="100"/>
+      <w:ind w:left="440"/>
+    </w:pPr>
+  </w:style>
+  <w:style w:type="paragraph" w:styleId="TOC4">
+    <w:name w:val="toc 4"/>
+    <w:basedOn w:val="Normal"/>
+    <w:next w:val="Normal"/>
+    <w:uiPriority w:val="39"/>
+    <w:semiHidden/>
+    <w:unhideWhenUsed/>
+    <w:pPr>
+      <w:spacing w:after="100"/>
+      <w:ind w:left="660"/>
+    </w:pPr>
+  </w:style>
+  <w:style w:type="paragraph" w:styleId="TOC5">
+    <w:name w:val="toc 5"/>
+    <w:basedOn w:val="Normal"/>
+    <w:next w:val="Normal"/>
+    <w:uiPriority w:val="39"/>
+    <w:semiHidden/>
+    <w:unhideWhenUsed/>
+    <w:pPr>
+      <w:spacing w:after="100"/>
+      <w:ind w:left="880"/>
+    </w:pPr>
+  </w:style>
+  <w:style w:type="paragraph" w:styleId="TOC6">
+    <w:name w:val="toc 6"/>
+    <w:basedOn w:val="Normal"/>
+    <w:next w:val="Normal"/>
+    <w:uiPriority w:val="39"/>
+    <w:semiHidden/>
+    <w:unhideWhenUsed/>
+    <w:pPr>
+      <w:spacing w:after="100"/>
+      <w:ind w:left="1100"/>
+    </w:pPr>
+  </w:style>
+  <w:style w:type="paragraph" w:styleId="TOC7">
+    <w:name w:val="toc 7"/>
+    <w:basedOn w:val="Normal"/>
+    <w:next w:val="Normal"/>
+    <w:uiPriority w:val="39"/>
+    <w:semiHidden/>
+    <w:unhideWhenUsed/>
+    <w:pPr>
+      <w:spacing w:after="100"/>
+      <w:ind w:left="1320"/>
+    </w:pPr>
+  </w:style>
+  <w:style w:type="paragraph" w:styleId="TOC8">
+    <w:name w:val="toc 8"/>
+    <w:basedOn w:val="Normal"/>
+    <w:next w:val="Normal"/>
+    <w:uiPriority w:val="39"/>
+    <w:semiHidden/>
+    <w:unhideWhenUsed/>
+    <w:pPr>
+      <w:spacing w:after="100"/>
+      <w:ind w:left="1540"/>
+    </w:pPr>
+  </w:style>
+  <w:style w:type="paragraph" w:styleId="TOC9">
+    <w:name w:val="toc 9"/>
+    <w:basedOn w:val="Normal"/>
+    <w:next w:val="Normal"/>
+    <w:uiPriority w:val="39"/>
+    <w:semiHidden/>
+    <w:unhideWhenUsed/>
+    <w:pPr>
+      <w:spacing w:after="100"/>
+      <w:ind w:left="1760"/>
+    </w:pPr>
   </w:style>
   <w:style w:type="character" w:styleId="Hyperlink">
     <w:name w:val="Hyperlink"/>
@@ -17734,6 +19690,13 @@
       <w:szCs w:val="20"/>
     </w:rPr>
   </w:style>
+  <w:style w:type="character" w:styleId="LineNumber">
+    <w:name w:val="line number"/>
+    <w:basedOn w:val="DefaultParagraphFont"/>
+    <w:uiPriority w:val="99"/>
+    <w:semiHidden/>
+    <w:unhideWhenUsed/>
+  </w:style>
   <w:style w:type="paragraph" w:styleId="RwFooter">
     <w:name w:val="RW Footer"/>
     <w:basedOn w:val="Normal"/>
@@ -17797,4 +19760,294 @@
     </w:rPr>
   </w:style>
 </w:styles>
+</file>
+
+<file path=word/theme/theme1.xml><?xml version="1.0" encoding="utf-8"?>
+<a:theme xmlns:a="http://schemas.openxmlformats.org/drawingml/2006/main" name="Office Theme">
+  <a:themeElements>
+    <a:clrScheme name="Office">
+      <a:dk1>
+        <a:sysClr val="windowText" lastClr="000000"/>
+      </a:dk1>
+      <a:lt1>
+        <a:sysClr val="window" lastClr="FFFFFF"/>
+      </a:lt1>
+      <a:dk2>
+        <a:srgbClr val="44546A"/>
+      </a:dk2>
+      <a:lt2>
+        <a:srgbClr val="E7E6E6"/>
+      </a:lt2>
+      <a:accent1>
+        <a:srgbClr val="4472C4"/>
+      </a:accent1>
+      <a:accent2>
+        <a:srgbClr val="ED7D31"/>
+      </a:accent2>
+      <a:accent3>
+        <a:srgbClr val="A5A5A5"/>
+      </a:accent3>
+      <a:accent4>
+        <a:srgbClr val="FFC000"/>
+      </a:accent4>
+      <a:accent5>
+        <a:srgbClr val="5B9BD5"/>
+      </a:accent5>
+      <a:accent6>
+        <a:srgbClr val="70AD47"/>
+      </a:accent6>
+      <a:hlink>
+        <a:srgbClr val="0563C1"/>
+      </a:hlink>
+      <a:folHlink>
+        <a:srgbClr val="954F72"/>
+      </a:folHlink>
+    </a:clrScheme>
+    <a:fontScheme name="Office">
+      <a:majorFont>
+        <a:latin typeface="Calibri Light" panose="020F0302020204030204"/>
+        <a:ea typeface=""/>
+        <a:cs typeface=""/>
+        <a:font script="Jpan" typeface="游ゴシック Light"/>
+        <a:font script="Hang" typeface="맑은 고딕"/>
+        <a:font script="Hans" typeface="等线 Light"/>
+        <a:font script="Hant" typeface="新細明體"/>
+        <a:font script="Arab" typeface="Times New Roman"/>
+        <a:font script="Hebr" typeface="Times New Roman"/>
+        <a:font script="Thai" typeface="Angsana New"/>
+        <a:font script="Ethi" typeface="Nyala"/>
+        <a:font script="Beng" typeface="Vrinda"/>
+        <a:font script="Gujr" typeface="Shruti"/>
+        <a:font script="Khmr" typeface="MoolBoran"/>
+        <a:font script="Knda" typeface="Tunga"/>
+        <a:font script="Guru" typeface="Raavi"/>
+        <a:font script="Cans" typeface="Euphemia"/>
+        <a:font script="Cher" typeface="Plantagenet Cherokee"/>
+        <a:font script="Yiii" typeface="Microsoft Yi Baiti"/>
+        <a:font script="Tibt" typeface="Microsoft Himalaya"/>
+        <a:font script="Thaa" typeface="MV Boli"/>
+        <a:font script="Deva" typeface="Mangal"/>
+        <a:font script="Telu" typeface="Gautami"/>
+        <a:font script="Taml" typeface="Latha"/>
+        <a:font script="Syrc" typeface="Estrangelo Edessa"/>
+        <a:font script="Orya" typeface="Kalinga"/>
+        <a:font script="Mlym" typeface="Kartika"/>
+        <a:font script="Laoo" typeface="DokChampa"/>
+        <a:font script="Sinh" typeface="Iskoola Pota"/>
+        <a:font script="Mong" typeface="Mongolian Baiti"/>
+        <a:font script="Viet" typeface="Times New Roman"/>
+        <a:font script="Uigh" typeface="Microsoft Uighur"/>
+        <a:font script="Geor" typeface="Sylfaen"/>
+        <a:font script="Armn" typeface="Arial"/>
+        <a:font script="Bugi" typeface="Leelawadee UI"/>
+        <a:font script="Bopo" typeface="Microsoft JhengHei"/>
+        <a:font script="Java" typeface="Javanese Text"/>
+        <a:font script="Lisu" typeface="Segoe UI"/>
+        <a:font script="Mymr" typeface="Myanmar Text"/>
+        <a:font script="Nkoo" typeface="Ebrima"/>
+        <a:font script="Olck" typeface="Nirmala UI"/>
+        <a:font script="Osma" typeface="Ebrima"/>
+        <a:font script="Phag" typeface="Phagspa"/>
+        <a:font script="Syrn" typeface="Estrangelo Edessa"/>
+        <a:font script="Syrj" typeface="Estrangelo Edessa"/>
+        <a:font script="Syre" typeface="Estrangelo Edessa"/>
+        <a:font script="Sora" typeface="Nirmala UI"/>
+        <a:font script="Tale" typeface="Microsoft Tai Le"/>
+        <a:font script="Talu" typeface="Microsoft New Tai Lue"/>
+        <a:font script="Tfng" typeface="Ebrima"/>
+      </a:majorFont>
+      <a:minorFont>
+        <a:latin typeface="Calibri" panose="020F0502020204030204"/>
+        <a:ea typeface=""/>
+        <a:cs typeface=""/>
+        <a:font script="Jpan" typeface="游明朝"/>
+        <a:font script="Hang" typeface="맑은 고딕"/>
+        <a:font script="Hans" typeface="等线"/>
+        <a:font script="Hant" typeface="新細明體"/>
+        <a:font script="Arab" typeface="Arial"/>
+        <a:font script="Hebr" typeface="Arial"/>
+        <a:font script="Thai" typeface="Cordia New"/>
+        <a:font script="Ethi" typeface="Nyala"/>
+        <a:font script="Beng" typeface="Vrinda"/>
+        <a:font script="Gujr" typeface="Shruti"/>
+        <a:font script="Khmr" typeface="DaunPenh"/>
+        <a:font script="Knda" typeface="Tunga"/>
+        <a:font script="Guru" typeface="Raavi"/>
+        <a:font script="Cans" typeface="Euphemia"/>
+        <a:font script="Cher" typeface="Plantagenet Cherokee"/>
+        <a:font script="Yiii" typeface="Microsoft Yi Baiti"/>
+        <a:font script="Tibt" typeface="Microsoft Himalaya"/>
+        <a:font script="Thaa" typeface="MV Boli"/>
+        <a:font script="Deva" typeface="Mangal"/>
+        <a:font script="Telu" typeface="Gautami"/>
+        <a:font script="Taml" typeface="Latha"/>
+        <a:font script="Syrc" typeface="Estrangelo Edessa"/>
+        <a:font script="Orya" typeface="Kalinga"/>
+        <a:font script="Mlym" typeface="Kartika"/>
+        <a:font script="Laoo" typeface="DokChampa"/>
+        <a:font script="Sinh" typeface="Iskoola Pota"/>
+        <a:font script="Mong" typeface="Mongolian Baiti"/>
+        <a:font script="Viet" typeface="Arial"/>
+        <a:font script="Uigh" typeface="Microsoft Uighur"/>
+        <a:font script="Geor" typeface="Sylfaen"/>
+        <a:font script="Armn" typeface="Arial"/>
+        <a:font script="Bugi" typeface="Leelawadee UI"/>
+        <a:font script="Bopo" typeface="Microsoft JhengHei"/>
+        <a:font script="Java" typeface="Javanese Text"/>
+        <a:font script="Lisu" typeface="Segoe UI"/>
+        <a:font script="Mymr" typeface="Myanmar Text"/>
+        <a:font script="Nkoo" typeface="Ebrima"/>
+        <a:font script="Olck" typeface="Nirmala UI"/>
+        <a:font script="Osma" typeface="Ebrima"/>
+        <a:font script="Phag" typeface="Phagspa"/>
+        <a:font script="Syrn" typeface="Estrangelo Edessa"/>
+        <a:font script="Syrj" typeface="Estrangelo Edessa"/>
+        <a:font script="Syre" typeface="Estrangelo Edessa"/>
+        <a:font script="Sora" typeface="Nirmala UI"/>
+        <a:font script="Tale" typeface="Microsoft Tai Le"/>
+        <a:font script="Talu" typeface="Microsoft New Tai Lue"/>
+        <a:font script="Tfng" typeface="Ebrima"/>
+      </a:minorFont>
+    </a:fontScheme>
+    <a:fmtScheme name="Office">
+      <a:fillStyleLst>
+        <a:solidFill>
+          <a:schemeClr val="phClr"/>
+        </a:solidFill>
+        <a:gradFill rotWithShape="true">
+          <a:gsLst>
+            <a:gs pos="0">
+              <a:schemeClr val="phClr">
+                <a:lumMod val="110000"/>
+                <a:satMod val="105000"/>
+                <a:tint val="67000"/>
+              </a:schemeClr>
+            </a:gs>
+            <a:gs pos="50000">
+              <a:schemeClr val="phClr">
+                <a:lumMod val="105000"/>
+                <a:satMod val="103000"/>
+                <a:tint val="73000"/>
+              </a:schemeClr>
+            </a:gs>
+            <a:gs pos="100000">
+              <a:schemeClr val="phClr">
+                <a:lumMod val="105000"/>
+                <a:satMod val="109000"/>
+                <a:tint val="81000"/>
+              </a:schemeClr>
+            </a:gs>
+          </a:gsLst>
+          <a:lin ang="5400000" scaled="false"/>
+        </a:gradFill>
+        <a:gradFill rotWithShape="true">
+          <a:gsLst>
+            <a:gs pos="0">
+              <a:schemeClr val="phClr">
+                <a:satMod val="103000"/>
+                <a:lumMod val="102000"/>
+                <a:tint val="94000"/>
+              </a:schemeClr>
+            </a:gs>
+            <a:gs pos="50000">
+              <a:schemeClr val="phClr">
+                <a:satMod val="110000"/>
+                <a:lumMod val="100000"/>
+                <a:shade val="100000"/>
+              </a:schemeClr>
+            </a:gs>
+            <a:gs pos="100000">
+              <a:schemeClr val="phClr">
+                <a:lumMod val="99000"/>
+                <a:satMod val="120000"/>
+                <a:shade val="78000"/>
+              </a:schemeClr>
+            </a:gs>
+          </a:gsLst>
+          <a:lin ang="5400000" scaled="false"/>
+        </a:gradFill>
+      </a:fillStyleLst>
+      <a:lnStyleLst>
+        <a:ln w="6350" cap="flat" cmpd="sng" algn="ctr">
+          <a:solidFill>
+            <a:schemeClr val="phClr"/>
+          </a:solidFill>
+          <a:prstDash val="solid"/>
+          <a:miter lim="800000"/>
+        </a:ln>
+        <a:ln w="12700" cap="flat" cmpd="sng" algn="ctr">
+          <a:solidFill>
+            <a:schemeClr val="phClr"/>
+          </a:solidFill>
+          <a:prstDash val="solid"/>
+          <a:miter lim="800000"/>
+        </a:ln>
+        <a:ln w="19050" cap="flat" cmpd="sng" algn="ctr">
+          <a:solidFill>
+            <a:schemeClr val="phClr"/>
+          </a:solidFill>
+          <a:prstDash val="solid"/>
+          <a:miter lim="800000"/>
+        </a:ln>
+      </a:lnStyleLst>
+      <a:effectStyleLst>
+        <a:effectStyle>
+          <a:effectLst/>
+        </a:effectStyle>
+        <a:effectStyle>
+          <a:effectLst/>
+        </a:effectStyle>
+        <a:effectStyle>
+          <a:effectLst>
+            <a:outerShdw blurRad="57150" dist="19050" dir="5400000" algn="ctr" rotWithShape="false">
+              <a:srgbClr val="000000">
+                <a:alpha val="63000"/>
+              </a:srgbClr>
+            </a:outerShdw>
+          </a:effectLst>
+        </a:effectStyle>
+      </a:effectStyleLst>
+      <a:bgFillStyleLst>
+        <a:solidFill>
+          <a:schemeClr val="phClr"/>
+        </a:solidFill>
+        <a:solidFill>
+          <a:schemeClr val="phClr">
+            <a:tint val="95000"/>
+            <a:satMod val="170000"/>
+          </a:schemeClr>
+        </a:solidFill>
+        <a:gradFill rotWithShape="true">
+          <a:gsLst>
+            <a:gs pos="0">
+              <a:schemeClr val="phClr">
+                <a:tint val="93000"/>
+                <a:satMod val="150000"/>
+                <a:shade val="98000"/>
+                <a:lumMod val="102000"/>
+              </a:schemeClr>
+            </a:gs>
+            <a:gs pos="50000">
+              <a:schemeClr val="phClr">
+                <a:tint val="98000"/>
+                <a:satMod val="130000"/>
+                <a:shade val="90000"/>
+                <a:lumMod val="103000"/>
+              </a:schemeClr>
+            </a:gs>
+            <a:gs pos="100000">
+              <a:schemeClr val="phClr">
+                <a:shade val="63000"/>
+                <a:satMod val="120000"/>
+              </a:schemeClr>
+            </a:gs>
+          </a:gsLst>
+          <a:lin ang="5400000" scaled="false"/>
+        </a:gradFill>
+      </a:bgFillStyleLst>
+    </a:fmtScheme>
+  </a:themeElements>
+  <a:objectDefaults/>
+  <a:extraClrSchemeLst/>
+</a:theme>
 </file>
</xml_diff>

<commit_message>
docs: DECISIONS #48 (per-role demo clips, promo video, v1.1.0, domain, course work); release and submission checklists, domain steps (SETUP-GUIDE Part G), video production guide, test cases, Figma index and screens
</commit_message>
<xml_diff>
--- a/docs/RoadWatch-Test-Plan.docx
+++ b/docs/RoadWatch-Test-Plan.docx
@@ -15428,7 +15428,7 @@
                 <w:sz w:val="20"/>
                 <w:szCs w:val="20"/>
               </w:rPr>
-              <w:t xml:space="preserve">) and mobile (Settings &gt; Demo video)</w:t>
+              <w:t xml:space="preserve">) as an Administrator and as a Traffic Officer (#48)</w:t>
             </w:r>
           </w:p>
         </w:tc>
@@ -15460,23 +15460,7 @@
                 <w:sz w:val="20"/>
                 <w:szCs w:val="20"/>
               </w:rPr>
-              <w:t xml:space="preserve">Plays from </w:t>
-            </w:r>
-            <w:r>
-              <w:rPr>
-                <w:rFonts w:ascii="Consolas" w:cs="Consolas" w:eastAsia="Consolas" w:hAnsi="Consolas"/>
-                <w:sz w:val="18"/>
-                <w:szCs w:val="18"/>
-              </w:rPr>
-              <w:t xml:space="preserve">DEMO_VIDEO_URL</w:t>
-            </w:r>
-            <w:r>
-              <w:rPr>
-                <w:rFonts w:ascii="Calibri" w:cs="Calibri" w:eastAsia="Calibri" w:hAnsi="Calibri"/>
-                <w:sz w:val="20"/>
-                <w:szCs w:val="20"/>
-              </w:rPr>
-              <w:t xml:space="preserve">, or shows "Video coming soon" if not set</w:t>
+              <w:t xml:space="preserve">Two cards, Administrator and Traffic Officer, 30 seconds each; the signed-in role comes first with "Your role"; a clip plays from its Render URL with captions, "Transcript" opens the text; a clip without a URL says "Clip coming soon"</w:t>
             </w:r>
           </w:p>
         </w:tc>
@@ -15909,6 +15893,156 @@
           </w:tcPr>
           <w:p>
             <w:pPr>
+              <w:keepNext/>
+              <w:spacing w:after="0" w:before="0"/>
+            </w:pPr>
+            <w:r>
+              <w:rPr>
+                <w:rFonts w:ascii="Calibri" w:cs="Calibri" w:eastAsia="Calibri" w:hAnsi="Calibri"/>
+                <w:sz w:val="20"/>
+                <w:szCs w:val="20"/>
+              </w:rPr>
+              <w:t xml:space="preserve">TC-P.6</w:t>
+            </w:r>
+          </w:p>
+        </w:tc>
+        <w:tc>
+          <w:tcPr>
+            <w:tcW w:type="dxa" w:w="5500"/>
+            <w:tcBorders>
+              <w:top w:val="single" w:color="B8C2D0" w:sz="4"/>
+              <w:left w:val="single" w:color="B8C2D0" w:sz="4"/>
+              <w:bottom w:val="single" w:color="B8C2D0" w:sz="4"/>
+              <w:right w:val="single" w:color="B8C2D0" w:sz="4"/>
+            </w:tcBorders>
+            <w:tcMar>
+              <w:top w:type="dxa" w:w="60"/>
+              <w:left w:type="dxa" w:w="100"/>
+              <w:bottom w:type="dxa" w:w="60"/>
+              <w:right w:type="dxa" w:w="100"/>
+            </w:tcMar>
+            <w:vAlign w:val="top"/>
+          </w:tcPr>
+          <w:p>
+            <w:pPr>
+              <w:keepNext/>
+              <w:spacing w:after="0" w:before="0"/>
+            </w:pPr>
+            <w:r>
+              <w:rPr>
+                <w:rFonts w:ascii="Calibri" w:cs="Calibri" w:eastAsia="Calibri" w:hAnsi="Calibri"/>
+                <w:sz w:val="20"/>
+                <w:szCs w:val="20"/>
+              </w:rPr>
+              <w:t xml:space="preserve">Mobile: Settings (version row), Settings &gt; About RoadWatch, Settings &gt; Demo video, in Light and Dark (#48, #49)</w:t>
+            </w:r>
+          </w:p>
+        </w:tc>
+        <w:tc>
+          <w:tcPr>
+            <w:tcW w:type="dxa" w:w="5500"/>
+            <w:tcBorders>
+              <w:top w:val="single" w:color="B8C2D0" w:sz="4"/>
+              <w:left w:val="single" w:color="B8C2D0" w:sz="4"/>
+              <w:bottom w:val="single" w:color="B8C2D0" w:sz="4"/>
+              <w:right w:val="single" w:color="B8C2D0" w:sz="4"/>
+            </w:tcBorders>
+            <w:tcMar>
+              <w:top w:type="dxa" w:w="60"/>
+              <w:left w:type="dxa" w:w="100"/>
+              <w:bottom w:type="dxa" w:w="60"/>
+              <w:right w:type="dxa" w:w="100"/>
+            </w:tcMar>
+            <w:vAlign w:val="top"/>
+          </w:tcPr>
+          <w:p>
+            <w:pPr>
+              <w:keepNext/>
+              <w:spacing w:after="0" w:before="0"/>
+            </w:pPr>
+            <w:r>
+              <w:rPr>
+                <w:rFonts w:ascii="Calibri" w:cs="Calibri" w:eastAsia="Calibri" w:hAnsi="Calibri"/>
+                <w:sz w:val="20"/>
+                <w:szCs w:val="20"/>
+              </w:rPr>
+              <w:t xml:space="preserve">Version row says only "Version 1.1.0"; About has the 911 disclaimer and the Built with card (3 tiles per row); Settings &gt; Demo video shows the Reporter clip with "Your role" (a Traffic Officer sees the Traffic Officer clip first, then the Reporter clip); "Read the transcript" opens the text; a clip without a URL says "Clip coming soon" (#48)</w:t>
+            </w:r>
+          </w:p>
+        </w:tc>
+        <w:tc>
+          <w:tcPr>
+            <w:tcW w:type="dxa" w:w="4900"/>
+            <w:tcBorders>
+              <w:top w:val="single" w:color="B8C2D0" w:sz="4"/>
+              <w:left w:val="single" w:color="B8C2D0" w:sz="4"/>
+              <w:bottom w:val="single" w:color="B8C2D0" w:sz="4"/>
+              <w:right w:val="single" w:color="B8C2D0" w:sz="4"/>
+            </w:tcBorders>
+            <w:tcMar>
+              <w:top w:type="dxa" w:w="60"/>
+              <w:left w:type="dxa" w:w="100"/>
+              <w:bottom w:type="dxa" w:w="60"/>
+              <w:right w:type="dxa" w:w="100"/>
+            </w:tcMar>
+            <w:vAlign w:val="top"/>
+          </w:tcPr>
+          <w:p>
+            <w:pPr>
+              <w:keepNext/>
+              <w:spacing w:after="0" w:before="0"/>
+            </w:pPr>
+          </w:p>
+        </w:tc>
+        <w:tc>
+          <w:tcPr>
+            <w:tcW w:type="dxa" w:w="1520"/>
+            <w:tcBorders>
+              <w:top w:val="single" w:color="B8C2D0" w:sz="4"/>
+              <w:left w:val="single" w:color="B8C2D0" w:sz="4"/>
+              <w:bottom w:val="single" w:color="B8C2D0" w:sz="4"/>
+              <w:right w:val="single" w:color="B8C2D0" w:sz="4"/>
+            </w:tcBorders>
+            <w:tcMar>
+              <w:top w:type="dxa" w:w="60"/>
+              <w:left w:type="dxa" w:w="100"/>
+              <w:bottom w:type="dxa" w:w="60"/>
+              <w:right w:type="dxa" w:w="100"/>
+            </w:tcMar>
+            <w:vAlign w:val="top"/>
+          </w:tcPr>
+          <w:p>
+            <w:pPr>
+              <w:keepNext/>
+              <w:spacing w:after="0" w:before="0"/>
+            </w:pPr>
+          </w:p>
+        </w:tc>
+      </w:tr>
+      <w:tr>
+        <w:trPr>
+          <w:cantSplit/>
+          <w:trHeight w:val="650" w:hRule="atLeast"/>
+        </w:trPr>
+        <w:tc>
+          <w:tcPr>
+            <w:tcW w:type="dxa" w:w="1300"/>
+            <w:tcBorders>
+              <w:top w:val="single" w:color="B8C2D0" w:sz="4"/>
+              <w:left w:val="single" w:color="B8C2D0" w:sz="4"/>
+              <w:bottom w:val="single" w:color="B8C2D0" w:sz="4"/>
+              <w:right w:val="single" w:color="B8C2D0" w:sz="4"/>
+            </w:tcBorders>
+            <w:tcMar>
+              <w:top w:type="dxa" w:w="60"/>
+              <w:left w:type="dxa" w:w="100"/>
+              <w:bottom w:type="dxa" w:w="60"/>
+              <w:right w:type="dxa" w:w="100"/>
+            </w:tcMar>
+            <w:vAlign w:val="top"/>
+          </w:tcPr>
+          <w:p>
+            <w:pPr>
               <w:keepNext w:val="false"/>
               <w:spacing w:after="0" w:before="0"/>
             </w:pPr>
@@ -15918,7 +16052,7 @@
                 <w:sz w:val="20"/>
                 <w:szCs w:val="20"/>
               </w:rPr>
-              <w:t xml:space="preserve">TC-P.6</w:t>
+              <w:t xml:space="preserve">TC-P.7</w:t>
             </w:r>
           </w:p>
         </w:tc>
@@ -15950,7 +16084,23 @@
                 <w:sz w:val="20"/>
                 <w:szCs w:val="20"/>
               </w:rPr>
-              <w:t xml:space="preserve">Mobile: Settings (version row), Settings &gt; About RoadWatch, Settings &gt; Demo video, in Light and Dark (#48, #49)</w:t>
+              <w:t xml:space="preserve">Landing page with and without </w:t>
+            </w:r>
+            <w:r>
+              <w:rPr>
+                <w:rFonts w:ascii="Consolas" w:cs="Consolas" w:eastAsia="Consolas" w:hAnsi="Consolas"/>
+                <w:sz w:val="18"/>
+                <w:szCs w:val="18"/>
+              </w:rPr>
+              <w:t xml:space="preserve">PROMO_VIDEO_URL</w:t>
+            </w:r>
+            <w:r>
+              <w:rPr>
+                <w:rFonts w:ascii="Calibri" w:cs="Calibri" w:eastAsia="Calibri" w:hAnsi="Calibri"/>
+                <w:sz w:val="20"/>
+                <w:szCs w:val="20"/>
+              </w:rPr>
+              <w:t xml:space="preserve"> on Render, at 1440 and on a phone (#48)</w:t>
             </w:r>
           </w:p>
         </w:tc>
@@ -15982,7 +16132,23 @@
                 <w:sz w:val="20"/>
                 <w:szCs w:val="20"/>
               </w:rPr>
-              <w:t xml:space="preserve">Version row says only "Version 1.0.3"; About has the 911 disclaimer and the Built with card (3 tiles per row); the demo caption is "RoadWatch product demo"</w:t>
+              <w:t xml:space="preserve">Without it: no "Watch the video" section and no footer link. With it: a navy "Watch the video" section after How it works plays the promo (captions on, Transcript when </w:t>
+            </w:r>
+            <w:r>
+              <w:rPr>
+                <w:rFonts w:ascii="Consolas" w:cs="Consolas" w:eastAsia="Consolas" w:hAnsi="Consolas"/>
+                <w:sz w:val="18"/>
+                <w:szCs w:val="18"/>
+              </w:rPr>
+              <w:t xml:space="preserve">PROMO_VIDEO_TRANSCRIPT</w:t>
+            </w:r>
+            <w:r>
+              <w:rPr>
+                <w:rFonts w:ascii="Calibri" w:cs="Calibri" w:eastAsia="Calibri" w:hAnsi="Calibri"/>
+                <w:sz w:val="20"/>
+                <w:szCs w:val="20"/>
+              </w:rPr>
+              <w:t xml:space="preserve"> is set); the footer link "Watch the video" scrolls to it</w:t>
             </w:r>
           </w:p>
         </w:tc>

</xml_diff>